<commit_message>
Dia 18: LLMs practicos - prompts, roles y control del comportamiento
</commit_message>
<xml_diff>
--- a/LLMs/LLMs.docx
+++ b/LLMs/LLMs.docx
@@ -3039,16 +3039,36 @@
           <w:sz w:val="24"/>
           <w:szCs w:val="24"/>
         </w:rPr>
-        <w:t xml:space="preserve"> tiene solo</w:t>
-      </w:r>
-      <w:r>
-        <w:rPr>
-          <w:b/>
-          <w:bCs/>
-          <w:sz w:val="24"/>
-          <w:szCs w:val="24"/>
-        </w:rPr>
-        <w:t>(Contexto, Memoria, Estado)</w:t>
+        <w:t xml:space="preserve"> tiene </w:t>
+      </w:r>
+      <w:proofErr w:type="gramStart"/>
+      <w:r>
+        <w:rPr>
+          <w:b/>
+          <w:bCs/>
+          <w:sz w:val="24"/>
+          <w:szCs w:val="24"/>
+        </w:rPr>
+        <w:t>solo</w:t>
+      </w:r>
+      <w:r>
+        <w:rPr>
+          <w:b/>
+          <w:bCs/>
+          <w:sz w:val="24"/>
+          <w:szCs w:val="24"/>
+        </w:rPr>
+        <w:t>(</w:t>
+      </w:r>
+      <w:proofErr w:type="gramEnd"/>
+      <w:r>
+        <w:rPr>
+          <w:b/>
+          <w:bCs/>
+          <w:sz w:val="24"/>
+          <w:szCs w:val="24"/>
+        </w:rPr>
+        <w:t>Contexto, Memoria, Estado)</w:t>
       </w:r>
       <w:r>
         <w:rPr>
@@ -3506,11 +3526,16 @@
     </w:p>
     <w:p>
       <w:r>
-        <w:t xml:space="preserve">Porque Jarvis necesita tener una </w:t>
+        <w:t xml:space="preserve">Porque Jarvis necesita tener </w:t>
+      </w:r>
+      <w:proofErr w:type="gramStart"/>
+      <w:r>
+        <w:t xml:space="preserve">una </w:t>
       </w:r>
       <w:r>
         <w:t>día</w:t>
       </w:r>
+      <w:proofErr w:type="gramEnd"/>
       <w:r>
         <w:t xml:space="preserve"> de lo que pasa, no </w:t>
       </w:r>
@@ -6335,7 +6360,7 @@
           <w:szCs w:val="24"/>
         </w:rPr>
         <w:pict w14:anchorId="20316BD5">
-          <v:rect id="_x0000_i1058" style="width:0;height:1.5pt" o:hralign="center" o:hrstd="t" o:hr="t" fillcolor="#a0a0a0" stroked="f"/>
+          <v:rect id="_x0000_i1028" style="width:0;height:1.5pt" o:hralign="center" o:hrstd="t" o:hr="t" fillcolor="#a0a0a0" stroked="f"/>
         </w:pict>
       </w:r>
     </w:p>
@@ -6533,7 +6558,7 @@
         </w:rPr>
         <w:lastRenderedPageBreak/>
         <w:pict w14:anchorId="2302A066">
-          <v:rect id="_x0000_i1059" style="width:0;height:1.5pt" o:hralign="center" o:hrstd="t" o:hr="t" fillcolor="#a0a0a0" stroked="f"/>
+          <v:rect id="_x0000_i1029" style="width:0;height:1.5pt" o:hralign="center" o:hrstd="t" o:hr="t" fillcolor="#a0a0a0" stroked="f"/>
         </w:pict>
       </w:r>
     </w:p>
@@ -6684,29 +6709,7 @@
           <w:szCs w:val="28"/>
           <w:u w:val="single"/>
         </w:rPr>
-        <w:t>3️</w:t>
-      </w:r>
-      <w:r>
-        <w:rPr>
-          <w:rFonts w:cstheme="minorHAnsi"/>
-          <w:b/>
-          <w:bCs/>
-          <w:sz w:val="28"/>
-          <w:szCs w:val="28"/>
-          <w:u w:val="single"/>
-        </w:rPr>
-        <w:t xml:space="preserve">) </w:t>
-      </w:r>
-      <w:r>
-        <w:rPr>
-          <w:rFonts w:cstheme="minorHAnsi"/>
-          <w:b/>
-          <w:bCs/>
-          <w:sz w:val="28"/>
-          <w:szCs w:val="28"/>
-          <w:u w:val="single"/>
-        </w:rPr>
-        <w:t>Políticas claras (reglas simples)</w:t>
+        <w:t>3️) Políticas claras (reglas simples)</w:t>
       </w:r>
     </w:p>
     <w:p>
@@ -7093,12 +7096,1657 @@
     <w:p>
       <w:pPr>
         <w:rPr>
-          <w:sz w:val="24"/>
-          <w:szCs w:val="24"/>
-        </w:rPr>
-      </w:pPr>
+          <w:b/>
+          <w:bCs/>
+          <w:sz w:val="36"/>
+          <w:szCs w:val="36"/>
+          <w:u w:val="single"/>
+        </w:rPr>
+      </w:pPr>
+      <w:r>
+        <w:rPr>
+          <w:b/>
+          <w:bCs/>
+          <w:sz w:val="36"/>
+          <w:szCs w:val="36"/>
+          <w:u w:val="single"/>
+        </w:rPr>
+        <w:lastRenderedPageBreak/>
+        <w:t xml:space="preserve">Hacer buenos </w:t>
+      </w:r>
+      <w:proofErr w:type="spellStart"/>
+      <w:r>
+        <w:rPr>
+          <w:b/>
+          <w:bCs/>
+          <w:sz w:val="36"/>
+          <w:szCs w:val="36"/>
+          <w:u w:val="single"/>
+        </w:rPr>
+        <w:t>PROMPTs</w:t>
+      </w:r>
+      <w:proofErr w:type="spellEnd"/>
+    </w:p>
+    <w:p>
+      <w:pPr>
+        <w:rPr>
+          <w:rFonts w:cstheme="minorHAnsi"/>
+          <w:b/>
+          <w:bCs/>
+          <w:sz w:val="28"/>
+          <w:szCs w:val="28"/>
+          <w:u w:val="single"/>
+        </w:rPr>
+      </w:pPr>
+      <w:r>
+        <w:rPr>
+          <w:rFonts w:cstheme="minorHAnsi"/>
+          <w:b/>
+          <w:bCs/>
+          <w:sz w:val="28"/>
+          <w:szCs w:val="28"/>
+          <w:u w:val="single"/>
+        </w:rPr>
+        <w:t>1️</w:t>
+      </w:r>
+      <w:r>
+        <w:rPr>
+          <w:rFonts w:cstheme="minorHAnsi"/>
+          <w:b/>
+          <w:bCs/>
+          <w:sz w:val="28"/>
+          <w:szCs w:val="28"/>
+          <w:u w:val="single"/>
+        </w:rPr>
+        <w:t xml:space="preserve">) </w:t>
+      </w:r>
+      <w:r>
+        <w:rPr>
+          <w:rFonts w:cstheme="minorHAnsi"/>
+          <w:b/>
+          <w:bCs/>
+          <w:sz w:val="28"/>
+          <w:szCs w:val="28"/>
+          <w:u w:val="single"/>
+        </w:rPr>
+        <w:t>Qué hace realmente un LLM cuando responde</w:t>
+      </w:r>
+    </w:p>
+    <w:p>
+      <w:r>
+        <w:t xml:space="preserve">Un LLM </w:t>
+      </w:r>
+      <w:r>
+        <w:rPr>
+          <w:b/>
+          <w:bCs/>
+        </w:rPr>
+        <w:t>no razona como un humano</w:t>
+      </w:r>
+      <w:r>
+        <w:t xml:space="preserve"> ni “piensa” en pasos lógicos por defecto.</w:t>
+      </w:r>
+    </w:p>
+    <w:p>
+      <w:r>
+        <w:t>Hace esto:</w:t>
+      </w:r>
+    </w:p>
+    <w:p>
+      <w:r>
+        <w:rPr>
+          <w:rFonts w:ascii="Segoe UI Emoji" w:hAnsi="Segoe UI Emoji" w:cs="Segoe UI Emoji"/>
+        </w:rPr>
+        <w:t>👉</w:t>
+      </w:r>
+      <w:r>
+        <w:t xml:space="preserve"> </w:t>
+      </w:r>
+      <w:r>
+        <w:rPr>
+          <w:b/>
+          <w:bCs/>
+        </w:rPr>
+        <w:t>Predice el próximo token más probable</w:t>
+      </w:r>
+      <w:r>
+        <w:t>, dado:</w:t>
+      </w:r>
+    </w:p>
+    <w:p>
+      <w:pPr>
+        <w:numPr>
+          <w:ilvl w:val="0"/>
+          <w:numId w:val="25"/>
+        </w:numPr>
+      </w:pPr>
+      <w:r>
+        <w:t>lo que le escribiste</w:t>
+      </w:r>
+    </w:p>
+    <w:p>
+      <w:pPr>
+        <w:numPr>
+          <w:ilvl w:val="0"/>
+          <w:numId w:val="25"/>
+        </w:numPr>
+      </w:pPr>
+      <w:r>
+        <w:t>el contexto previo</w:t>
+      </w:r>
+    </w:p>
+    <w:p>
+      <w:pPr>
+        <w:numPr>
+          <w:ilvl w:val="0"/>
+          <w:numId w:val="25"/>
+        </w:numPr>
+      </w:pPr>
+      <w:r>
+        <w:t>los patrones aprendidos en entrenamiento</w:t>
+      </w:r>
+    </w:p>
+    <w:p>
+      <w:r>
+        <w:t>Es decir:</w:t>
+      </w:r>
+    </w:p>
+    <w:p>
+      <w:r>
+        <w:t>Responder = continuar texto de la mejor forma posible.</w:t>
+      </w:r>
+    </w:p>
+    <w:p>
+      <w:r>
+        <w:rPr>
+          <w:rFonts w:ascii="Segoe UI Symbol" w:hAnsi="Segoe UI Symbol" w:cs="Segoe UI Symbol"/>
+        </w:rPr>
+        <w:t>⚠</w:t>
+      </w:r>
+      <w:r>
+        <w:t>️ Importante:</w:t>
+      </w:r>
+      <w:r>
+        <w:br/>
+        <w:t xml:space="preserve">El modelo </w:t>
+      </w:r>
+      <w:r>
+        <w:rPr>
+          <w:b/>
+          <w:bCs/>
+        </w:rPr>
+        <w:t>no sabe</w:t>
+      </w:r>
+      <w:r>
+        <w:t xml:space="preserve"> qué es verdad.</w:t>
+      </w:r>
+      <w:r>
+        <w:br/>
+        <w:t xml:space="preserve">Sabe </w:t>
+      </w:r>
+      <w:r>
+        <w:rPr>
+          <w:b/>
+          <w:bCs/>
+        </w:rPr>
+        <w:t>qué suele venir después</w:t>
+      </w:r>
+      <w:r>
+        <w:t xml:space="preserve"> en textos similares.</w:t>
+      </w:r>
+    </w:p>
+    <w:p>
+      <w:r>
+        <w:t>Esto conecta con ML clásico:</w:t>
+      </w:r>
+    </w:p>
+    <w:p>
+      <w:pPr>
+        <w:numPr>
+          <w:ilvl w:val="0"/>
+          <w:numId w:val="26"/>
+        </w:numPr>
+      </w:pPr>
+      <w:r>
+        <w:t xml:space="preserve">como un modelo que </w:t>
+      </w:r>
+      <w:r>
+        <w:rPr>
+          <w:b/>
+          <w:bCs/>
+        </w:rPr>
+        <w:t>generaliza patrones</w:t>
+      </w:r>
+    </w:p>
+    <w:p>
+      <w:pPr>
+        <w:numPr>
+          <w:ilvl w:val="0"/>
+          <w:numId w:val="26"/>
+        </w:numPr>
+      </w:pPr>
+      <w:r>
+        <w:t>no verifica hechos</w:t>
+      </w:r>
+    </w:p>
+    <w:p>
+      <w:pPr>
+        <w:numPr>
+          <w:ilvl w:val="0"/>
+          <w:numId w:val="26"/>
+        </w:numPr>
+      </w:pPr>
+      <w:r>
+        <w:t>no tiene memoria real</w:t>
+      </w:r>
+    </w:p>
+    <w:p>
+      <w:r>
+        <w:pict w14:anchorId="55B4EBDC">
+          <v:rect id="_x0000_i1075" style="width:0;height:1.5pt" o:hralign="center" o:hrstd="t" o:hr="t" fillcolor="#a0a0a0" stroked="f"/>
+        </w:pict>
+      </w:r>
+    </w:p>
+    <w:p>
+      <w:pPr>
+        <w:rPr>
+          <w:rFonts w:cstheme="minorHAnsi"/>
+          <w:b/>
+          <w:bCs/>
+          <w:sz w:val="28"/>
+          <w:szCs w:val="28"/>
+          <w:u w:val="single"/>
+        </w:rPr>
+      </w:pPr>
+      <w:r>
+        <w:rPr>
+          <w:rFonts w:cstheme="minorHAnsi"/>
+          <w:b/>
+          <w:bCs/>
+          <w:sz w:val="28"/>
+          <w:szCs w:val="28"/>
+          <w:u w:val="single"/>
+        </w:rPr>
+        <w:t>2️</w:t>
+      </w:r>
+      <w:r>
+        <w:rPr>
+          <w:rFonts w:cstheme="minorHAnsi"/>
+          <w:b/>
+          <w:bCs/>
+          <w:sz w:val="28"/>
+          <w:szCs w:val="28"/>
+          <w:u w:val="single"/>
+        </w:rPr>
+        <w:t xml:space="preserve">) </w:t>
+      </w:r>
+      <w:proofErr w:type="spellStart"/>
+      <w:r>
+        <w:rPr>
+          <w:rFonts w:cstheme="minorHAnsi"/>
+          <w:b/>
+          <w:bCs/>
+          <w:sz w:val="28"/>
+          <w:szCs w:val="28"/>
+          <w:u w:val="single"/>
+        </w:rPr>
+        <w:t>Prompt</w:t>
+      </w:r>
+      <w:proofErr w:type="spellEnd"/>
+      <w:r>
+        <w:rPr>
+          <w:rFonts w:cstheme="minorHAnsi"/>
+          <w:b/>
+          <w:bCs/>
+          <w:sz w:val="28"/>
+          <w:szCs w:val="28"/>
+          <w:u w:val="single"/>
+        </w:rPr>
+        <w:t xml:space="preserve"> ≠ pregunta</w:t>
+      </w:r>
+    </w:p>
+    <w:p>
+      <w:r>
+        <w:t>Esto es CLAVE.</w:t>
+      </w:r>
+    </w:p>
+    <w:p>
+      <w:r>
+        <w:t xml:space="preserve">Una </w:t>
+      </w:r>
+      <w:r>
+        <w:rPr>
+          <w:b/>
+          <w:bCs/>
+        </w:rPr>
+        <w:t>pregunta</w:t>
+      </w:r>
+      <w:r>
+        <w:t xml:space="preserve"> es solo contenido.</w:t>
+      </w:r>
+      <w:r>
+        <w:br/>
+        <w:t xml:space="preserve">Un </w:t>
+      </w:r>
+      <w:proofErr w:type="spellStart"/>
+      <w:r>
+        <w:rPr>
+          <w:b/>
+          <w:bCs/>
+        </w:rPr>
+        <w:t>prompt</w:t>
+      </w:r>
+      <w:proofErr w:type="spellEnd"/>
+      <w:r>
+        <w:t xml:space="preserve"> es una </w:t>
+      </w:r>
+      <w:r>
+        <w:rPr>
+          <w:b/>
+          <w:bCs/>
+        </w:rPr>
+        <w:t>configuración del comportamiento</w:t>
+      </w:r>
+      <w:r>
+        <w:t>.</w:t>
+      </w:r>
+    </w:p>
+    <w:p>
+      <w:r>
+        <w:t>Ejemplo simple:</w:t>
+      </w:r>
+    </w:p>
+    <w:p>
+      <w:pPr>
+        <w:rPr>
+          <w:b/>
+          <w:bCs/>
+        </w:rPr>
+      </w:pPr>
+      <w:r>
+        <w:rPr>
+          <w:rFonts w:ascii="Segoe UI Emoji" w:hAnsi="Segoe UI Emoji" w:cs="Segoe UI Emoji"/>
+          <w:b/>
+          <w:bCs/>
+        </w:rPr>
+        <w:t>❌</w:t>
+      </w:r>
+      <w:r>
+        <w:rPr>
+          <w:b/>
+          <w:bCs/>
+        </w:rPr>
+        <w:t xml:space="preserve"> Pregunta pobre:</w:t>
+      </w:r>
+    </w:p>
+    <w:p>
+      <w:pPr>
+        <w:rPr>
+          <w:i/>
+          <w:iCs/>
+        </w:rPr>
+      </w:pPr>
+      <w:r>
+        <w:rPr>
+          <w:i/>
+          <w:iCs/>
+        </w:rPr>
+        <w:t xml:space="preserve">¿Qué es </w:t>
+      </w:r>
+      <w:proofErr w:type="spellStart"/>
+      <w:r>
+        <w:rPr>
+          <w:i/>
+          <w:iCs/>
+        </w:rPr>
+        <w:t>overfitting</w:t>
+      </w:r>
+      <w:proofErr w:type="spellEnd"/>
+      <w:r>
+        <w:rPr>
+          <w:i/>
+          <w:iCs/>
+        </w:rPr>
+        <w:t>?</w:t>
+      </w:r>
+    </w:p>
+    <w:p>
+      <w:pPr>
+        <w:rPr>
+          <w:b/>
+          <w:bCs/>
+        </w:rPr>
+      </w:pPr>
+      <w:r>
+        <w:rPr>
+          <w:rFonts w:ascii="Segoe UI Emoji" w:hAnsi="Segoe UI Emoji" w:cs="Segoe UI Emoji"/>
+          <w:b/>
+          <w:bCs/>
+        </w:rPr>
+        <w:t>✅</w:t>
+      </w:r>
+      <w:r>
+        <w:rPr>
+          <w:b/>
+          <w:bCs/>
+        </w:rPr>
+        <w:t xml:space="preserve"> </w:t>
+      </w:r>
+      <w:proofErr w:type="spellStart"/>
+      <w:r>
+        <w:rPr>
+          <w:b/>
+          <w:bCs/>
+        </w:rPr>
+        <w:t>Prompt</w:t>
+      </w:r>
+      <w:proofErr w:type="spellEnd"/>
+      <w:r>
+        <w:rPr>
+          <w:b/>
+          <w:bCs/>
+        </w:rPr>
+        <w:t xml:space="preserve"> mínimo:</w:t>
+      </w:r>
+    </w:p>
+    <w:p>
+      <w:pPr>
+        <w:rPr>
+          <w:i/>
+          <w:iCs/>
+        </w:rPr>
+      </w:pPr>
+      <w:proofErr w:type="spellStart"/>
+      <w:r>
+        <w:rPr>
+          <w:i/>
+          <w:iCs/>
+        </w:rPr>
+        <w:t>Sos</w:t>
+      </w:r>
+      <w:proofErr w:type="spellEnd"/>
+      <w:r>
+        <w:rPr>
+          <w:i/>
+          <w:iCs/>
+        </w:rPr>
+        <w:t xml:space="preserve"> un profesor de ML.</w:t>
+      </w:r>
+    </w:p>
+    <w:p>
+      <w:pPr>
+        <w:rPr>
+          <w:i/>
+          <w:iCs/>
+        </w:rPr>
+      </w:pPr>
+      <w:proofErr w:type="spellStart"/>
+      <w:r>
+        <w:rPr>
+          <w:i/>
+          <w:iCs/>
+        </w:rPr>
+        <w:t>Explicá</w:t>
+      </w:r>
+      <w:proofErr w:type="spellEnd"/>
+      <w:r>
+        <w:rPr>
+          <w:i/>
+          <w:iCs/>
+        </w:rPr>
+        <w:t xml:space="preserve"> </w:t>
+      </w:r>
+      <w:proofErr w:type="spellStart"/>
+      <w:r>
+        <w:rPr>
+          <w:i/>
+          <w:iCs/>
+        </w:rPr>
+        <w:t>overfitting</w:t>
+      </w:r>
+      <w:proofErr w:type="spellEnd"/>
+      <w:r>
+        <w:rPr>
+          <w:i/>
+          <w:iCs/>
+        </w:rPr>
+        <w:t xml:space="preserve"> con un ejemplo simple.</w:t>
+      </w:r>
+    </w:p>
+    <w:p>
+      <w:pPr>
+        <w:rPr>
+          <w:i/>
+          <w:iCs/>
+        </w:rPr>
+      </w:pPr>
+      <w:r>
+        <w:rPr>
+          <w:i/>
+          <w:iCs/>
+        </w:rPr>
+        <w:t>No uses fórmulas.</w:t>
+      </w:r>
+    </w:p>
+    <w:p>
+      <w:r>
+        <w:rPr>
+          <w:rFonts w:ascii="Segoe UI Emoji" w:hAnsi="Segoe UI Emoji" w:cs="Segoe UI Emoji"/>
+        </w:rPr>
+        <w:t>👉</w:t>
+      </w:r>
+      <w:r>
+        <w:t xml:space="preserve"> El modelo es el mismo.</w:t>
+      </w:r>
+      <w:r>
+        <w:br/>
+      </w:r>
+      <w:r>
+        <w:rPr>
+          <w:rFonts w:ascii="Segoe UI Emoji" w:hAnsi="Segoe UI Emoji" w:cs="Segoe UI Emoji"/>
+        </w:rPr>
+        <w:t>👉</w:t>
+      </w:r>
+      <w:r>
+        <w:t xml:space="preserve"> Cambia </w:t>
+      </w:r>
+      <w:r>
+        <w:rPr>
+          <w:b/>
+          <w:bCs/>
+        </w:rPr>
+        <w:t>cómo se comporta</w:t>
+      </w:r>
+      <w:r>
+        <w:t>.</w:t>
+      </w:r>
+    </w:p>
+    <w:p>
+      <w:proofErr w:type="spellStart"/>
+      <w:r>
+        <w:lastRenderedPageBreak/>
+        <w:t>Pensalo</w:t>
+      </w:r>
+      <w:proofErr w:type="spellEnd"/>
+      <w:r>
+        <w:t xml:space="preserve"> así:</w:t>
+      </w:r>
+    </w:p>
+    <w:p>
+      <w:pPr>
+        <w:numPr>
+          <w:ilvl w:val="0"/>
+          <w:numId w:val="27"/>
+        </w:numPr>
+      </w:pPr>
+      <w:r>
+        <w:t>la pregunta = datos</w:t>
+      </w:r>
+    </w:p>
+    <w:p>
+      <w:pPr>
+        <w:numPr>
+          <w:ilvl w:val="0"/>
+          <w:numId w:val="27"/>
+        </w:numPr>
+      </w:pPr>
+      <w:r>
+        <w:t xml:space="preserve">el </w:t>
+      </w:r>
+      <w:proofErr w:type="spellStart"/>
+      <w:r>
+        <w:t>prompt</w:t>
+      </w:r>
+      <w:proofErr w:type="spellEnd"/>
+      <w:r>
+        <w:t xml:space="preserve"> = </w:t>
+      </w:r>
+      <w:r>
+        <w:rPr>
+          <w:b/>
+          <w:bCs/>
+        </w:rPr>
+        <w:t>pipeline de ejecución</w:t>
+      </w:r>
+    </w:p>
+    <w:p>
+      <w:r>
+        <w:pict w14:anchorId="18C92B4B">
+          <v:rect id="_x0000_i1076" style="width:0;height:1.5pt" o:hralign="center" o:hrstd="t" o:hr="t" fillcolor="#a0a0a0" stroked="f"/>
+        </w:pict>
+      </w:r>
+    </w:p>
+    <w:p>
+      <w:pPr>
+        <w:rPr>
+          <w:b/>
+          <w:bCs/>
+          <w:sz w:val="28"/>
+          <w:szCs w:val="28"/>
+          <w:u w:val="single"/>
+        </w:rPr>
+      </w:pPr>
+      <w:r>
+        <w:rPr>
+          <w:b/>
+          <w:bCs/>
+          <w:sz w:val="28"/>
+          <w:szCs w:val="28"/>
+          <w:u w:val="single"/>
+        </w:rPr>
+        <w:t>3️</w:t>
+      </w:r>
+      <w:r>
+        <w:rPr>
+          <w:rFonts w:ascii="Tahoma" w:hAnsi="Tahoma" w:cs="Tahoma"/>
+          <w:b/>
+          <w:bCs/>
+          <w:sz w:val="28"/>
+          <w:szCs w:val="28"/>
+          <w:u w:val="single"/>
+        </w:rPr>
+        <w:t xml:space="preserve">) </w:t>
+      </w:r>
+      <w:r>
+        <w:rPr>
+          <w:b/>
+          <w:bCs/>
+          <w:sz w:val="28"/>
+          <w:szCs w:val="28"/>
+          <w:u w:val="single"/>
+        </w:rPr>
+        <w:t xml:space="preserve">Las 4 piezas de un buen </w:t>
+      </w:r>
+      <w:proofErr w:type="spellStart"/>
+      <w:r>
+        <w:rPr>
+          <w:b/>
+          <w:bCs/>
+          <w:sz w:val="28"/>
+          <w:szCs w:val="28"/>
+          <w:u w:val="single"/>
+        </w:rPr>
+        <w:t>prompt</w:t>
+      </w:r>
+      <w:proofErr w:type="spellEnd"/>
+      <w:r>
+        <w:rPr>
+          <w:b/>
+          <w:bCs/>
+          <w:sz w:val="28"/>
+          <w:szCs w:val="28"/>
+          <w:u w:val="single"/>
+        </w:rPr>
+        <w:t xml:space="preserve"> (base)</w:t>
+      </w:r>
+    </w:p>
+    <w:p>
+      <w:r>
+        <w:t xml:space="preserve">Un </w:t>
+      </w:r>
+      <w:proofErr w:type="spellStart"/>
+      <w:r>
+        <w:t>prompt</w:t>
+      </w:r>
+      <w:proofErr w:type="spellEnd"/>
+      <w:r>
+        <w:t xml:space="preserve"> bueno casi siempre tiene:</w:t>
+      </w:r>
+    </w:p>
+    <w:p>
+      <w:pPr>
+        <w:rPr>
+          <w:b/>
+          <w:bCs/>
+          <w:sz w:val="24"/>
+          <w:szCs w:val="24"/>
+          <w:u w:val="single"/>
+        </w:rPr>
+      </w:pPr>
+      <w:r>
+        <w:rPr>
+          <w:b/>
+          <w:bCs/>
+          <w:sz w:val="24"/>
+          <w:szCs w:val="24"/>
+          <w:u w:val="single"/>
+        </w:rPr>
+        <w:t>1. Rol</w:t>
+      </w:r>
+    </w:p>
+    <w:p>
+      <w:r>
+        <w:t xml:space="preserve">Define </w:t>
+      </w:r>
+      <w:r>
+        <w:rPr>
+          <w:b/>
+          <w:bCs/>
+        </w:rPr>
+        <w:t>desde dónde responde</w:t>
+      </w:r>
+      <w:r>
+        <w:t>.</w:t>
+      </w:r>
+    </w:p>
+    <w:p>
+      <w:pPr>
+        <w:rPr>
+          <w:i/>
+          <w:iCs/>
+        </w:rPr>
+      </w:pPr>
+      <w:proofErr w:type="spellStart"/>
+      <w:r>
+        <w:rPr>
+          <w:i/>
+          <w:iCs/>
+        </w:rPr>
+        <w:t>Sos</w:t>
+      </w:r>
+      <w:proofErr w:type="spellEnd"/>
+      <w:r>
+        <w:rPr>
+          <w:i/>
+          <w:iCs/>
+        </w:rPr>
+        <w:t xml:space="preserve"> un profesor de Machine </w:t>
+      </w:r>
+      <w:proofErr w:type="spellStart"/>
+      <w:r>
+        <w:rPr>
+          <w:i/>
+          <w:iCs/>
+        </w:rPr>
+        <w:t>Learning</w:t>
+      </w:r>
+      <w:proofErr w:type="spellEnd"/>
+      <w:r>
+        <w:rPr>
+          <w:i/>
+          <w:iCs/>
+        </w:rPr>
+        <w:t>.</w:t>
+      </w:r>
+    </w:p>
+    <w:p>
+      <w:pPr>
+        <w:rPr>
+          <w:b/>
+          <w:bCs/>
+          <w:sz w:val="24"/>
+          <w:szCs w:val="24"/>
+          <w:u w:val="single"/>
+        </w:rPr>
+      </w:pPr>
+      <w:r>
+        <w:rPr>
+          <w:b/>
+          <w:bCs/>
+          <w:sz w:val="24"/>
+          <w:szCs w:val="24"/>
+          <w:u w:val="single"/>
+        </w:rPr>
+        <w:t>2. Contexto</w:t>
+      </w:r>
+    </w:p>
+    <w:p>
+      <w:r>
+        <w:t>Qué tiene que tener en cuenta.</w:t>
+      </w:r>
+    </w:p>
+    <w:p>
+      <w:pPr>
+        <w:rPr>
+          <w:i/>
+          <w:iCs/>
+        </w:rPr>
+      </w:pPr>
+      <w:r>
+        <w:rPr>
+          <w:i/>
+          <w:iCs/>
+        </w:rPr>
+        <w:t>El alumno ya vio regresión logística y árboles.</w:t>
+      </w:r>
+    </w:p>
+    <w:p>
+      <w:pPr>
+        <w:rPr>
+          <w:b/>
+          <w:bCs/>
+          <w:sz w:val="24"/>
+          <w:szCs w:val="24"/>
+          <w:u w:val="single"/>
+        </w:rPr>
+      </w:pPr>
+      <w:r>
+        <w:rPr>
+          <w:b/>
+          <w:bCs/>
+          <w:sz w:val="24"/>
+          <w:szCs w:val="24"/>
+          <w:u w:val="single"/>
+        </w:rPr>
+        <w:t>3. Tarea</w:t>
+      </w:r>
+    </w:p>
+    <w:p>
+      <w:r>
+        <w:t>Qué tiene que hacer.</w:t>
+      </w:r>
+    </w:p>
+    <w:p>
+      <w:pPr>
+        <w:rPr>
+          <w:i/>
+          <w:iCs/>
+        </w:rPr>
+      </w:pPr>
+      <w:proofErr w:type="spellStart"/>
+      <w:r>
+        <w:rPr>
+          <w:i/>
+          <w:iCs/>
+        </w:rPr>
+        <w:t>Explicá</w:t>
+      </w:r>
+      <w:proofErr w:type="spellEnd"/>
+      <w:r>
+        <w:rPr>
+          <w:i/>
+          <w:iCs/>
+        </w:rPr>
+        <w:t xml:space="preserve"> </w:t>
+      </w:r>
+      <w:proofErr w:type="spellStart"/>
+      <w:r>
+        <w:rPr>
+          <w:i/>
+          <w:iCs/>
+        </w:rPr>
+        <w:t>bias</w:t>
+      </w:r>
+      <w:proofErr w:type="spellEnd"/>
+      <w:r>
+        <w:rPr>
+          <w:i/>
+          <w:iCs/>
+        </w:rPr>
+        <w:t xml:space="preserve"> vs </w:t>
+      </w:r>
+      <w:proofErr w:type="spellStart"/>
+      <w:r>
+        <w:rPr>
+          <w:i/>
+          <w:iCs/>
+        </w:rPr>
+        <w:t>variance</w:t>
+      </w:r>
+      <w:proofErr w:type="spellEnd"/>
+      <w:r>
+        <w:rPr>
+          <w:i/>
+          <w:iCs/>
+        </w:rPr>
+        <w:t>.</w:t>
+      </w:r>
+    </w:p>
+    <w:p>
+      <w:pPr>
+        <w:rPr>
+          <w:b/>
+          <w:bCs/>
+          <w:sz w:val="24"/>
+          <w:szCs w:val="24"/>
+          <w:u w:val="single"/>
+        </w:rPr>
+      </w:pPr>
+      <w:r>
+        <w:rPr>
+          <w:b/>
+          <w:bCs/>
+          <w:sz w:val="24"/>
+          <w:szCs w:val="24"/>
+          <w:u w:val="single"/>
+        </w:rPr>
+        <w:t>4. Restricciones</w:t>
+      </w:r>
+    </w:p>
+    <w:p>
+      <w:r>
+        <w:t>Cómo NO hacerlo.</w:t>
+      </w:r>
+    </w:p>
+    <w:p>
+      <w:pPr>
+        <w:rPr>
+          <w:i/>
+          <w:iCs/>
+        </w:rPr>
+      </w:pPr>
+      <w:r>
+        <w:rPr>
+          <w:i/>
+          <w:iCs/>
+        </w:rPr>
+        <w:t>No uses fórmulas ni jerga académica.</w:t>
+      </w:r>
+    </w:p>
+    <w:p>
+      <w:r>
+        <w:rPr>
+          <w:rFonts w:ascii="Segoe UI Emoji" w:hAnsi="Segoe UI Emoji" w:cs="Segoe UI Emoji"/>
+        </w:rPr>
+        <w:t>🧠</w:t>
+      </w:r>
+      <w:r>
+        <w:t xml:space="preserve"> Esto es exactamente lo mismo que:</w:t>
+      </w:r>
+    </w:p>
+    <w:p>
+      <w:pPr>
+        <w:numPr>
+          <w:ilvl w:val="0"/>
+          <w:numId w:val="28"/>
+        </w:numPr>
+      </w:pPr>
+      <w:proofErr w:type="spellStart"/>
+      <w:r>
+        <w:t>setear</w:t>
+      </w:r>
+      <w:proofErr w:type="spellEnd"/>
+      <w:r>
+        <w:t xml:space="preserve"> hipótesis</w:t>
+      </w:r>
+    </w:p>
+    <w:p>
+      <w:pPr>
+        <w:numPr>
+          <w:ilvl w:val="0"/>
+          <w:numId w:val="28"/>
+        </w:numPr>
+      </w:pPr>
+      <w:r>
+        <w:t>limitar el espacio de soluciones</w:t>
+      </w:r>
+    </w:p>
+    <w:p>
+      <w:pPr>
+        <w:numPr>
+          <w:ilvl w:val="0"/>
+          <w:numId w:val="28"/>
+        </w:numPr>
+      </w:pPr>
+      <w:r>
+        <w:t>reducir ruido</w:t>
+      </w:r>
+    </w:p>
+    <w:p>
+      <w:r>
+        <w:pict w14:anchorId="788EA3F3">
+          <v:rect id="_x0000_i1077" style="width:0;height:1.5pt" o:hralign="center" o:hrstd="t" o:hr="t" fillcolor="#a0a0a0" stroked="f"/>
+        </w:pict>
+      </w:r>
+    </w:p>
+    <w:p>
+      <w:pPr>
+        <w:rPr>
+          <w:rFonts w:cstheme="minorHAnsi"/>
+          <w:b/>
+          <w:bCs/>
+          <w:sz w:val="28"/>
+          <w:szCs w:val="28"/>
+          <w:u w:val="single"/>
+        </w:rPr>
+      </w:pPr>
+      <w:r>
+        <w:rPr>
+          <w:rFonts w:cstheme="minorHAnsi"/>
+          <w:b/>
+          <w:bCs/>
+          <w:sz w:val="28"/>
+          <w:szCs w:val="28"/>
+          <w:u w:val="single"/>
+        </w:rPr>
+        <w:t>4️</w:t>
+      </w:r>
+      <w:r>
+        <w:rPr>
+          <w:rFonts w:cstheme="minorHAnsi"/>
+          <w:b/>
+          <w:bCs/>
+          <w:sz w:val="28"/>
+          <w:szCs w:val="28"/>
+          <w:u w:val="single"/>
+        </w:rPr>
+        <w:t xml:space="preserve">) </w:t>
+      </w:r>
+      <w:r>
+        <w:rPr>
+          <w:rFonts w:cstheme="minorHAnsi"/>
+          <w:b/>
+          <w:bCs/>
+          <w:sz w:val="28"/>
+          <w:szCs w:val="28"/>
+          <w:u w:val="single"/>
+        </w:rPr>
+        <w:t xml:space="preserve">Por qué el </w:t>
+      </w:r>
+      <w:proofErr w:type="spellStart"/>
+      <w:r>
+        <w:rPr>
+          <w:rFonts w:cstheme="minorHAnsi"/>
+          <w:b/>
+          <w:bCs/>
+          <w:sz w:val="28"/>
+          <w:szCs w:val="28"/>
+          <w:u w:val="single"/>
+        </w:rPr>
+        <w:t>prompt</w:t>
+      </w:r>
+      <w:proofErr w:type="spellEnd"/>
+      <w:r>
+        <w:rPr>
+          <w:rFonts w:cstheme="minorHAnsi"/>
+          <w:b/>
+          <w:bCs/>
+          <w:sz w:val="28"/>
+          <w:szCs w:val="28"/>
+          <w:u w:val="single"/>
+        </w:rPr>
+        <w:t xml:space="preserve"> importa tanto</w:t>
+      </w:r>
+    </w:p>
+    <w:p>
+      <w:r>
+        <w:t>Porque el LLM:</w:t>
+      </w:r>
+    </w:p>
+    <w:p>
+      <w:pPr>
+        <w:numPr>
+          <w:ilvl w:val="0"/>
+          <w:numId w:val="29"/>
+        </w:numPr>
+      </w:pPr>
+      <w:r>
+        <w:rPr>
+          <w:b/>
+          <w:bCs/>
+        </w:rPr>
+        <w:t>no sabe cuál es tu intención</w:t>
+      </w:r>
+    </w:p>
+    <w:p>
+      <w:pPr>
+        <w:numPr>
+          <w:ilvl w:val="0"/>
+          <w:numId w:val="29"/>
+        </w:numPr>
+      </w:pPr>
+      <w:r>
+        <w:rPr>
+          <w:b/>
+          <w:bCs/>
+        </w:rPr>
+        <w:t xml:space="preserve">no sabe qué nivel </w:t>
+      </w:r>
+      <w:proofErr w:type="spellStart"/>
+      <w:r>
+        <w:rPr>
+          <w:b/>
+          <w:bCs/>
+        </w:rPr>
+        <w:t>querés</w:t>
+      </w:r>
+      <w:proofErr w:type="spellEnd"/>
+    </w:p>
+    <w:p>
+      <w:pPr>
+        <w:numPr>
+          <w:ilvl w:val="0"/>
+          <w:numId w:val="29"/>
+        </w:numPr>
+      </w:pPr>
+      <w:r>
+        <w:rPr>
+          <w:b/>
+          <w:bCs/>
+        </w:rPr>
+        <w:t>no sabe qué evitar</w:t>
+      </w:r>
+    </w:p>
+    <w:p>
+      <w:r>
+        <w:t>Si no se lo decís:</w:t>
+      </w:r>
+      <w:r>
+        <w:br/>
+      </w:r>
+      <w:r>
+        <w:rPr>
+          <w:rFonts w:ascii="Segoe UI Emoji" w:hAnsi="Segoe UI Emoji" w:cs="Segoe UI Emoji"/>
+        </w:rPr>
+        <w:t>👉</w:t>
+      </w:r>
+      <w:r>
+        <w:t xml:space="preserve"> rellena con promedios</w:t>
+      </w:r>
+    </w:p>
+    <w:p>
+      <w:r>
+        <w:t>Esto explica:</w:t>
+      </w:r>
+    </w:p>
+    <w:p>
+      <w:pPr>
+        <w:numPr>
+          <w:ilvl w:val="0"/>
+          <w:numId w:val="30"/>
+        </w:numPr>
+      </w:pPr>
+      <w:r>
+        <w:lastRenderedPageBreak/>
+        <w:t>respuestas vagas</w:t>
+      </w:r>
+    </w:p>
+    <w:p>
+      <w:pPr>
+        <w:numPr>
+          <w:ilvl w:val="0"/>
+          <w:numId w:val="30"/>
+        </w:numPr>
+      </w:pPr>
+      <w:r>
+        <w:t>respuestas largas al pedo</w:t>
+      </w:r>
+    </w:p>
+    <w:p>
+      <w:pPr>
+        <w:numPr>
+          <w:ilvl w:val="0"/>
+          <w:numId w:val="30"/>
+        </w:numPr>
+      </w:pPr>
+      <w:r>
+        <w:t>respuestas “correctas pero inútiles”</w:t>
+      </w:r>
+    </w:p>
+    <w:p>
+      <w:r>
+        <w:t>No es que el modelo sea malo.</w:t>
+      </w:r>
+      <w:r>
+        <w:br/>
+        <w:t xml:space="preserve">Es que </w:t>
+      </w:r>
+      <w:r>
+        <w:rPr>
+          <w:b/>
+          <w:bCs/>
+        </w:rPr>
+        <w:t>el espacio de búsqueda es enorme</w:t>
+      </w:r>
+      <w:r>
+        <w:t>.</w:t>
+      </w:r>
+    </w:p>
+    <w:p>
+      <w:pPr>
+        <w:rPr>
+          <w:b/>
+          <w:bCs/>
+          <w:sz w:val="28"/>
+          <w:szCs w:val="28"/>
+          <w:u w:val="single"/>
+        </w:rPr>
+      </w:pPr>
+      <w:r>
+        <w:rPr>
+          <w:b/>
+          <w:bCs/>
+          <w:sz w:val="28"/>
+          <w:szCs w:val="28"/>
+          <w:u w:val="single"/>
+        </w:rPr>
+        <w:t xml:space="preserve">5) </w:t>
+      </w:r>
+      <w:r>
+        <w:rPr>
+          <w:b/>
+          <w:bCs/>
+          <w:sz w:val="28"/>
+          <w:szCs w:val="28"/>
+          <w:u w:val="single"/>
+        </w:rPr>
+        <w:t>Regla de oro (para este nivel)</w:t>
+      </w:r>
+    </w:p>
+    <w:p>
+      <w:r>
+        <w:t xml:space="preserve">Si el LLM responde mal, </w:t>
+      </w:r>
+      <w:r>
+        <w:rPr>
+          <w:b/>
+          <w:bCs/>
+        </w:rPr>
+        <w:t xml:space="preserve">el 80% de las veces es el </w:t>
+      </w:r>
+      <w:proofErr w:type="spellStart"/>
+      <w:r>
+        <w:rPr>
+          <w:b/>
+          <w:bCs/>
+        </w:rPr>
+        <w:t>prompt</w:t>
+      </w:r>
+      <w:proofErr w:type="spellEnd"/>
+      <w:r>
+        <w:t>, no el modelo.</w:t>
+      </w:r>
+    </w:p>
+    <w:p>
+      <w:r>
+        <w:t xml:space="preserve">Todavía </w:t>
+      </w:r>
+      <w:r>
+        <w:rPr>
+          <w:b/>
+          <w:bCs/>
+        </w:rPr>
+        <w:t>no usamos</w:t>
+      </w:r>
+      <w:r>
+        <w:t>:</w:t>
+      </w:r>
+    </w:p>
+    <w:p>
+      <w:pPr>
+        <w:numPr>
+          <w:ilvl w:val="0"/>
+          <w:numId w:val="31"/>
+        </w:numPr>
+      </w:pPr>
+      <w:r>
+        <w:t>RAG</w:t>
+      </w:r>
+    </w:p>
+    <w:p>
+      <w:pPr>
+        <w:numPr>
+          <w:ilvl w:val="0"/>
+          <w:numId w:val="31"/>
+        </w:numPr>
+      </w:pPr>
+      <w:r>
+        <w:t>memoria</w:t>
+      </w:r>
+    </w:p>
+    <w:p>
+      <w:pPr>
+        <w:numPr>
+          <w:ilvl w:val="0"/>
+          <w:numId w:val="31"/>
+        </w:numPr>
+      </w:pPr>
+      <w:r>
+        <w:t>herramientas</w:t>
+      </w:r>
+    </w:p>
+    <w:p>
+      <w:pPr>
+        <w:rPr>
+          <w:b/>
+          <w:bCs/>
+        </w:rPr>
+      </w:pPr>
+      <w:r>
+        <w:t>Solo:</w:t>
+      </w:r>
+      <w:r>
+        <w:br/>
+      </w:r>
+      <w:r>
+        <w:rPr>
+          <w:rFonts w:ascii="Segoe UI Emoji" w:hAnsi="Segoe UI Emoji" w:cs="Segoe UI Emoji"/>
+        </w:rPr>
+        <w:t>🧠</w:t>
+      </w:r>
+      <w:r>
+        <w:t xml:space="preserve"> </w:t>
+      </w:r>
+      <w:r>
+        <w:rPr>
+          <w:b/>
+          <w:bCs/>
+        </w:rPr>
+        <w:t>control del comportamiento</w:t>
+      </w:r>
     </w:p>
     <w:p/>
+    <w:p>
+      <w:pPr>
+        <w:rPr>
+          <w:b/>
+          <w:bCs/>
+          <w:sz w:val="32"/>
+          <w:szCs w:val="32"/>
+          <w:u w:val="single"/>
+        </w:rPr>
+      </w:pPr>
+      <w:r>
+        <w:rPr>
+          <w:b/>
+          <w:bCs/>
+          <w:sz w:val="32"/>
+          <w:szCs w:val="32"/>
+          <w:u w:val="single"/>
+        </w:rPr>
+        <w:t>Actividad</w:t>
+      </w:r>
+    </w:p>
+    <w:p>
+      <w:r>
+        <w:rPr>
+          <w:rFonts w:ascii="Segoe UI Emoji" w:hAnsi="Segoe UI Emoji" w:cs="Segoe UI Emoji"/>
+        </w:rPr>
+        <w:t>👉</w:t>
+      </w:r>
+      <w:r>
+        <w:t xml:space="preserve"> ¿Por qué dos personas pueden obtener respuestas totalmente distintas del mismo LLM?</w:t>
+      </w:r>
+    </w:p>
+    <w:p>
+      <w:pPr>
+        <w:rPr>
+          <w:b/>
+          <w:bCs/>
+          <w:u w:val="single"/>
+        </w:rPr>
+      </w:pPr>
+      <w:r>
+        <w:rPr>
+          <w:b/>
+          <w:bCs/>
+          <w:u w:val="single"/>
+        </w:rPr>
+        <w:t>Mi respuesta:</w:t>
+      </w:r>
+    </w:p>
+    <w:p>
+      <w:r>
+        <w:t xml:space="preserve">Las dos personas pueden obtener dos </w:t>
+      </w:r>
+      <w:r>
+        <w:t>respuestas totalmente distintas</w:t>
+      </w:r>
+      <w:r>
+        <w:t xml:space="preserve"> del mismo LLM porque hicieron muy distinto el </w:t>
+      </w:r>
+      <w:proofErr w:type="spellStart"/>
+      <w:r>
+        <w:t>Prompt</w:t>
+      </w:r>
+      <w:proofErr w:type="spellEnd"/>
+      <w:r>
+        <w:t xml:space="preserve">, el primero hizo una pregunta directa lo que ocasiono que el LLM no sepa bien como responder, entonces le lanza todo lo que tiene </w:t>
+      </w:r>
+      <w:r>
+        <w:t xml:space="preserve">en crudo. En </w:t>
+      </w:r>
+      <w:r>
+        <w:t>cambio,</w:t>
+      </w:r>
+      <w:r>
+        <w:t xml:space="preserve"> alguien con un buen </w:t>
+      </w:r>
+      <w:proofErr w:type="spellStart"/>
+      <w:r>
+        <w:t>Prompt</w:t>
+      </w:r>
+      <w:proofErr w:type="spellEnd"/>
+      <w:r>
+        <w:t xml:space="preserve"> le deja claro al LLM lo que quiere, le dice en el rol que se tiene que poner, le da contexto del pasado, le da lo que tiene que hacer y le da restricciones de lo que no debe hacer. </w:t>
+      </w:r>
+    </w:p>
+    <w:p>
+      <w:pPr>
+        <w:rPr>
+          <w:b/>
+          <w:bCs/>
+          <w:u w:val="single"/>
+        </w:rPr>
+      </w:pPr>
+      <w:r>
+        <w:rPr>
+          <w:b/>
+          <w:bCs/>
+          <w:u w:val="single"/>
+        </w:rPr>
+        <w:t>Corrección:</w:t>
+      </w:r>
+    </w:p>
+    <w:p>
+      <w:r>
+        <w:t xml:space="preserve">Dos personas pueden obtener respuestas totalmente distintas del mismo LLM porque utilizaron </w:t>
+      </w:r>
+      <w:proofErr w:type="spellStart"/>
+      <w:r>
+        <w:t>prompts</w:t>
+      </w:r>
+      <w:proofErr w:type="spellEnd"/>
+      <w:r>
+        <w:t xml:space="preserve"> diferentes.</w:t>
+      </w:r>
+    </w:p>
+    <w:p>
+      <w:r>
+        <w:t>Cuando alguien hace solo una pregunta directa, el LLM no tiene suficiente información sobre cómo debe responder, por lo que devuelve una respuesta amplia, genérica o “en crudo”, usando patrones promedio.</w:t>
+      </w:r>
+    </w:p>
+    <w:p>
+      <w:r>
+        <w:t xml:space="preserve">En cambio, un buen </w:t>
+      </w:r>
+      <w:proofErr w:type="spellStart"/>
+      <w:r>
+        <w:t>prompt</w:t>
+      </w:r>
+      <w:proofErr w:type="spellEnd"/>
+      <w:r>
+        <w:t xml:space="preserve"> le deja claro al LLM qué se espera de él: define el rol que debe asumir, aporta contexto previo, especifica la tarea y establece restricciones sobre cómo no debe responder.</w:t>
+      </w:r>
+    </w:p>
+    <w:p>
+      <w:r>
+        <w:t>Esto reduce el espacio de búsqueda del modelo y guía su comportamiento, haciendo que la respuesta sea más precisa, útil y alineada con la intención del usuario.</w:t>
+      </w:r>
+    </w:p>
+    <w:p>
+      <w:pPr>
+        <w:rPr>
+          <w:b/>
+          <w:bCs/>
+        </w:rPr>
+      </w:pPr>
+    </w:p>
+    <w:p>
+      <w:pPr>
+        <w:rPr>
+          <w:b/>
+          <w:bCs/>
+          <w:sz w:val="28"/>
+          <w:szCs w:val="28"/>
+          <w:u w:val="single"/>
+        </w:rPr>
+      </w:pPr>
+      <w:r>
+        <w:rPr>
+          <w:b/>
+          <w:bCs/>
+          <w:sz w:val="28"/>
+          <w:szCs w:val="28"/>
+          <w:u w:val="single"/>
+        </w:rPr>
+        <w:lastRenderedPageBreak/>
+        <w:t xml:space="preserve">Nota conceptual corta </w:t>
+      </w:r>
+    </w:p>
+    <w:p>
+      <w:r>
+        <w:t xml:space="preserve">El LLM no responde “mejor” porque sea más inteligente, sino porque el </w:t>
+      </w:r>
+      <w:proofErr w:type="spellStart"/>
+      <w:r>
+        <w:t>prompt</w:t>
+      </w:r>
+      <w:proofErr w:type="spellEnd"/>
+      <w:r>
+        <w:t xml:space="preserve"> actúa como una forma de regularización que orienta su comportamiento.</w:t>
+      </w:r>
+    </w:p>
+    <w:p/>
+    <w:p>
+      <w:pPr>
+        <w:rPr>
+          <w:sz w:val="28"/>
+          <w:szCs w:val="28"/>
+          <w:u w:val="single"/>
+        </w:rPr>
+      </w:pPr>
+      <w:r>
+        <w:rPr>
+          <w:b/>
+          <w:bCs/>
+          <w:sz w:val="28"/>
+          <w:szCs w:val="28"/>
+          <w:u w:val="single"/>
+        </w:rPr>
+        <w:t xml:space="preserve">Ejemplo práctico de </w:t>
+      </w:r>
+      <w:proofErr w:type="spellStart"/>
+      <w:r>
+        <w:rPr>
+          <w:b/>
+          <w:bCs/>
+          <w:sz w:val="28"/>
+          <w:szCs w:val="28"/>
+          <w:u w:val="single"/>
+        </w:rPr>
+        <w:t>prompt</w:t>
+      </w:r>
+      <w:proofErr w:type="spellEnd"/>
+    </w:p>
+    <w:p>
+      <w:r>
+        <w:t>Un mismo LLM puede generar respuestas muy distintas según cómo se lo instruya.</w:t>
+      </w:r>
+      <w:r>
+        <w:br/>
+        <w:t xml:space="preserve">Un </w:t>
+      </w:r>
+      <w:proofErr w:type="spellStart"/>
+      <w:r>
+        <w:t>prompt</w:t>
+      </w:r>
+      <w:proofErr w:type="spellEnd"/>
+      <w:r>
+        <w:t xml:space="preserve"> pobre deja al modelo sin guía y produce respuestas genéricas.</w:t>
+      </w:r>
+      <w:r>
+        <w:br/>
+        <w:t xml:space="preserve">Un </w:t>
+      </w:r>
+      <w:proofErr w:type="spellStart"/>
+      <w:r>
+        <w:t>prompt</w:t>
+      </w:r>
+      <w:proofErr w:type="spellEnd"/>
+      <w:r>
+        <w:t xml:space="preserve"> bien definido actúa como una forma de regularización que orienta el comportamiento del modelo y mejora la utilidad de la respuesta.</w:t>
+      </w:r>
+    </w:p>
+    <w:p>
+      <w:r>
+        <w:drawing>
+          <wp:inline distT="0" distB="0" distL="0" distR="0" wp14:anchorId="626F2F9F" wp14:editId="5E82CCBD">
+            <wp:extent cx="5239481" cy="5258534"/>
+            <wp:effectExtent l="0" t="0" r="0" b="0"/>
+            <wp:docPr id="2" name="Picture 2"/>
+            <wp:cNvGraphicFramePr>
+              <a:graphicFrameLocks xmlns:a="http://schemas.openxmlformats.org/drawingml/2006/main" noChangeAspect="1"/>
+            </wp:cNvGraphicFramePr>
+            <a:graphic xmlns:a="http://schemas.openxmlformats.org/drawingml/2006/main">
+              <a:graphicData uri="http://schemas.openxmlformats.org/drawingml/2006/picture">
+                <pic:pic xmlns:pic="http://schemas.openxmlformats.org/drawingml/2006/picture">
+                  <pic:nvPicPr>
+                    <pic:cNvPr id="1" name=""/>
+                    <pic:cNvPicPr/>
+                  </pic:nvPicPr>
+                  <pic:blipFill>
+                    <a:blip r:embed="rId7"/>
+                    <a:stretch>
+                      <a:fillRect/>
+                    </a:stretch>
+                  </pic:blipFill>
+                  <pic:spPr>
+                    <a:xfrm>
+                      <a:off x="0" y="0"/>
+                      <a:ext cx="5239481" cy="5258534"/>
+                    </a:xfrm>
+                    <a:prstGeom prst="rect">
+                      <a:avLst/>
+                    </a:prstGeom>
+                  </pic:spPr>
+                </pic:pic>
+              </a:graphicData>
+            </a:graphic>
+          </wp:inline>
+        </w:drawing>
+      </w:r>
+    </w:p>
+    <w:p>
+      <w:r>
+        <w:lastRenderedPageBreak/>
+        <w:drawing>
+          <wp:inline distT="0" distB="0" distL="0" distR="0" wp14:anchorId="2A32D6E6" wp14:editId="7B6AFDB5">
+            <wp:extent cx="4077269" cy="4753638"/>
+            <wp:effectExtent l="0" t="0" r="0" b="8890"/>
+            <wp:docPr id="3" name="Picture 3"/>
+            <wp:cNvGraphicFramePr>
+              <a:graphicFrameLocks xmlns:a="http://schemas.openxmlformats.org/drawingml/2006/main" noChangeAspect="1"/>
+            </wp:cNvGraphicFramePr>
+            <a:graphic xmlns:a="http://schemas.openxmlformats.org/drawingml/2006/main">
+              <a:graphicData uri="http://schemas.openxmlformats.org/drawingml/2006/picture">
+                <pic:pic xmlns:pic="http://schemas.openxmlformats.org/drawingml/2006/picture">
+                  <pic:nvPicPr>
+                    <pic:cNvPr id="1" name=""/>
+                    <pic:cNvPicPr/>
+                  </pic:nvPicPr>
+                  <pic:blipFill>
+                    <a:blip r:embed="rId8"/>
+                    <a:stretch>
+                      <a:fillRect/>
+                    </a:stretch>
+                  </pic:blipFill>
+                  <pic:spPr>
+                    <a:xfrm>
+                      <a:off x="0" y="0"/>
+                      <a:ext cx="4077269" cy="4753638"/>
+                    </a:xfrm>
+                    <a:prstGeom prst="rect">
+                      <a:avLst/>
+                    </a:prstGeom>
+                  </pic:spPr>
+                </pic:pic>
+              </a:graphicData>
+            </a:graphic>
+          </wp:inline>
+        </w:drawing>
+      </w:r>
+    </w:p>
     <w:sectPr>
       <w:pgSz w:w="11906" w:h="16838"/>
       <w:pgMar w:top="1417" w:right="1701" w:bottom="1417" w:left="1701" w:header="708" w:footer="708" w:gutter="0"/>
@@ -7559,6 +9207,304 @@
     </w:lvl>
   </w:abstractNum>
   <w:abstractNum w:abstractNumId="3" w15:restartNumberingAfterBreak="0">
+    <w:nsid w:val="0F6A0E7B"/>
+    <w:multiLevelType w:val="multilevel"/>
+    <w:tmpl w:val="69984BD4"/>
+    <w:lvl w:ilvl="0">
+      <w:start w:val="1"/>
+      <w:numFmt w:val="bullet"/>
+      <w:lvlText w:val=""/>
+      <w:lvlJc w:val="left"/>
+      <w:pPr>
+        <w:tabs>
+          <w:tab w:val="num" w:pos="720"/>
+        </w:tabs>
+        <w:ind w:left="720" w:hanging="360"/>
+      </w:pPr>
+      <w:rPr>
+        <w:rFonts w:ascii="Symbol" w:hAnsi="Symbol" w:hint="default"/>
+        <w:sz w:val="20"/>
+      </w:rPr>
+    </w:lvl>
+    <w:lvl w:ilvl="1" w:tentative="1">
+      <w:start w:val="1"/>
+      <w:numFmt w:val="bullet"/>
+      <w:lvlText w:val="o"/>
+      <w:lvlJc w:val="left"/>
+      <w:pPr>
+        <w:tabs>
+          <w:tab w:val="num" w:pos="1440"/>
+        </w:tabs>
+        <w:ind w:left="1440" w:hanging="360"/>
+      </w:pPr>
+      <w:rPr>
+        <w:rFonts w:ascii="Courier New" w:hAnsi="Courier New" w:hint="default"/>
+        <w:sz w:val="20"/>
+      </w:rPr>
+    </w:lvl>
+    <w:lvl w:ilvl="2" w:tentative="1">
+      <w:start w:val="1"/>
+      <w:numFmt w:val="bullet"/>
+      <w:lvlText w:val=""/>
+      <w:lvlJc w:val="left"/>
+      <w:pPr>
+        <w:tabs>
+          <w:tab w:val="num" w:pos="2160"/>
+        </w:tabs>
+        <w:ind w:left="2160" w:hanging="360"/>
+      </w:pPr>
+      <w:rPr>
+        <w:rFonts w:ascii="Wingdings" w:hAnsi="Wingdings" w:hint="default"/>
+        <w:sz w:val="20"/>
+      </w:rPr>
+    </w:lvl>
+    <w:lvl w:ilvl="3" w:tentative="1">
+      <w:start w:val="1"/>
+      <w:numFmt w:val="bullet"/>
+      <w:lvlText w:val=""/>
+      <w:lvlJc w:val="left"/>
+      <w:pPr>
+        <w:tabs>
+          <w:tab w:val="num" w:pos="2880"/>
+        </w:tabs>
+        <w:ind w:left="2880" w:hanging="360"/>
+      </w:pPr>
+      <w:rPr>
+        <w:rFonts w:ascii="Wingdings" w:hAnsi="Wingdings" w:hint="default"/>
+        <w:sz w:val="20"/>
+      </w:rPr>
+    </w:lvl>
+    <w:lvl w:ilvl="4" w:tentative="1">
+      <w:start w:val="1"/>
+      <w:numFmt w:val="bullet"/>
+      <w:lvlText w:val=""/>
+      <w:lvlJc w:val="left"/>
+      <w:pPr>
+        <w:tabs>
+          <w:tab w:val="num" w:pos="3600"/>
+        </w:tabs>
+        <w:ind w:left="3600" w:hanging="360"/>
+      </w:pPr>
+      <w:rPr>
+        <w:rFonts w:ascii="Wingdings" w:hAnsi="Wingdings" w:hint="default"/>
+        <w:sz w:val="20"/>
+      </w:rPr>
+    </w:lvl>
+    <w:lvl w:ilvl="5" w:tentative="1">
+      <w:start w:val="1"/>
+      <w:numFmt w:val="bullet"/>
+      <w:lvlText w:val=""/>
+      <w:lvlJc w:val="left"/>
+      <w:pPr>
+        <w:tabs>
+          <w:tab w:val="num" w:pos="4320"/>
+        </w:tabs>
+        <w:ind w:left="4320" w:hanging="360"/>
+      </w:pPr>
+      <w:rPr>
+        <w:rFonts w:ascii="Wingdings" w:hAnsi="Wingdings" w:hint="default"/>
+        <w:sz w:val="20"/>
+      </w:rPr>
+    </w:lvl>
+    <w:lvl w:ilvl="6" w:tentative="1">
+      <w:start w:val="1"/>
+      <w:numFmt w:val="bullet"/>
+      <w:lvlText w:val=""/>
+      <w:lvlJc w:val="left"/>
+      <w:pPr>
+        <w:tabs>
+          <w:tab w:val="num" w:pos="5040"/>
+        </w:tabs>
+        <w:ind w:left="5040" w:hanging="360"/>
+      </w:pPr>
+      <w:rPr>
+        <w:rFonts w:ascii="Wingdings" w:hAnsi="Wingdings" w:hint="default"/>
+        <w:sz w:val="20"/>
+      </w:rPr>
+    </w:lvl>
+    <w:lvl w:ilvl="7" w:tentative="1">
+      <w:start w:val="1"/>
+      <w:numFmt w:val="bullet"/>
+      <w:lvlText w:val=""/>
+      <w:lvlJc w:val="left"/>
+      <w:pPr>
+        <w:tabs>
+          <w:tab w:val="num" w:pos="5760"/>
+        </w:tabs>
+        <w:ind w:left="5760" w:hanging="360"/>
+      </w:pPr>
+      <w:rPr>
+        <w:rFonts w:ascii="Wingdings" w:hAnsi="Wingdings" w:hint="default"/>
+        <w:sz w:val="20"/>
+      </w:rPr>
+    </w:lvl>
+    <w:lvl w:ilvl="8" w:tentative="1">
+      <w:start w:val="1"/>
+      <w:numFmt w:val="bullet"/>
+      <w:lvlText w:val=""/>
+      <w:lvlJc w:val="left"/>
+      <w:pPr>
+        <w:tabs>
+          <w:tab w:val="num" w:pos="6480"/>
+        </w:tabs>
+        <w:ind w:left="6480" w:hanging="360"/>
+      </w:pPr>
+      <w:rPr>
+        <w:rFonts w:ascii="Wingdings" w:hAnsi="Wingdings" w:hint="default"/>
+        <w:sz w:val="20"/>
+      </w:rPr>
+    </w:lvl>
+  </w:abstractNum>
+  <w:abstractNum w:abstractNumId="4" w15:restartNumberingAfterBreak="0">
+    <w:nsid w:val="17C76DA4"/>
+    <w:multiLevelType w:val="multilevel"/>
+    <w:tmpl w:val="FBF44B3A"/>
+    <w:lvl w:ilvl="0">
+      <w:start w:val="1"/>
+      <w:numFmt w:val="bullet"/>
+      <w:lvlText w:val=""/>
+      <w:lvlJc w:val="left"/>
+      <w:pPr>
+        <w:tabs>
+          <w:tab w:val="num" w:pos="720"/>
+        </w:tabs>
+        <w:ind w:left="720" w:hanging="360"/>
+      </w:pPr>
+      <w:rPr>
+        <w:rFonts w:ascii="Symbol" w:hAnsi="Symbol" w:hint="default"/>
+        <w:sz w:val="20"/>
+      </w:rPr>
+    </w:lvl>
+    <w:lvl w:ilvl="1" w:tentative="1">
+      <w:start w:val="1"/>
+      <w:numFmt w:val="bullet"/>
+      <w:lvlText w:val="o"/>
+      <w:lvlJc w:val="left"/>
+      <w:pPr>
+        <w:tabs>
+          <w:tab w:val="num" w:pos="1440"/>
+        </w:tabs>
+        <w:ind w:left="1440" w:hanging="360"/>
+      </w:pPr>
+      <w:rPr>
+        <w:rFonts w:ascii="Courier New" w:hAnsi="Courier New" w:hint="default"/>
+        <w:sz w:val="20"/>
+      </w:rPr>
+    </w:lvl>
+    <w:lvl w:ilvl="2" w:tentative="1">
+      <w:start w:val="1"/>
+      <w:numFmt w:val="bullet"/>
+      <w:lvlText w:val=""/>
+      <w:lvlJc w:val="left"/>
+      <w:pPr>
+        <w:tabs>
+          <w:tab w:val="num" w:pos="2160"/>
+        </w:tabs>
+        <w:ind w:left="2160" w:hanging="360"/>
+      </w:pPr>
+      <w:rPr>
+        <w:rFonts w:ascii="Wingdings" w:hAnsi="Wingdings" w:hint="default"/>
+        <w:sz w:val="20"/>
+      </w:rPr>
+    </w:lvl>
+    <w:lvl w:ilvl="3" w:tentative="1">
+      <w:start w:val="1"/>
+      <w:numFmt w:val="bullet"/>
+      <w:lvlText w:val=""/>
+      <w:lvlJc w:val="left"/>
+      <w:pPr>
+        <w:tabs>
+          <w:tab w:val="num" w:pos="2880"/>
+        </w:tabs>
+        <w:ind w:left="2880" w:hanging="360"/>
+      </w:pPr>
+      <w:rPr>
+        <w:rFonts w:ascii="Wingdings" w:hAnsi="Wingdings" w:hint="default"/>
+        <w:sz w:val="20"/>
+      </w:rPr>
+    </w:lvl>
+    <w:lvl w:ilvl="4" w:tentative="1">
+      <w:start w:val="1"/>
+      <w:numFmt w:val="bullet"/>
+      <w:lvlText w:val=""/>
+      <w:lvlJc w:val="left"/>
+      <w:pPr>
+        <w:tabs>
+          <w:tab w:val="num" w:pos="3600"/>
+        </w:tabs>
+        <w:ind w:left="3600" w:hanging="360"/>
+      </w:pPr>
+      <w:rPr>
+        <w:rFonts w:ascii="Wingdings" w:hAnsi="Wingdings" w:hint="default"/>
+        <w:sz w:val="20"/>
+      </w:rPr>
+    </w:lvl>
+    <w:lvl w:ilvl="5" w:tentative="1">
+      <w:start w:val="1"/>
+      <w:numFmt w:val="bullet"/>
+      <w:lvlText w:val=""/>
+      <w:lvlJc w:val="left"/>
+      <w:pPr>
+        <w:tabs>
+          <w:tab w:val="num" w:pos="4320"/>
+        </w:tabs>
+        <w:ind w:left="4320" w:hanging="360"/>
+      </w:pPr>
+      <w:rPr>
+        <w:rFonts w:ascii="Wingdings" w:hAnsi="Wingdings" w:hint="default"/>
+        <w:sz w:val="20"/>
+      </w:rPr>
+    </w:lvl>
+    <w:lvl w:ilvl="6" w:tentative="1">
+      <w:start w:val="1"/>
+      <w:numFmt w:val="bullet"/>
+      <w:lvlText w:val=""/>
+      <w:lvlJc w:val="left"/>
+      <w:pPr>
+        <w:tabs>
+          <w:tab w:val="num" w:pos="5040"/>
+        </w:tabs>
+        <w:ind w:left="5040" w:hanging="360"/>
+      </w:pPr>
+      <w:rPr>
+        <w:rFonts w:ascii="Wingdings" w:hAnsi="Wingdings" w:hint="default"/>
+        <w:sz w:val="20"/>
+      </w:rPr>
+    </w:lvl>
+    <w:lvl w:ilvl="7" w:tentative="1">
+      <w:start w:val="1"/>
+      <w:numFmt w:val="bullet"/>
+      <w:lvlText w:val=""/>
+      <w:lvlJc w:val="left"/>
+      <w:pPr>
+        <w:tabs>
+          <w:tab w:val="num" w:pos="5760"/>
+        </w:tabs>
+        <w:ind w:left="5760" w:hanging="360"/>
+      </w:pPr>
+      <w:rPr>
+        <w:rFonts w:ascii="Wingdings" w:hAnsi="Wingdings" w:hint="default"/>
+        <w:sz w:val="20"/>
+      </w:rPr>
+    </w:lvl>
+    <w:lvl w:ilvl="8" w:tentative="1">
+      <w:start w:val="1"/>
+      <w:numFmt w:val="bullet"/>
+      <w:lvlText w:val=""/>
+      <w:lvlJc w:val="left"/>
+      <w:pPr>
+        <w:tabs>
+          <w:tab w:val="num" w:pos="6480"/>
+        </w:tabs>
+        <w:ind w:left="6480" w:hanging="360"/>
+      </w:pPr>
+      <w:rPr>
+        <w:rFonts w:ascii="Wingdings" w:hAnsi="Wingdings" w:hint="default"/>
+        <w:sz w:val="20"/>
+      </w:rPr>
+    </w:lvl>
+  </w:abstractNum>
+  <w:abstractNum w:abstractNumId="5" w15:restartNumberingAfterBreak="0">
     <w:nsid w:val="1D6320E2"/>
     <w:multiLevelType w:val="multilevel"/>
     <w:tmpl w:val="88F6DC20"/>
@@ -7707,7 +9653,7 @@
       </w:rPr>
     </w:lvl>
   </w:abstractNum>
-  <w:abstractNum w:abstractNumId="4" w15:restartNumberingAfterBreak="0">
+  <w:abstractNum w:abstractNumId="6" w15:restartNumberingAfterBreak="0">
     <w:nsid w:val="28057F2E"/>
     <w:multiLevelType w:val="multilevel"/>
     <w:tmpl w:val="BE80ADE8"/>
@@ -7856,7 +9802,7 @@
       </w:rPr>
     </w:lvl>
   </w:abstractNum>
-  <w:abstractNum w:abstractNumId="5" w15:restartNumberingAfterBreak="0">
+  <w:abstractNum w:abstractNumId="7" w15:restartNumberingAfterBreak="0">
     <w:nsid w:val="298D5242"/>
     <w:multiLevelType w:val="multilevel"/>
     <w:tmpl w:val="DDB61620"/>
@@ -8005,7 +9951,7 @@
       </w:rPr>
     </w:lvl>
   </w:abstractNum>
-  <w:abstractNum w:abstractNumId="6" w15:restartNumberingAfterBreak="0">
+  <w:abstractNum w:abstractNumId="8" w15:restartNumberingAfterBreak="0">
     <w:nsid w:val="2E7B68D2"/>
     <w:multiLevelType w:val="multilevel"/>
     <w:tmpl w:val="312E31B8"/>
@@ -8154,7 +10100,7 @@
       </w:rPr>
     </w:lvl>
   </w:abstractNum>
-  <w:abstractNum w:abstractNumId="7" w15:restartNumberingAfterBreak="0">
+  <w:abstractNum w:abstractNumId="9" w15:restartNumberingAfterBreak="0">
     <w:nsid w:val="32552313"/>
     <w:multiLevelType w:val="multilevel"/>
     <w:tmpl w:val="7BD2B8A6"/>
@@ -8303,7 +10249,156 @@
       </w:rPr>
     </w:lvl>
   </w:abstractNum>
-  <w:abstractNum w:abstractNumId="8" w15:restartNumberingAfterBreak="0">
+  <w:abstractNum w:abstractNumId="10" w15:restartNumberingAfterBreak="0">
+    <w:nsid w:val="366578BD"/>
+    <w:multiLevelType w:val="multilevel"/>
+    <w:tmpl w:val="74BE2DAC"/>
+    <w:lvl w:ilvl="0">
+      <w:start w:val="1"/>
+      <w:numFmt w:val="bullet"/>
+      <w:lvlText w:val=""/>
+      <w:lvlJc w:val="left"/>
+      <w:pPr>
+        <w:tabs>
+          <w:tab w:val="num" w:pos="720"/>
+        </w:tabs>
+        <w:ind w:left="720" w:hanging="360"/>
+      </w:pPr>
+      <w:rPr>
+        <w:rFonts w:ascii="Symbol" w:hAnsi="Symbol" w:hint="default"/>
+        <w:sz w:val="20"/>
+      </w:rPr>
+    </w:lvl>
+    <w:lvl w:ilvl="1" w:tentative="1">
+      <w:start w:val="1"/>
+      <w:numFmt w:val="bullet"/>
+      <w:lvlText w:val="o"/>
+      <w:lvlJc w:val="left"/>
+      <w:pPr>
+        <w:tabs>
+          <w:tab w:val="num" w:pos="1440"/>
+        </w:tabs>
+        <w:ind w:left="1440" w:hanging="360"/>
+      </w:pPr>
+      <w:rPr>
+        <w:rFonts w:ascii="Courier New" w:hAnsi="Courier New" w:hint="default"/>
+        <w:sz w:val="20"/>
+      </w:rPr>
+    </w:lvl>
+    <w:lvl w:ilvl="2" w:tentative="1">
+      <w:start w:val="1"/>
+      <w:numFmt w:val="bullet"/>
+      <w:lvlText w:val=""/>
+      <w:lvlJc w:val="left"/>
+      <w:pPr>
+        <w:tabs>
+          <w:tab w:val="num" w:pos="2160"/>
+        </w:tabs>
+        <w:ind w:left="2160" w:hanging="360"/>
+      </w:pPr>
+      <w:rPr>
+        <w:rFonts w:ascii="Wingdings" w:hAnsi="Wingdings" w:hint="default"/>
+        <w:sz w:val="20"/>
+      </w:rPr>
+    </w:lvl>
+    <w:lvl w:ilvl="3" w:tentative="1">
+      <w:start w:val="1"/>
+      <w:numFmt w:val="bullet"/>
+      <w:lvlText w:val=""/>
+      <w:lvlJc w:val="left"/>
+      <w:pPr>
+        <w:tabs>
+          <w:tab w:val="num" w:pos="2880"/>
+        </w:tabs>
+        <w:ind w:left="2880" w:hanging="360"/>
+      </w:pPr>
+      <w:rPr>
+        <w:rFonts w:ascii="Wingdings" w:hAnsi="Wingdings" w:hint="default"/>
+        <w:sz w:val="20"/>
+      </w:rPr>
+    </w:lvl>
+    <w:lvl w:ilvl="4" w:tentative="1">
+      <w:start w:val="1"/>
+      <w:numFmt w:val="bullet"/>
+      <w:lvlText w:val=""/>
+      <w:lvlJc w:val="left"/>
+      <w:pPr>
+        <w:tabs>
+          <w:tab w:val="num" w:pos="3600"/>
+        </w:tabs>
+        <w:ind w:left="3600" w:hanging="360"/>
+      </w:pPr>
+      <w:rPr>
+        <w:rFonts w:ascii="Wingdings" w:hAnsi="Wingdings" w:hint="default"/>
+        <w:sz w:val="20"/>
+      </w:rPr>
+    </w:lvl>
+    <w:lvl w:ilvl="5" w:tentative="1">
+      <w:start w:val="1"/>
+      <w:numFmt w:val="bullet"/>
+      <w:lvlText w:val=""/>
+      <w:lvlJc w:val="left"/>
+      <w:pPr>
+        <w:tabs>
+          <w:tab w:val="num" w:pos="4320"/>
+        </w:tabs>
+        <w:ind w:left="4320" w:hanging="360"/>
+      </w:pPr>
+      <w:rPr>
+        <w:rFonts w:ascii="Wingdings" w:hAnsi="Wingdings" w:hint="default"/>
+        <w:sz w:val="20"/>
+      </w:rPr>
+    </w:lvl>
+    <w:lvl w:ilvl="6" w:tentative="1">
+      <w:start w:val="1"/>
+      <w:numFmt w:val="bullet"/>
+      <w:lvlText w:val=""/>
+      <w:lvlJc w:val="left"/>
+      <w:pPr>
+        <w:tabs>
+          <w:tab w:val="num" w:pos="5040"/>
+        </w:tabs>
+        <w:ind w:left="5040" w:hanging="360"/>
+      </w:pPr>
+      <w:rPr>
+        <w:rFonts w:ascii="Wingdings" w:hAnsi="Wingdings" w:hint="default"/>
+        <w:sz w:val="20"/>
+      </w:rPr>
+    </w:lvl>
+    <w:lvl w:ilvl="7" w:tentative="1">
+      <w:start w:val="1"/>
+      <w:numFmt w:val="bullet"/>
+      <w:lvlText w:val=""/>
+      <w:lvlJc w:val="left"/>
+      <w:pPr>
+        <w:tabs>
+          <w:tab w:val="num" w:pos="5760"/>
+        </w:tabs>
+        <w:ind w:left="5760" w:hanging="360"/>
+      </w:pPr>
+      <w:rPr>
+        <w:rFonts w:ascii="Wingdings" w:hAnsi="Wingdings" w:hint="default"/>
+        <w:sz w:val="20"/>
+      </w:rPr>
+    </w:lvl>
+    <w:lvl w:ilvl="8" w:tentative="1">
+      <w:start w:val="1"/>
+      <w:numFmt w:val="bullet"/>
+      <w:lvlText w:val=""/>
+      <w:lvlJc w:val="left"/>
+      <w:pPr>
+        <w:tabs>
+          <w:tab w:val="num" w:pos="6480"/>
+        </w:tabs>
+        <w:ind w:left="6480" w:hanging="360"/>
+      </w:pPr>
+      <w:rPr>
+        <w:rFonts w:ascii="Wingdings" w:hAnsi="Wingdings" w:hint="default"/>
+        <w:sz w:val="20"/>
+      </w:rPr>
+    </w:lvl>
+  </w:abstractNum>
+  <w:abstractNum w:abstractNumId="11" w15:restartNumberingAfterBreak="0">
     <w:nsid w:val="47293482"/>
     <w:multiLevelType w:val="multilevel"/>
     <w:tmpl w:val="282EBE86"/>
@@ -8452,7 +10547,305 @@
       </w:rPr>
     </w:lvl>
   </w:abstractNum>
-  <w:abstractNum w:abstractNumId="9" w15:restartNumberingAfterBreak="0">
+  <w:abstractNum w:abstractNumId="12" w15:restartNumberingAfterBreak="0">
+    <w:nsid w:val="486E6382"/>
+    <w:multiLevelType w:val="multilevel"/>
+    <w:tmpl w:val="82F0D3DE"/>
+    <w:lvl w:ilvl="0">
+      <w:start w:val="1"/>
+      <w:numFmt w:val="bullet"/>
+      <w:lvlText w:val=""/>
+      <w:lvlJc w:val="left"/>
+      <w:pPr>
+        <w:tabs>
+          <w:tab w:val="num" w:pos="720"/>
+        </w:tabs>
+        <w:ind w:left="720" w:hanging="360"/>
+      </w:pPr>
+      <w:rPr>
+        <w:rFonts w:ascii="Symbol" w:hAnsi="Symbol" w:hint="default"/>
+        <w:sz w:val="20"/>
+      </w:rPr>
+    </w:lvl>
+    <w:lvl w:ilvl="1" w:tentative="1">
+      <w:start w:val="1"/>
+      <w:numFmt w:val="bullet"/>
+      <w:lvlText w:val="o"/>
+      <w:lvlJc w:val="left"/>
+      <w:pPr>
+        <w:tabs>
+          <w:tab w:val="num" w:pos="1440"/>
+        </w:tabs>
+        <w:ind w:left="1440" w:hanging="360"/>
+      </w:pPr>
+      <w:rPr>
+        <w:rFonts w:ascii="Courier New" w:hAnsi="Courier New" w:hint="default"/>
+        <w:sz w:val="20"/>
+      </w:rPr>
+    </w:lvl>
+    <w:lvl w:ilvl="2" w:tentative="1">
+      <w:start w:val="1"/>
+      <w:numFmt w:val="bullet"/>
+      <w:lvlText w:val=""/>
+      <w:lvlJc w:val="left"/>
+      <w:pPr>
+        <w:tabs>
+          <w:tab w:val="num" w:pos="2160"/>
+        </w:tabs>
+        <w:ind w:left="2160" w:hanging="360"/>
+      </w:pPr>
+      <w:rPr>
+        <w:rFonts w:ascii="Wingdings" w:hAnsi="Wingdings" w:hint="default"/>
+        <w:sz w:val="20"/>
+      </w:rPr>
+    </w:lvl>
+    <w:lvl w:ilvl="3" w:tentative="1">
+      <w:start w:val="1"/>
+      <w:numFmt w:val="bullet"/>
+      <w:lvlText w:val=""/>
+      <w:lvlJc w:val="left"/>
+      <w:pPr>
+        <w:tabs>
+          <w:tab w:val="num" w:pos="2880"/>
+        </w:tabs>
+        <w:ind w:left="2880" w:hanging="360"/>
+      </w:pPr>
+      <w:rPr>
+        <w:rFonts w:ascii="Wingdings" w:hAnsi="Wingdings" w:hint="default"/>
+        <w:sz w:val="20"/>
+      </w:rPr>
+    </w:lvl>
+    <w:lvl w:ilvl="4" w:tentative="1">
+      <w:start w:val="1"/>
+      <w:numFmt w:val="bullet"/>
+      <w:lvlText w:val=""/>
+      <w:lvlJc w:val="left"/>
+      <w:pPr>
+        <w:tabs>
+          <w:tab w:val="num" w:pos="3600"/>
+        </w:tabs>
+        <w:ind w:left="3600" w:hanging="360"/>
+      </w:pPr>
+      <w:rPr>
+        <w:rFonts w:ascii="Wingdings" w:hAnsi="Wingdings" w:hint="default"/>
+        <w:sz w:val="20"/>
+      </w:rPr>
+    </w:lvl>
+    <w:lvl w:ilvl="5" w:tentative="1">
+      <w:start w:val="1"/>
+      <w:numFmt w:val="bullet"/>
+      <w:lvlText w:val=""/>
+      <w:lvlJc w:val="left"/>
+      <w:pPr>
+        <w:tabs>
+          <w:tab w:val="num" w:pos="4320"/>
+        </w:tabs>
+        <w:ind w:left="4320" w:hanging="360"/>
+      </w:pPr>
+      <w:rPr>
+        <w:rFonts w:ascii="Wingdings" w:hAnsi="Wingdings" w:hint="default"/>
+        <w:sz w:val="20"/>
+      </w:rPr>
+    </w:lvl>
+    <w:lvl w:ilvl="6" w:tentative="1">
+      <w:start w:val="1"/>
+      <w:numFmt w:val="bullet"/>
+      <w:lvlText w:val=""/>
+      <w:lvlJc w:val="left"/>
+      <w:pPr>
+        <w:tabs>
+          <w:tab w:val="num" w:pos="5040"/>
+        </w:tabs>
+        <w:ind w:left="5040" w:hanging="360"/>
+      </w:pPr>
+      <w:rPr>
+        <w:rFonts w:ascii="Wingdings" w:hAnsi="Wingdings" w:hint="default"/>
+        <w:sz w:val="20"/>
+      </w:rPr>
+    </w:lvl>
+    <w:lvl w:ilvl="7" w:tentative="1">
+      <w:start w:val="1"/>
+      <w:numFmt w:val="bullet"/>
+      <w:lvlText w:val=""/>
+      <w:lvlJc w:val="left"/>
+      <w:pPr>
+        <w:tabs>
+          <w:tab w:val="num" w:pos="5760"/>
+        </w:tabs>
+        <w:ind w:left="5760" w:hanging="360"/>
+      </w:pPr>
+      <w:rPr>
+        <w:rFonts w:ascii="Wingdings" w:hAnsi="Wingdings" w:hint="default"/>
+        <w:sz w:val="20"/>
+      </w:rPr>
+    </w:lvl>
+    <w:lvl w:ilvl="8" w:tentative="1">
+      <w:start w:val="1"/>
+      <w:numFmt w:val="bullet"/>
+      <w:lvlText w:val=""/>
+      <w:lvlJc w:val="left"/>
+      <w:pPr>
+        <w:tabs>
+          <w:tab w:val="num" w:pos="6480"/>
+        </w:tabs>
+        <w:ind w:left="6480" w:hanging="360"/>
+      </w:pPr>
+      <w:rPr>
+        <w:rFonts w:ascii="Wingdings" w:hAnsi="Wingdings" w:hint="default"/>
+        <w:sz w:val="20"/>
+      </w:rPr>
+    </w:lvl>
+  </w:abstractNum>
+  <w:abstractNum w:abstractNumId="13" w15:restartNumberingAfterBreak="0">
+    <w:nsid w:val="4F74506C"/>
+    <w:multiLevelType w:val="multilevel"/>
+    <w:tmpl w:val="F926BD64"/>
+    <w:lvl w:ilvl="0">
+      <w:start w:val="1"/>
+      <w:numFmt w:val="bullet"/>
+      <w:lvlText w:val=""/>
+      <w:lvlJc w:val="left"/>
+      <w:pPr>
+        <w:tabs>
+          <w:tab w:val="num" w:pos="720"/>
+        </w:tabs>
+        <w:ind w:left="720" w:hanging="360"/>
+      </w:pPr>
+      <w:rPr>
+        <w:rFonts w:ascii="Symbol" w:hAnsi="Symbol" w:hint="default"/>
+        <w:sz w:val="20"/>
+      </w:rPr>
+    </w:lvl>
+    <w:lvl w:ilvl="1" w:tentative="1">
+      <w:start w:val="1"/>
+      <w:numFmt w:val="bullet"/>
+      <w:lvlText w:val="o"/>
+      <w:lvlJc w:val="left"/>
+      <w:pPr>
+        <w:tabs>
+          <w:tab w:val="num" w:pos="1440"/>
+        </w:tabs>
+        <w:ind w:left="1440" w:hanging="360"/>
+      </w:pPr>
+      <w:rPr>
+        <w:rFonts w:ascii="Courier New" w:hAnsi="Courier New" w:hint="default"/>
+        <w:sz w:val="20"/>
+      </w:rPr>
+    </w:lvl>
+    <w:lvl w:ilvl="2" w:tentative="1">
+      <w:start w:val="1"/>
+      <w:numFmt w:val="bullet"/>
+      <w:lvlText w:val=""/>
+      <w:lvlJc w:val="left"/>
+      <w:pPr>
+        <w:tabs>
+          <w:tab w:val="num" w:pos="2160"/>
+        </w:tabs>
+        <w:ind w:left="2160" w:hanging="360"/>
+      </w:pPr>
+      <w:rPr>
+        <w:rFonts w:ascii="Wingdings" w:hAnsi="Wingdings" w:hint="default"/>
+        <w:sz w:val="20"/>
+      </w:rPr>
+    </w:lvl>
+    <w:lvl w:ilvl="3" w:tentative="1">
+      <w:start w:val="1"/>
+      <w:numFmt w:val="bullet"/>
+      <w:lvlText w:val=""/>
+      <w:lvlJc w:val="left"/>
+      <w:pPr>
+        <w:tabs>
+          <w:tab w:val="num" w:pos="2880"/>
+        </w:tabs>
+        <w:ind w:left="2880" w:hanging="360"/>
+      </w:pPr>
+      <w:rPr>
+        <w:rFonts w:ascii="Wingdings" w:hAnsi="Wingdings" w:hint="default"/>
+        <w:sz w:val="20"/>
+      </w:rPr>
+    </w:lvl>
+    <w:lvl w:ilvl="4" w:tentative="1">
+      <w:start w:val="1"/>
+      <w:numFmt w:val="bullet"/>
+      <w:lvlText w:val=""/>
+      <w:lvlJc w:val="left"/>
+      <w:pPr>
+        <w:tabs>
+          <w:tab w:val="num" w:pos="3600"/>
+        </w:tabs>
+        <w:ind w:left="3600" w:hanging="360"/>
+      </w:pPr>
+      <w:rPr>
+        <w:rFonts w:ascii="Wingdings" w:hAnsi="Wingdings" w:hint="default"/>
+        <w:sz w:val="20"/>
+      </w:rPr>
+    </w:lvl>
+    <w:lvl w:ilvl="5" w:tentative="1">
+      <w:start w:val="1"/>
+      <w:numFmt w:val="bullet"/>
+      <w:lvlText w:val=""/>
+      <w:lvlJc w:val="left"/>
+      <w:pPr>
+        <w:tabs>
+          <w:tab w:val="num" w:pos="4320"/>
+        </w:tabs>
+        <w:ind w:left="4320" w:hanging="360"/>
+      </w:pPr>
+      <w:rPr>
+        <w:rFonts w:ascii="Wingdings" w:hAnsi="Wingdings" w:hint="default"/>
+        <w:sz w:val="20"/>
+      </w:rPr>
+    </w:lvl>
+    <w:lvl w:ilvl="6" w:tentative="1">
+      <w:start w:val="1"/>
+      <w:numFmt w:val="bullet"/>
+      <w:lvlText w:val=""/>
+      <w:lvlJc w:val="left"/>
+      <w:pPr>
+        <w:tabs>
+          <w:tab w:val="num" w:pos="5040"/>
+        </w:tabs>
+        <w:ind w:left="5040" w:hanging="360"/>
+      </w:pPr>
+      <w:rPr>
+        <w:rFonts w:ascii="Wingdings" w:hAnsi="Wingdings" w:hint="default"/>
+        <w:sz w:val="20"/>
+      </w:rPr>
+    </w:lvl>
+    <w:lvl w:ilvl="7" w:tentative="1">
+      <w:start w:val="1"/>
+      <w:numFmt w:val="bullet"/>
+      <w:lvlText w:val=""/>
+      <w:lvlJc w:val="left"/>
+      <w:pPr>
+        <w:tabs>
+          <w:tab w:val="num" w:pos="5760"/>
+        </w:tabs>
+        <w:ind w:left="5760" w:hanging="360"/>
+      </w:pPr>
+      <w:rPr>
+        <w:rFonts w:ascii="Wingdings" w:hAnsi="Wingdings" w:hint="default"/>
+        <w:sz w:val="20"/>
+      </w:rPr>
+    </w:lvl>
+    <w:lvl w:ilvl="8" w:tentative="1">
+      <w:start w:val="1"/>
+      <w:numFmt w:val="bullet"/>
+      <w:lvlText w:val=""/>
+      <w:lvlJc w:val="left"/>
+      <w:pPr>
+        <w:tabs>
+          <w:tab w:val="num" w:pos="6480"/>
+        </w:tabs>
+        <w:ind w:left="6480" w:hanging="360"/>
+      </w:pPr>
+      <w:rPr>
+        <w:rFonts w:ascii="Wingdings" w:hAnsi="Wingdings" w:hint="default"/>
+        <w:sz w:val="20"/>
+      </w:rPr>
+    </w:lvl>
+  </w:abstractNum>
+  <w:abstractNum w:abstractNumId="14" w15:restartNumberingAfterBreak="0">
     <w:nsid w:val="5790046C"/>
     <w:multiLevelType w:val="multilevel"/>
     <w:tmpl w:val="93E40112"/>
@@ -8601,7 +10994,7 @@
       </w:rPr>
     </w:lvl>
   </w:abstractNum>
-  <w:abstractNum w:abstractNumId="10" w15:restartNumberingAfterBreak="0">
+  <w:abstractNum w:abstractNumId="15" w15:restartNumberingAfterBreak="0">
     <w:nsid w:val="58B153C9"/>
     <w:multiLevelType w:val="multilevel"/>
     <w:tmpl w:val="252C7668"/>
@@ -8750,7 +11143,156 @@
       </w:rPr>
     </w:lvl>
   </w:abstractNum>
-  <w:abstractNum w:abstractNumId="11" w15:restartNumberingAfterBreak="0">
+  <w:abstractNum w:abstractNumId="16" w15:restartNumberingAfterBreak="0">
+    <w:nsid w:val="65EC5CC2"/>
+    <w:multiLevelType w:val="multilevel"/>
+    <w:tmpl w:val="893C257A"/>
+    <w:lvl w:ilvl="0">
+      <w:start w:val="1"/>
+      <w:numFmt w:val="bullet"/>
+      <w:lvlText w:val=""/>
+      <w:lvlJc w:val="left"/>
+      <w:pPr>
+        <w:tabs>
+          <w:tab w:val="num" w:pos="720"/>
+        </w:tabs>
+        <w:ind w:left="720" w:hanging="360"/>
+      </w:pPr>
+      <w:rPr>
+        <w:rFonts w:ascii="Symbol" w:hAnsi="Symbol" w:hint="default"/>
+        <w:sz w:val="20"/>
+      </w:rPr>
+    </w:lvl>
+    <w:lvl w:ilvl="1" w:tentative="1">
+      <w:start w:val="1"/>
+      <w:numFmt w:val="bullet"/>
+      <w:lvlText w:val="o"/>
+      <w:lvlJc w:val="left"/>
+      <w:pPr>
+        <w:tabs>
+          <w:tab w:val="num" w:pos="1440"/>
+        </w:tabs>
+        <w:ind w:left="1440" w:hanging="360"/>
+      </w:pPr>
+      <w:rPr>
+        <w:rFonts w:ascii="Courier New" w:hAnsi="Courier New" w:hint="default"/>
+        <w:sz w:val="20"/>
+      </w:rPr>
+    </w:lvl>
+    <w:lvl w:ilvl="2" w:tentative="1">
+      <w:start w:val="1"/>
+      <w:numFmt w:val="bullet"/>
+      <w:lvlText w:val=""/>
+      <w:lvlJc w:val="left"/>
+      <w:pPr>
+        <w:tabs>
+          <w:tab w:val="num" w:pos="2160"/>
+        </w:tabs>
+        <w:ind w:left="2160" w:hanging="360"/>
+      </w:pPr>
+      <w:rPr>
+        <w:rFonts w:ascii="Wingdings" w:hAnsi="Wingdings" w:hint="default"/>
+        <w:sz w:val="20"/>
+      </w:rPr>
+    </w:lvl>
+    <w:lvl w:ilvl="3" w:tentative="1">
+      <w:start w:val="1"/>
+      <w:numFmt w:val="bullet"/>
+      <w:lvlText w:val=""/>
+      <w:lvlJc w:val="left"/>
+      <w:pPr>
+        <w:tabs>
+          <w:tab w:val="num" w:pos="2880"/>
+        </w:tabs>
+        <w:ind w:left="2880" w:hanging="360"/>
+      </w:pPr>
+      <w:rPr>
+        <w:rFonts w:ascii="Wingdings" w:hAnsi="Wingdings" w:hint="default"/>
+        <w:sz w:val="20"/>
+      </w:rPr>
+    </w:lvl>
+    <w:lvl w:ilvl="4" w:tentative="1">
+      <w:start w:val="1"/>
+      <w:numFmt w:val="bullet"/>
+      <w:lvlText w:val=""/>
+      <w:lvlJc w:val="left"/>
+      <w:pPr>
+        <w:tabs>
+          <w:tab w:val="num" w:pos="3600"/>
+        </w:tabs>
+        <w:ind w:left="3600" w:hanging="360"/>
+      </w:pPr>
+      <w:rPr>
+        <w:rFonts w:ascii="Wingdings" w:hAnsi="Wingdings" w:hint="default"/>
+        <w:sz w:val="20"/>
+      </w:rPr>
+    </w:lvl>
+    <w:lvl w:ilvl="5" w:tentative="1">
+      <w:start w:val="1"/>
+      <w:numFmt w:val="bullet"/>
+      <w:lvlText w:val=""/>
+      <w:lvlJc w:val="left"/>
+      <w:pPr>
+        <w:tabs>
+          <w:tab w:val="num" w:pos="4320"/>
+        </w:tabs>
+        <w:ind w:left="4320" w:hanging="360"/>
+      </w:pPr>
+      <w:rPr>
+        <w:rFonts w:ascii="Wingdings" w:hAnsi="Wingdings" w:hint="default"/>
+        <w:sz w:val="20"/>
+      </w:rPr>
+    </w:lvl>
+    <w:lvl w:ilvl="6" w:tentative="1">
+      <w:start w:val="1"/>
+      <w:numFmt w:val="bullet"/>
+      <w:lvlText w:val=""/>
+      <w:lvlJc w:val="left"/>
+      <w:pPr>
+        <w:tabs>
+          <w:tab w:val="num" w:pos="5040"/>
+        </w:tabs>
+        <w:ind w:left="5040" w:hanging="360"/>
+      </w:pPr>
+      <w:rPr>
+        <w:rFonts w:ascii="Wingdings" w:hAnsi="Wingdings" w:hint="default"/>
+        <w:sz w:val="20"/>
+      </w:rPr>
+    </w:lvl>
+    <w:lvl w:ilvl="7" w:tentative="1">
+      <w:start w:val="1"/>
+      <w:numFmt w:val="bullet"/>
+      <w:lvlText w:val=""/>
+      <w:lvlJc w:val="left"/>
+      <w:pPr>
+        <w:tabs>
+          <w:tab w:val="num" w:pos="5760"/>
+        </w:tabs>
+        <w:ind w:left="5760" w:hanging="360"/>
+      </w:pPr>
+      <w:rPr>
+        <w:rFonts w:ascii="Wingdings" w:hAnsi="Wingdings" w:hint="default"/>
+        <w:sz w:val="20"/>
+      </w:rPr>
+    </w:lvl>
+    <w:lvl w:ilvl="8" w:tentative="1">
+      <w:start w:val="1"/>
+      <w:numFmt w:val="bullet"/>
+      <w:lvlText w:val=""/>
+      <w:lvlJc w:val="left"/>
+      <w:pPr>
+        <w:tabs>
+          <w:tab w:val="num" w:pos="6480"/>
+        </w:tabs>
+        <w:ind w:left="6480" w:hanging="360"/>
+      </w:pPr>
+      <w:rPr>
+        <w:rFonts w:ascii="Wingdings" w:hAnsi="Wingdings" w:hint="default"/>
+        <w:sz w:val="20"/>
+      </w:rPr>
+    </w:lvl>
+  </w:abstractNum>
+  <w:abstractNum w:abstractNumId="17" w15:restartNumberingAfterBreak="0">
     <w:nsid w:val="667A1272"/>
     <w:multiLevelType w:val="multilevel"/>
     <w:tmpl w:val="8E54D8B0"/>
@@ -8899,7 +11441,7 @@
       </w:rPr>
     </w:lvl>
   </w:abstractNum>
-  <w:abstractNum w:abstractNumId="12" w15:restartNumberingAfterBreak="0">
+  <w:abstractNum w:abstractNumId="18" w15:restartNumberingAfterBreak="0">
     <w:nsid w:val="671E3CDC"/>
     <w:multiLevelType w:val="multilevel"/>
     <w:tmpl w:val="028046DA"/>
@@ -9048,7 +11590,7 @@
       </w:rPr>
     </w:lvl>
   </w:abstractNum>
-  <w:abstractNum w:abstractNumId="13" w15:restartNumberingAfterBreak="0">
+  <w:abstractNum w:abstractNumId="19" w15:restartNumberingAfterBreak="0">
     <w:nsid w:val="6820659B"/>
     <w:multiLevelType w:val="multilevel"/>
     <w:tmpl w:val="5C442948"/>
@@ -9197,7 +11739,7 @@
       </w:rPr>
     </w:lvl>
   </w:abstractNum>
-  <w:abstractNum w:abstractNumId="14" w15:restartNumberingAfterBreak="0">
+  <w:abstractNum w:abstractNumId="20" w15:restartNumberingAfterBreak="0">
     <w:nsid w:val="6B6B3C47"/>
     <w:multiLevelType w:val="multilevel"/>
     <w:tmpl w:val="40A689D0"/>
@@ -9346,7 +11888,7 @@
       </w:rPr>
     </w:lvl>
   </w:abstractNum>
-  <w:abstractNum w:abstractNumId="15" w15:restartNumberingAfterBreak="0">
+  <w:abstractNum w:abstractNumId="21" w15:restartNumberingAfterBreak="0">
     <w:nsid w:val="6B8467BF"/>
     <w:multiLevelType w:val="multilevel"/>
     <w:tmpl w:val="8BFE2B86"/>
@@ -9495,7 +12037,156 @@
       </w:rPr>
     </w:lvl>
   </w:abstractNum>
-  <w:abstractNum w:abstractNumId="16" w15:restartNumberingAfterBreak="0">
+  <w:abstractNum w:abstractNumId="22" w15:restartNumberingAfterBreak="0">
+    <w:nsid w:val="6BF5601B"/>
+    <w:multiLevelType w:val="multilevel"/>
+    <w:tmpl w:val="61EAC5BC"/>
+    <w:lvl w:ilvl="0">
+      <w:start w:val="1"/>
+      <w:numFmt w:val="bullet"/>
+      <w:lvlText w:val=""/>
+      <w:lvlJc w:val="left"/>
+      <w:pPr>
+        <w:tabs>
+          <w:tab w:val="num" w:pos="720"/>
+        </w:tabs>
+        <w:ind w:left="720" w:hanging="360"/>
+      </w:pPr>
+      <w:rPr>
+        <w:rFonts w:ascii="Symbol" w:hAnsi="Symbol" w:hint="default"/>
+        <w:sz w:val="20"/>
+      </w:rPr>
+    </w:lvl>
+    <w:lvl w:ilvl="1" w:tentative="1">
+      <w:start w:val="1"/>
+      <w:numFmt w:val="bullet"/>
+      <w:lvlText w:val="o"/>
+      <w:lvlJc w:val="left"/>
+      <w:pPr>
+        <w:tabs>
+          <w:tab w:val="num" w:pos="1440"/>
+        </w:tabs>
+        <w:ind w:left="1440" w:hanging="360"/>
+      </w:pPr>
+      <w:rPr>
+        <w:rFonts w:ascii="Courier New" w:hAnsi="Courier New" w:hint="default"/>
+        <w:sz w:val="20"/>
+      </w:rPr>
+    </w:lvl>
+    <w:lvl w:ilvl="2" w:tentative="1">
+      <w:start w:val="1"/>
+      <w:numFmt w:val="bullet"/>
+      <w:lvlText w:val=""/>
+      <w:lvlJc w:val="left"/>
+      <w:pPr>
+        <w:tabs>
+          <w:tab w:val="num" w:pos="2160"/>
+        </w:tabs>
+        <w:ind w:left="2160" w:hanging="360"/>
+      </w:pPr>
+      <w:rPr>
+        <w:rFonts w:ascii="Wingdings" w:hAnsi="Wingdings" w:hint="default"/>
+        <w:sz w:val="20"/>
+      </w:rPr>
+    </w:lvl>
+    <w:lvl w:ilvl="3" w:tentative="1">
+      <w:start w:val="1"/>
+      <w:numFmt w:val="bullet"/>
+      <w:lvlText w:val=""/>
+      <w:lvlJc w:val="left"/>
+      <w:pPr>
+        <w:tabs>
+          <w:tab w:val="num" w:pos="2880"/>
+        </w:tabs>
+        <w:ind w:left="2880" w:hanging="360"/>
+      </w:pPr>
+      <w:rPr>
+        <w:rFonts w:ascii="Wingdings" w:hAnsi="Wingdings" w:hint="default"/>
+        <w:sz w:val="20"/>
+      </w:rPr>
+    </w:lvl>
+    <w:lvl w:ilvl="4" w:tentative="1">
+      <w:start w:val="1"/>
+      <w:numFmt w:val="bullet"/>
+      <w:lvlText w:val=""/>
+      <w:lvlJc w:val="left"/>
+      <w:pPr>
+        <w:tabs>
+          <w:tab w:val="num" w:pos="3600"/>
+        </w:tabs>
+        <w:ind w:left="3600" w:hanging="360"/>
+      </w:pPr>
+      <w:rPr>
+        <w:rFonts w:ascii="Wingdings" w:hAnsi="Wingdings" w:hint="default"/>
+        <w:sz w:val="20"/>
+      </w:rPr>
+    </w:lvl>
+    <w:lvl w:ilvl="5" w:tentative="1">
+      <w:start w:val="1"/>
+      <w:numFmt w:val="bullet"/>
+      <w:lvlText w:val=""/>
+      <w:lvlJc w:val="left"/>
+      <w:pPr>
+        <w:tabs>
+          <w:tab w:val="num" w:pos="4320"/>
+        </w:tabs>
+        <w:ind w:left="4320" w:hanging="360"/>
+      </w:pPr>
+      <w:rPr>
+        <w:rFonts w:ascii="Wingdings" w:hAnsi="Wingdings" w:hint="default"/>
+        <w:sz w:val="20"/>
+      </w:rPr>
+    </w:lvl>
+    <w:lvl w:ilvl="6" w:tentative="1">
+      <w:start w:val="1"/>
+      <w:numFmt w:val="bullet"/>
+      <w:lvlText w:val=""/>
+      <w:lvlJc w:val="left"/>
+      <w:pPr>
+        <w:tabs>
+          <w:tab w:val="num" w:pos="5040"/>
+        </w:tabs>
+        <w:ind w:left="5040" w:hanging="360"/>
+      </w:pPr>
+      <w:rPr>
+        <w:rFonts w:ascii="Wingdings" w:hAnsi="Wingdings" w:hint="default"/>
+        <w:sz w:val="20"/>
+      </w:rPr>
+    </w:lvl>
+    <w:lvl w:ilvl="7" w:tentative="1">
+      <w:start w:val="1"/>
+      <w:numFmt w:val="bullet"/>
+      <w:lvlText w:val=""/>
+      <w:lvlJc w:val="left"/>
+      <w:pPr>
+        <w:tabs>
+          <w:tab w:val="num" w:pos="5760"/>
+        </w:tabs>
+        <w:ind w:left="5760" w:hanging="360"/>
+      </w:pPr>
+      <w:rPr>
+        <w:rFonts w:ascii="Wingdings" w:hAnsi="Wingdings" w:hint="default"/>
+        <w:sz w:val="20"/>
+      </w:rPr>
+    </w:lvl>
+    <w:lvl w:ilvl="8" w:tentative="1">
+      <w:start w:val="1"/>
+      <w:numFmt w:val="bullet"/>
+      <w:lvlText w:val=""/>
+      <w:lvlJc w:val="left"/>
+      <w:pPr>
+        <w:tabs>
+          <w:tab w:val="num" w:pos="6480"/>
+        </w:tabs>
+        <w:ind w:left="6480" w:hanging="360"/>
+      </w:pPr>
+      <w:rPr>
+        <w:rFonts w:ascii="Wingdings" w:hAnsi="Wingdings" w:hint="default"/>
+        <w:sz w:val="20"/>
+      </w:rPr>
+    </w:lvl>
+  </w:abstractNum>
+  <w:abstractNum w:abstractNumId="23" w15:restartNumberingAfterBreak="0">
     <w:nsid w:val="6C2E01F6"/>
     <w:multiLevelType w:val="multilevel"/>
     <w:tmpl w:val="D44C1F9C"/>
@@ -9644,7 +12335,7 @@
       </w:rPr>
     </w:lvl>
   </w:abstractNum>
-  <w:abstractNum w:abstractNumId="17" w15:restartNumberingAfterBreak="0">
+  <w:abstractNum w:abstractNumId="24" w15:restartNumberingAfterBreak="0">
     <w:nsid w:val="6C75010A"/>
     <w:multiLevelType w:val="multilevel"/>
     <w:tmpl w:val="1C86A130"/>
@@ -9793,7 +12484,7 @@
       </w:rPr>
     </w:lvl>
   </w:abstractNum>
-  <w:abstractNum w:abstractNumId="18" w15:restartNumberingAfterBreak="0">
+  <w:abstractNum w:abstractNumId="25" w15:restartNumberingAfterBreak="0">
     <w:nsid w:val="6D790680"/>
     <w:multiLevelType w:val="multilevel"/>
     <w:tmpl w:val="003C3B4E"/>
@@ -9942,7 +12633,7 @@
       </w:rPr>
     </w:lvl>
   </w:abstractNum>
-  <w:abstractNum w:abstractNumId="19" w15:restartNumberingAfterBreak="0">
+  <w:abstractNum w:abstractNumId="26" w15:restartNumberingAfterBreak="0">
     <w:nsid w:val="70860B6B"/>
     <w:multiLevelType w:val="multilevel"/>
     <w:tmpl w:val="6194F3F0"/>
@@ -10059,7 +12750,7 @@
       </w:pPr>
     </w:lvl>
   </w:abstractNum>
-  <w:abstractNum w:abstractNumId="20" w15:restartNumberingAfterBreak="0">
+  <w:abstractNum w:abstractNumId="27" w15:restartNumberingAfterBreak="0">
     <w:nsid w:val="72090254"/>
     <w:multiLevelType w:val="multilevel"/>
     <w:tmpl w:val="042678B8"/>
@@ -10208,7 +12899,7 @@
       </w:rPr>
     </w:lvl>
   </w:abstractNum>
-  <w:abstractNum w:abstractNumId="21" w15:restartNumberingAfterBreak="0">
+  <w:abstractNum w:abstractNumId="28" w15:restartNumberingAfterBreak="0">
     <w:nsid w:val="723227B4"/>
     <w:multiLevelType w:val="multilevel"/>
     <w:tmpl w:val="C5FE236A"/>
@@ -10357,7 +13048,7 @@
       </w:rPr>
     </w:lvl>
   </w:abstractNum>
-  <w:abstractNum w:abstractNumId="22" w15:restartNumberingAfterBreak="0">
+  <w:abstractNum w:abstractNumId="29" w15:restartNumberingAfterBreak="0">
     <w:nsid w:val="77F8377D"/>
     <w:multiLevelType w:val="multilevel"/>
     <w:tmpl w:val="E4426A14"/>
@@ -10506,7 +13197,7 @@
       </w:rPr>
     </w:lvl>
   </w:abstractNum>
-  <w:abstractNum w:abstractNumId="23" w15:restartNumberingAfterBreak="0">
+  <w:abstractNum w:abstractNumId="30" w15:restartNumberingAfterBreak="0">
     <w:nsid w:val="7D212188"/>
     <w:multiLevelType w:val="multilevel"/>
     <w:tmpl w:val="379CEEA4"/>
@@ -10656,76 +13347,97 @@
     </w:lvl>
   </w:abstractNum>
   <w:num w:numId="1" w16cid:durableId="539703690">
-    <w:abstractNumId w:val="23"/>
+    <w:abstractNumId w:val="30"/>
   </w:num>
   <w:num w:numId="2" w16cid:durableId="529539000">
-    <w:abstractNumId w:val="21"/>
+    <w:abstractNumId w:val="28"/>
   </w:num>
   <w:num w:numId="3" w16cid:durableId="1507868098">
-    <w:abstractNumId w:val="20"/>
+    <w:abstractNumId w:val="27"/>
   </w:num>
   <w:num w:numId="4" w16cid:durableId="1776513486">
-    <w:abstractNumId w:val="17"/>
+    <w:abstractNumId w:val="24"/>
   </w:num>
   <w:num w:numId="5" w16cid:durableId="1090276143">
-    <w:abstractNumId w:val="8"/>
+    <w:abstractNumId w:val="11"/>
   </w:num>
   <w:num w:numId="6" w16cid:durableId="1100642952">
     <w:abstractNumId w:val="0"/>
   </w:num>
   <w:num w:numId="7" w16cid:durableId="609314199">
-    <w:abstractNumId w:val="4"/>
+    <w:abstractNumId w:val="6"/>
   </w:num>
   <w:num w:numId="8" w16cid:durableId="1326663548">
-    <w:abstractNumId w:val="13"/>
+    <w:abstractNumId w:val="19"/>
   </w:num>
   <w:num w:numId="9" w16cid:durableId="799693069">
-    <w:abstractNumId w:val="11"/>
+    <w:abstractNumId w:val="17"/>
   </w:num>
   <w:num w:numId="10" w16cid:durableId="107093652">
-    <w:abstractNumId w:val="15"/>
+    <w:abstractNumId w:val="21"/>
   </w:num>
   <w:num w:numId="11" w16cid:durableId="1675720591">
     <w:abstractNumId w:val="1"/>
   </w:num>
   <w:num w:numId="12" w16cid:durableId="2140419691">
+    <w:abstractNumId w:val="20"/>
+  </w:num>
+  <w:num w:numId="13" w16cid:durableId="1892954593">
+    <w:abstractNumId w:val="9"/>
+  </w:num>
+  <w:num w:numId="14" w16cid:durableId="1234658075">
+    <w:abstractNumId w:val="15"/>
+  </w:num>
+  <w:num w:numId="15" w16cid:durableId="1593784728">
     <w:abstractNumId w:val="14"/>
   </w:num>
-  <w:num w:numId="13" w16cid:durableId="1892954593">
-    <w:abstractNumId w:val="7"/>
-  </w:num>
-  <w:num w:numId="14" w16cid:durableId="1234658075">
-    <w:abstractNumId w:val="10"/>
-  </w:num>
-  <w:num w:numId="15" w16cid:durableId="1593784728">
-    <w:abstractNumId w:val="9"/>
-  </w:num>
   <w:num w:numId="16" w16cid:durableId="443309351">
-    <w:abstractNumId w:val="22"/>
+    <w:abstractNumId w:val="29"/>
   </w:num>
   <w:num w:numId="17" w16cid:durableId="1965304958">
-    <w:abstractNumId w:val="19"/>
+    <w:abstractNumId w:val="26"/>
   </w:num>
   <w:num w:numId="18" w16cid:durableId="688605314">
-    <w:abstractNumId w:val="12"/>
+    <w:abstractNumId w:val="18"/>
   </w:num>
   <w:num w:numId="19" w16cid:durableId="1022316225">
-    <w:abstractNumId w:val="18"/>
+    <w:abstractNumId w:val="25"/>
   </w:num>
   <w:num w:numId="20" w16cid:durableId="141240616">
     <w:abstractNumId w:val="2"/>
   </w:num>
   <w:num w:numId="21" w16cid:durableId="765424595">
+    <w:abstractNumId w:val="23"/>
+  </w:num>
+  <w:num w:numId="22" w16cid:durableId="2049254314">
+    <w:abstractNumId w:val="8"/>
+  </w:num>
+  <w:num w:numId="23" w16cid:durableId="1397165907">
+    <w:abstractNumId w:val="5"/>
+  </w:num>
+  <w:num w:numId="24" w16cid:durableId="1298873727">
+    <w:abstractNumId w:val="7"/>
+  </w:num>
+  <w:num w:numId="25" w16cid:durableId="970286715">
+    <w:abstractNumId w:val="10"/>
+  </w:num>
+  <w:num w:numId="26" w16cid:durableId="1234780031">
+    <w:abstractNumId w:val="22"/>
+  </w:num>
+  <w:num w:numId="27" w16cid:durableId="933439244">
+    <w:abstractNumId w:val="4"/>
+  </w:num>
+  <w:num w:numId="28" w16cid:durableId="713162761">
+    <w:abstractNumId w:val="13"/>
+  </w:num>
+  <w:num w:numId="29" w16cid:durableId="389034150">
     <w:abstractNumId w:val="16"/>
   </w:num>
-  <w:num w:numId="22" w16cid:durableId="2049254314">
-    <w:abstractNumId w:val="6"/>
-  </w:num>
-  <w:num w:numId="23" w16cid:durableId="1397165907">
+  <w:num w:numId="30" w16cid:durableId="2101292932">
     <w:abstractNumId w:val="3"/>
   </w:num>
-  <w:num w:numId="24" w16cid:durableId="1298873727">
-    <w:abstractNumId w:val="5"/>
+  <w:num w:numId="31" w16cid:durableId="1451246123">
+    <w:abstractNumId w:val="12"/>
   </w:num>
 </w:numbering>
 </file>

</xml_diff>

<commit_message>
Dia 26: Diseño preventivo de prompts y deteccion de fallos
</commit_message>
<xml_diff>
--- a/LLMs/LLMs.docx
+++ b/LLMs/LLMs.docx
@@ -16461,9 +16461,130 @@
           <w:szCs w:val="28"/>
           <w:u w:val="single"/>
         </w:rPr>
-        <w:t>1)</w:t>
-      </w:r>
-      <w:r>
+        <w:t>1) Problema real</w:t>
+      </w:r>
+    </w:p>
+    <w:p>
+      <w:pPr>
+        <w:rPr>
+          <w:sz w:val="24"/>
+          <w:szCs w:val="24"/>
+        </w:rPr>
+      </w:pPr>
+      <w:r>
+        <w:rPr>
+          <w:sz w:val="24"/>
+          <w:szCs w:val="24"/>
+        </w:rPr>
+        <w:t>“Algunas respuestas suenan bien, pero están mal.”</w:t>
+      </w:r>
+    </w:p>
+    <w:p>
+      <w:pPr>
+        <w:rPr>
+          <w:sz w:val="24"/>
+          <w:szCs w:val="24"/>
+        </w:rPr>
+      </w:pPr>
+      <w:r>
+        <w:rPr>
+          <w:sz w:val="24"/>
+          <w:szCs w:val="24"/>
+        </w:rPr>
+        <w:t xml:space="preserve">Leer todo a mano </w:t>
+      </w:r>
+      <w:r>
+        <w:rPr>
+          <w:b/>
+          <w:bCs/>
+          <w:sz w:val="24"/>
+          <w:szCs w:val="24"/>
+        </w:rPr>
+        <w:t>no escala</w:t>
+      </w:r>
+      <w:r>
+        <w:rPr>
+          <w:sz w:val="24"/>
+          <w:szCs w:val="24"/>
+        </w:rPr>
+        <w:t>.</w:t>
+      </w:r>
+      <w:r>
+        <w:rPr>
+          <w:sz w:val="24"/>
+          <w:szCs w:val="24"/>
+        </w:rPr>
+        <w:br/>
+        <w:t xml:space="preserve">Entonces: </w:t>
+      </w:r>
+      <w:r>
+        <w:rPr>
+          <w:b/>
+          <w:bCs/>
+          <w:sz w:val="24"/>
+          <w:szCs w:val="24"/>
+        </w:rPr>
+        <w:t>¿puede el propio LLM ayudar a evaluar?</w:t>
+      </w:r>
+    </w:p>
+    <w:p>
+      <w:pPr>
+        <w:rPr>
+          <w:sz w:val="24"/>
+          <w:szCs w:val="24"/>
+        </w:rPr>
+      </w:pPr>
+      <w:r>
+        <w:rPr>
+          <w:rFonts w:ascii="Segoe UI Emoji" w:hAnsi="Segoe UI Emoji" w:cs="Segoe UI Emoji"/>
+          <w:sz w:val="24"/>
+          <w:szCs w:val="24"/>
+        </w:rPr>
+        <w:t>👉</w:t>
+      </w:r>
+      <w:r>
+        <w:rPr>
+          <w:sz w:val="24"/>
+          <w:szCs w:val="24"/>
+        </w:rPr>
+        <w:t xml:space="preserve"> Sí, </w:t>
+      </w:r>
+      <w:r>
+        <w:rPr>
+          <w:b/>
+          <w:bCs/>
+          <w:sz w:val="24"/>
+          <w:szCs w:val="24"/>
+        </w:rPr>
+        <w:t>pero solo si le das una rúbrica</w:t>
+      </w:r>
+      <w:r>
+        <w:rPr>
+          <w:sz w:val="24"/>
+          <w:szCs w:val="24"/>
+        </w:rPr>
+        <w:t>.</w:t>
+      </w:r>
+    </w:p>
+    <w:p>
+      <w:pPr>
+        <w:rPr>
+          <w:sz w:val="24"/>
+          <w:szCs w:val="24"/>
+        </w:rPr>
+      </w:pPr>
+      <w:r>
+        <w:rPr>
+          <w:sz w:val="24"/>
+          <w:szCs w:val="24"/>
+        </w:rPr>
+        <w:pict w14:anchorId="62A78844">
+          <v:rect id="_x0000_i1063" style="width:0;height:1.5pt" o:hralign="center" o:hrstd="t" o:hr="t" fillcolor="#a0a0a0" stroked="f"/>
+        </w:pict>
+      </w:r>
+    </w:p>
+    <w:p>
+      <w:pPr>
         <w:rPr>
           <w:rFonts w:cstheme="minorHAnsi"/>
           <w:b/>
@@ -16472,130 +16593,8 @@
           <w:szCs w:val="28"/>
           <w:u w:val="single"/>
         </w:rPr>
-        <w:t xml:space="preserve"> Problema real</w:t>
-      </w:r>
-    </w:p>
-    <w:p>
-      <w:pPr>
-        <w:rPr>
-          <w:sz w:val="24"/>
-          <w:szCs w:val="24"/>
-        </w:rPr>
-      </w:pPr>
-      <w:r>
-        <w:rPr>
-          <w:sz w:val="24"/>
-          <w:szCs w:val="24"/>
-        </w:rPr>
-        <w:t>“Algunas respuestas suenan bien, pero están mal.”</w:t>
-      </w:r>
-    </w:p>
-    <w:p>
-      <w:pPr>
-        <w:rPr>
-          <w:sz w:val="24"/>
-          <w:szCs w:val="24"/>
-        </w:rPr>
-      </w:pPr>
-      <w:r>
-        <w:rPr>
-          <w:sz w:val="24"/>
-          <w:szCs w:val="24"/>
-        </w:rPr>
-        <w:t xml:space="preserve">Leer todo a mano </w:t>
-      </w:r>
-      <w:r>
-        <w:rPr>
-          <w:b/>
-          <w:bCs/>
-          <w:sz w:val="24"/>
-          <w:szCs w:val="24"/>
-        </w:rPr>
-        <w:t>no escala</w:t>
-      </w:r>
-      <w:r>
-        <w:rPr>
-          <w:sz w:val="24"/>
-          <w:szCs w:val="24"/>
-        </w:rPr>
-        <w:t>.</w:t>
-      </w:r>
-      <w:r>
-        <w:rPr>
-          <w:sz w:val="24"/>
-          <w:szCs w:val="24"/>
-        </w:rPr>
-        <w:br/>
-        <w:t xml:space="preserve">Entonces: </w:t>
-      </w:r>
-      <w:r>
-        <w:rPr>
-          <w:b/>
-          <w:bCs/>
-          <w:sz w:val="24"/>
-          <w:szCs w:val="24"/>
-        </w:rPr>
-        <w:t>¿puede el propio LLM ayudar a evaluar?</w:t>
-      </w:r>
-    </w:p>
-    <w:p>
-      <w:pPr>
-        <w:rPr>
-          <w:sz w:val="24"/>
-          <w:szCs w:val="24"/>
-        </w:rPr>
-      </w:pPr>
-      <w:r>
-        <w:rPr>
-          <w:rFonts w:ascii="Segoe UI Emoji" w:hAnsi="Segoe UI Emoji" w:cs="Segoe UI Emoji"/>
-          <w:sz w:val="24"/>
-          <w:szCs w:val="24"/>
-        </w:rPr>
-        <w:t>👉</w:t>
-      </w:r>
-      <w:r>
-        <w:rPr>
-          <w:sz w:val="24"/>
-          <w:szCs w:val="24"/>
-        </w:rPr>
-        <w:t xml:space="preserve"> Sí, </w:t>
-      </w:r>
-      <w:r>
-        <w:rPr>
-          <w:b/>
-          <w:bCs/>
-          <w:sz w:val="24"/>
-          <w:szCs w:val="24"/>
-        </w:rPr>
-        <w:t>pero solo si le das una rúbrica</w:t>
-      </w:r>
-      <w:r>
-        <w:rPr>
-          <w:sz w:val="24"/>
-          <w:szCs w:val="24"/>
-        </w:rPr>
-        <w:t>.</w:t>
-      </w:r>
-    </w:p>
-    <w:p>
-      <w:pPr>
-        <w:rPr>
-          <w:sz w:val="24"/>
-          <w:szCs w:val="24"/>
-        </w:rPr>
-      </w:pPr>
-      <w:r>
-        <w:rPr>
-          <w:sz w:val="24"/>
-          <w:szCs w:val="24"/>
-        </w:rPr>
-        <w:pict w14:anchorId="62A78844">
-          <v:rect id="_x0000_i1153" style="width:0;height:1.5pt" o:hralign="center" o:hrstd="t" o:hr="t" fillcolor="#a0a0a0" stroked="f"/>
-        </w:pict>
-      </w:r>
-    </w:p>
-    <w:p>
-      <w:pPr>
+      </w:pPr>
+      <w:r>
         <w:rPr>
           <w:rFonts w:cstheme="minorHAnsi"/>
           <w:b/>
@@ -16604,40 +16603,8 @@
           <w:szCs w:val="28"/>
           <w:u w:val="single"/>
         </w:rPr>
-      </w:pPr>
-      <w:r>
-        <w:rPr>
-          <w:rFonts w:cstheme="minorHAnsi"/>
-          <w:b/>
-          <w:bCs/>
-          <w:sz w:val="28"/>
-          <w:szCs w:val="28"/>
-          <w:u w:val="single"/>
-        </w:rPr>
         <w:lastRenderedPageBreak/>
-        <w:t>2️</w:t>
-      </w:r>
-      <w:r>
-        <w:rPr>
-          <w:rFonts w:cstheme="minorHAnsi"/>
-          <w:b/>
-          <w:bCs/>
-          <w:sz w:val="28"/>
-          <w:szCs w:val="28"/>
-          <w:u w:val="single"/>
-        </w:rPr>
-        <w:t xml:space="preserve">) </w:t>
-      </w:r>
-      <w:r>
-        <w:rPr>
-          <w:rFonts w:cstheme="minorHAnsi"/>
-          <w:b/>
-          <w:bCs/>
-          <w:sz w:val="28"/>
-          <w:szCs w:val="28"/>
-          <w:u w:val="single"/>
-        </w:rPr>
-        <w:t>Qué es una rúbrica (en este contexto)</w:t>
+        <w:t>2️) Qué es una rúbrica (en este contexto)</w:t>
       </w:r>
     </w:p>
     <w:p>
@@ -16832,7 +16799,7 @@
           <w:szCs w:val="24"/>
         </w:rPr>
         <w:pict w14:anchorId="50238A5E">
-          <v:rect id="_x0000_i1154" style="width:0;height:1.5pt" o:hralign="center" o:hrstd="t" o:hr="t" fillcolor="#a0a0a0" stroked="f"/>
+          <v:rect id="_x0000_i1064" style="width:0;height:1.5pt" o:hralign="center" o:hrstd="t" o:hr="t" fillcolor="#a0a0a0" stroked="f"/>
         </w:pict>
       </w:r>
     </w:p>
@@ -16856,29 +16823,7 @@
           <w:szCs w:val="28"/>
           <w:u w:val="single"/>
         </w:rPr>
-        <w:t>3️</w:t>
-      </w:r>
-      <w:r>
-        <w:rPr>
-          <w:rFonts w:cstheme="minorHAnsi"/>
-          <w:b/>
-          <w:bCs/>
-          <w:sz w:val="28"/>
-          <w:szCs w:val="28"/>
-          <w:u w:val="single"/>
-        </w:rPr>
-        <w:t xml:space="preserve">) </w:t>
-      </w:r>
-      <w:r>
-        <w:rPr>
-          <w:rFonts w:cstheme="minorHAnsi"/>
-          <w:b/>
-          <w:bCs/>
-          <w:sz w:val="28"/>
-          <w:szCs w:val="28"/>
-          <w:u w:val="single"/>
-        </w:rPr>
-        <w:t>Rúbrica mínima (la vamos a reutilizar mucho)</w:t>
+        <w:t>3️) Rúbrica mínima (la vamos a reutilizar mucho)</w:t>
       </w:r>
     </w:p>
     <w:p>
@@ -17054,7 +16999,7 @@
           <w:szCs w:val="24"/>
         </w:rPr>
         <w:pict w14:anchorId="7E80270A">
-          <v:rect id="_x0000_i1155" style="width:0;height:1.5pt" o:hralign="center" o:hrstd="t" o:hr="t" fillcolor="#a0a0a0" stroked="f"/>
+          <v:rect id="_x0000_i1065" style="width:0;height:1.5pt" o:hralign="center" o:hrstd="t" o:hr="t" fillcolor="#a0a0a0" stroked="f"/>
         </w:pict>
       </w:r>
     </w:p>
@@ -17078,8 +17023,9 @@
           <w:szCs w:val="28"/>
           <w:u w:val="single"/>
         </w:rPr>
-        <w:t>4️</w:t>
-      </w:r>
+        <w:t xml:space="preserve">4️) </w:t>
+      </w:r>
+      <w:proofErr w:type="spellStart"/>
       <w:r>
         <w:rPr>
           <w:rFonts w:cstheme="minorHAnsi"/>
@@ -17089,9 +17035,9 @@
           <w:szCs w:val="28"/>
           <w:u w:val="single"/>
         </w:rPr>
-        <w:t xml:space="preserve">) </w:t>
-      </w:r>
-      <w:proofErr w:type="spellStart"/>
+        <w:t>Prompt</w:t>
+      </w:r>
+      <w:proofErr w:type="spellEnd"/>
       <w:r>
         <w:rPr>
           <w:rFonts w:cstheme="minorHAnsi"/>
@@ -17101,10 +17047,210 @@
           <w:szCs w:val="28"/>
           <w:u w:val="single"/>
         </w:rPr>
-        <w:t>Prompt</w:t>
+        <w:t xml:space="preserve"> evaluador </w:t>
+      </w:r>
+    </w:p>
+    <w:p>
+      <w:pPr>
+        <w:rPr>
+          <w:sz w:val="24"/>
+          <w:szCs w:val="24"/>
+        </w:rPr>
+      </w:pPr>
+      <w:r>
+        <w:rPr>
+          <w:sz w:val="24"/>
+          <w:szCs w:val="24"/>
+        </w:rPr>
+        <w:t xml:space="preserve">Este es un </w:t>
+      </w:r>
+      <w:proofErr w:type="spellStart"/>
+      <w:r>
+        <w:rPr>
+          <w:sz w:val="24"/>
+          <w:szCs w:val="24"/>
+        </w:rPr>
+        <w:t>prompt</w:t>
       </w:r>
       <w:proofErr w:type="spellEnd"/>
       <w:r>
+        <w:rPr>
+          <w:sz w:val="24"/>
+          <w:szCs w:val="24"/>
+        </w:rPr>
+        <w:t xml:space="preserve"> que </w:t>
+      </w:r>
+      <w:r>
+        <w:rPr>
+          <w:b/>
+          <w:bCs/>
+          <w:sz w:val="24"/>
+          <w:szCs w:val="24"/>
+        </w:rPr>
+        <w:t>no pide generar</w:t>
+      </w:r>
+      <w:r>
+        <w:rPr>
+          <w:sz w:val="24"/>
+          <w:szCs w:val="24"/>
+        </w:rPr>
+        <w:t xml:space="preserve">, pide </w:t>
+      </w:r>
+      <w:r>
+        <w:rPr>
+          <w:b/>
+          <w:bCs/>
+          <w:sz w:val="24"/>
+          <w:szCs w:val="24"/>
+        </w:rPr>
+        <w:t>juzgar</w:t>
+      </w:r>
+      <w:r>
+        <w:rPr>
+          <w:sz w:val="24"/>
+          <w:szCs w:val="24"/>
+        </w:rPr>
+        <w:t>:</w:t>
+      </w:r>
+    </w:p>
+    <w:p>
+      <w:pPr>
+        <w:rPr>
+          <w:i/>
+          <w:iCs/>
+          <w:sz w:val="24"/>
+          <w:szCs w:val="24"/>
+        </w:rPr>
+      </w:pPr>
+      <w:r>
+        <w:rPr>
+          <w:i/>
+          <w:iCs/>
+          <w:sz w:val="24"/>
+          <w:szCs w:val="24"/>
+        </w:rPr>
+        <w:t>“</w:t>
+      </w:r>
+      <w:proofErr w:type="spellStart"/>
+      <w:r>
+        <w:rPr>
+          <w:i/>
+          <w:iCs/>
+          <w:sz w:val="24"/>
+          <w:szCs w:val="24"/>
+        </w:rPr>
+        <w:t>Evaluá</w:t>
+      </w:r>
+      <w:proofErr w:type="spellEnd"/>
+      <w:r>
+        <w:rPr>
+          <w:i/>
+          <w:iCs/>
+          <w:sz w:val="24"/>
+          <w:szCs w:val="24"/>
+        </w:rPr>
+        <w:t xml:space="preserve"> la siguiente respuesta usando la rúbrica dada.</w:t>
+      </w:r>
+      <w:r>
+        <w:rPr>
+          <w:i/>
+          <w:iCs/>
+          <w:sz w:val="24"/>
+          <w:szCs w:val="24"/>
+        </w:rPr>
+        <w:br/>
+        <w:t>Sé estricto.</w:t>
+      </w:r>
+      <w:r>
+        <w:rPr>
+          <w:i/>
+          <w:iCs/>
+          <w:sz w:val="24"/>
+          <w:szCs w:val="24"/>
+        </w:rPr>
+        <w:br/>
+        <w:t>No reescribas la respuesta.</w:t>
+      </w:r>
+      <w:r>
+        <w:rPr>
+          <w:i/>
+          <w:iCs/>
+          <w:sz w:val="24"/>
+          <w:szCs w:val="24"/>
+        </w:rPr>
+        <w:br/>
+      </w:r>
+      <w:proofErr w:type="spellStart"/>
+      <w:r>
+        <w:rPr>
+          <w:i/>
+          <w:iCs/>
+          <w:sz w:val="24"/>
+          <w:szCs w:val="24"/>
+        </w:rPr>
+        <w:t>Devolvé</w:t>
+      </w:r>
+      <w:proofErr w:type="spellEnd"/>
+      <w:r>
+        <w:rPr>
+          <w:i/>
+          <w:iCs/>
+          <w:sz w:val="24"/>
+          <w:szCs w:val="24"/>
+        </w:rPr>
+        <w:t xml:space="preserve"> solo el puntaje y una justificación breve.”</w:t>
+      </w:r>
+    </w:p>
+    <w:p>
+      <w:pPr>
+        <w:rPr>
+          <w:sz w:val="24"/>
+          <w:szCs w:val="24"/>
+        </w:rPr>
+      </w:pPr>
+      <w:r>
+        <w:rPr>
+          <w:sz w:val="24"/>
+          <w:szCs w:val="24"/>
+        </w:rPr>
+        <w:t xml:space="preserve">Eso </w:t>
+      </w:r>
+      <w:r>
+        <w:rPr>
+          <w:b/>
+          <w:bCs/>
+          <w:sz w:val="24"/>
+          <w:szCs w:val="24"/>
+        </w:rPr>
+        <w:t>cambia completamente</w:t>
+      </w:r>
+      <w:r>
+        <w:rPr>
+          <w:sz w:val="24"/>
+          <w:szCs w:val="24"/>
+        </w:rPr>
+        <w:t xml:space="preserve"> el comportamiento del modelo.</w:t>
+      </w:r>
+    </w:p>
+    <w:p>
+      <w:pPr>
+        <w:rPr>
+          <w:sz w:val="24"/>
+          <w:szCs w:val="24"/>
+        </w:rPr>
+      </w:pPr>
+      <w:r>
+        <w:rPr>
+          <w:sz w:val="24"/>
+          <w:szCs w:val="24"/>
+        </w:rPr>
+        <w:pict w14:anchorId="1566A43F">
+          <v:rect id="_x0000_i1066" style="width:0;height:1.5pt" o:hralign="center" o:hrstd="t" o:hr="t" fillcolor="#a0a0a0" stroked="f"/>
+        </w:pict>
+      </w:r>
+    </w:p>
+    <w:p>
+      <w:pPr>
         <w:rPr>
           <w:rFonts w:cstheme="minorHAnsi"/>
           <w:b/>
@@ -17113,207 +17259,7 @@
           <w:szCs w:val="28"/>
           <w:u w:val="single"/>
         </w:rPr>
-        <w:t xml:space="preserve"> evaluador </w:t>
-      </w:r>
-    </w:p>
-    <w:p>
-      <w:pPr>
-        <w:rPr>
-          <w:sz w:val="24"/>
-          <w:szCs w:val="24"/>
-        </w:rPr>
-      </w:pPr>
-      <w:r>
-        <w:rPr>
-          <w:sz w:val="24"/>
-          <w:szCs w:val="24"/>
-        </w:rPr>
-        <w:t xml:space="preserve">Este es un </w:t>
-      </w:r>
-      <w:proofErr w:type="spellStart"/>
-      <w:r>
-        <w:rPr>
-          <w:sz w:val="24"/>
-          <w:szCs w:val="24"/>
-        </w:rPr>
-        <w:t>prompt</w:t>
-      </w:r>
-      <w:proofErr w:type="spellEnd"/>
-      <w:r>
-        <w:rPr>
-          <w:sz w:val="24"/>
-          <w:szCs w:val="24"/>
-        </w:rPr>
-        <w:t xml:space="preserve"> que </w:t>
-      </w:r>
-      <w:r>
-        <w:rPr>
-          <w:b/>
-          <w:bCs/>
-          <w:sz w:val="24"/>
-          <w:szCs w:val="24"/>
-        </w:rPr>
-        <w:t>no pide generar</w:t>
-      </w:r>
-      <w:r>
-        <w:rPr>
-          <w:sz w:val="24"/>
-          <w:szCs w:val="24"/>
-        </w:rPr>
-        <w:t xml:space="preserve">, pide </w:t>
-      </w:r>
-      <w:r>
-        <w:rPr>
-          <w:b/>
-          <w:bCs/>
-          <w:sz w:val="24"/>
-          <w:szCs w:val="24"/>
-        </w:rPr>
-        <w:t>juzgar</w:t>
-      </w:r>
-      <w:r>
-        <w:rPr>
-          <w:sz w:val="24"/>
-          <w:szCs w:val="24"/>
-        </w:rPr>
-        <w:t>:</w:t>
-      </w:r>
-    </w:p>
-    <w:p>
-      <w:pPr>
-        <w:rPr>
-          <w:i/>
-          <w:iCs/>
-          <w:sz w:val="24"/>
-          <w:szCs w:val="24"/>
-        </w:rPr>
-      </w:pPr>
-      <w:r>
-        <w:rPr>
-          <w:i/>
-          <w:iCs/>
-          <w:sz w:val="24"/>
-          <w:szCs w:val="24"/>
-        </w:rPr>
-        <w:t>“</w:t>
-      </w:r>
-      <w:proofErr w:type="spellStart"/>
-      <w:r>
-        <w:rPr>
-          <w:i/>
-          <w:iCs/>
-          <w:sz w:val="24"/>
-          <w:szCs w:val="24"/>
-        </w:rPr>
-        <w:t>Evaluá</w:t>
-      </w:r>
-      <w:proofErr w:type="spellEnd"/>
-      <w:r>
-        <w:rPr>
-          <w:i/>
-          <w:iCs/>
-          <w:sz w:val="24"/>
-          <w:szCs w:val="24"/>
-        </w:rPr>
-        <w:t xml:space="preserve"> la siguiente respuesta usando la rúbrica dada.</w:t>
-      </w:r>
-      <w:r>
-        <w:rPr>
-          <w:i/>
-          <w:iCs/>
-          <w:sz w:val="24"/>
-          <w:szCs w:val="24"/>
-        </w:rPr>
-        <w:br/>
-        <w:t>Sé estricto.</w:t>
-      </w:r>
-      <w:r>
-        <w:rPr>
-          <w:i/>
-          <w:iCs/>
-          <w:sz w:val="24"/>
-          <w:szCs w:val="24"/>
-        </w:rPr>
-        <w:br/>
-        <w:t>No reescribas la respuesta.</w:t>
-      </w:r>
-      <w:r>
-        <w:rPr>
-          <w:i/>
-          <w:iCs/>
-          <w:sz w:val="24"/>
-          <w:szCs w:val="24"/>
-        </w:rPr>
-        <w:br/>
-      </w:r>
-      <w:proofErr w:type="spellStart"/>
-      <w:r>
-        <w:rPr>
-          <w:i/>
-          <w:iCs/>
-          <w:sz w:val="24"/>
-          <w:szCs w:val="24"/>
-        </w:rPr>
-        <w:t>Devolvé</w:t>
-      </w:r>
-      <w:proofErr w:type="spellEnd"/>
-      <w:r>
-        <w:rPr>
-          <w:i/>
-          <w:iCs/>
-          <w:sz w:val="24"/>
-          <w:szCs w:val="24"/>
-        </w:rPr>
-        <w:t xml:space="preserve"> solo el puntaje y una justificación breve.”</w:t>
-      </w:r>
-    </w:p>
-    <w:p>
-      <w:pPr>
-        <w:rPr>
-          <w:sz w:val="24"/>
-          <w:szCs w:val="24"/>
-        </w:rPr>
-      </w:pPr>
-      <w:r>
-        <w:rPr>
-          <w:sz w:val="24"/>
-          <w:szCs w:val="24"/>
-        </w:rPr>
-        <w:t xml:space="preserve">Eso </w:t>
-      </w:r>
-      <w:r>
-        <w:rPr>
-          <w:b/>
-          <w:bCs/>
-          <w:sz w:val="24"/>
-          <w:szCs w:val="24"/>
-        </w:rPr>
-        <w:t>cambia completamente</w:t>
-      </w:r>
-      <w:r>
-        <w:rPr>
-          <w:sz w:val="24"/>
-          <w:szCs w:val="24"/>
-        </w:rPr>
-        <w:t xml:space="preserve"> el comportamiento del modelo.</w:t>
-      </w:r>
-    </w:p>
-    <w:p>
-      <w:pPr>
-        <w:rPr>
-          <w:sz w:val="24"/>
-          <w:szCs w:val="24"/>
-        </w:rPr>
-      </w:pPr>
-      <w:r>
-        <w:rPr>
-          <w:sz w:val="24"/>
-          <w:szCs w:val="24"/>
-        </w:rPr>
-        <w:pict w14:anchorId="1566A43F">
-          <v:rect id="_x0000_i1156" style="width:0;height:1.5pt" o:hralign="center" o:hrstd="t" o:hr="t" fillcolor="#a0a0a0" stroked="f"/>
-        </w:pict>
-      </w:r>
+      </w:pPr>
     </w:p>
     <w:p>
       <w:pPr>
@@ -17326,9 +17272,7 @@
           <w:u w:val="single"/>
         </w:rPr>
       </w:pPr>
-    </w:p>
-    <w:p>
-      <w:pPr>
+      <w:r>
         <w:rPr>
           <w:rFonts w:cstheme="minorHAnsi"/>
           <w:b/>
@@ -17337,40 +17281,8 @@
           <w:szCs w:val="28"/>
           <w:u w:val="single"/>
         </w:rPr>
-      </w:pPr>
-      <w:r>
-        <w:rPr>
-          <w:rFonts w:cstheme="minorHAnsi"/>
-          <w:b/>
-          <w:bCs/>
-          <w:sz w:val="28"/>
-          <w:szCs w:val="28"/>
-          <w:u w:val="single"/>
-        </w:rPr>
         <w:lastRenderedPageBreak/>
-        <w:t>5️</w:t>
-      </w:r>
-      <w:r>
-        <w:rPr>
-          <w:rFonts w:cstheme="minorHAnsi"/>
-          <w:b/>
-          <w:bCs/>
-          <w:sz w:val="28"/>
-          <w:szCs w:val="28"/>
-          <w:u w:val="single"/>
-        </w:rPr>
-        <w:t xml:space="preserve">) </w:t>
-      </w:r>
-      <w:r>
-        <w:rPr>
-          <w:rFonts w:cstheme="minorHAnsi"/>
-          <w:b/>
-          <w:bCs/>
-          <w:sz w:val="28"/>
-          <w:szCs w:val="28"/>
-          <w:u w:val="single"/>
-        </w:rPr>
-        <w:t>Ejemplo completo (mental)</w:t>
+        <w:t>5️) Ejemplo completo (mental)</w:t>
       </w:r>
     </w:p>
     <w:p>
@@ -17667,7 +17579,7 @@
           <w:szCs w:val="24"/>
         </w:rPr>
         <w:pict w14:anchorId="2B092664">
-          <v:rect id="_x0000_i1158" style="width:0;height:1.5pt" o:hralign="center" o:hrstd="t" o:hr="t" fillcolor="#a0a0a0" stroked="f"/>
+          <v:rect id="_x0000_i1067" style="width:0;height:1.5pt" o:hralign="center" o:hrstd="t" o:hr="t" fillcolor="#a0a0a0" stroked="f"/>
         </w:pict>
       </w:r>
     </w:p>
@@ -17691,18 +17603,7 @@
           <w:szCs w:val="28"/>
           <w:u w:val="single"/>
         </w:rPr>
-        <w:t xml:space="preserve">6) </w:t>
-      </w:r>
-      <w:r>
-        <w:rPr>
-          <w:rFonts w:cstheme="minorHAnsi"/>
-          <w:b/>
-          <w:bCs/>
-          <w:sz w:val="28"/>
-          <w:szCs w:val="28"/>
-          <w:u w:val="single"/>
-        </w:rPr>
-        <w:t>Regla de oro del día</w:t>
+        <w:t>6) Regla de oro del día</w:t>
       </w:r>
     </w:p>
     <w:p>
@@ -17855,7 +17756,7 @@
           <w:szCs w:val="24"/>
         </w:rPr>
         <w:pict w14:anchorId="402B23D2">
-          <v:rect id="_x0000_i1303" style="width:0;height:1.5pt" o:hralign="center" o:hrstd="t" o:hr="t" fillcolor="#a0a0a0" stroked="f"/>
+          <v:rect id="_x0000_i1068" style="width:0;height:1.5pt" o:hralign="center" o:hrstd="t" o:hr="t" fillcolor="#a0a0a0" stroked="f"/>
         </w:pict>
       </w:r>
     </w:p>
@@ -17957,7 +17858,7 @@
           <w:szCs w:val="24"/>
         </w:rPr>
         <w:pict w14:anchorId="520A0664">
-          <v:rect id="_x0000_i1304" style="width:0;height:1.5pt" o:hralign="center" o:hrstd="t" o:hr="t" fillcolor="#a0a0a0" stroked="f"/>
+          <v:rect id="_x0000_i1069" style="width:0;height:1.5pt" o:hralign="center" o:hrstd="t" o:hr="t" fillcolor="#a0a0a0" stroked="f"/>
         </w:pict>
       </w:r>
     </w:p>
@@ -18205,6 +18106,1389 @@
         </w:rPr>
         <w:t>R2:10/10</w:t>
       </w:r>
+    </w:p>
+    <w:p>
+      <w:pPr>
+        <w:rPr>
+          <w:sz w:val="24"/>
+          <w:szCs w:val="24"/>
+        </w:rPr>
+      </w:pPr>
+    </w:p>
+    <w:p>
+      <w:pPr>
+        <w:rPr>
+          <w:b/>
+          <w:bCs/>
+          <w:sz w:val="36"/>
+          <w:szCs w:val="36"/>
+          <w:u w:val="single"/>
+        </w:rPr>
+      </w:pPr>
+      <w:r>
+        <w:rPr>
+          <w:b/>
+          <w:bCs/>
+          <w:sz w:val="36"/>
+          <w:szCs w:val="36"/>
+          <w:u w:val="single"/>
+        </w:rPr>
+        <w:t xml:space="preserve">Del criterio a la acción: mejorar </w:t>
+      </w:r>
+      <w:proofErr w:type="spellStart"/>
+      <w:r>
+        <w:rPr>
+          <w:b/>
+          <w:bCs/>
+          <w:sz w:val="36"/>
+          <w:szCs w:val="36"/>
+          <w:u w:val="single"/>
+        </w:rPr>
+        <w:t>prompts</w:t>
+      </w:r>
+      <w:proofErr w:type="spellEnd"/>
+      <w:r>
+        <w:rPr>
+          <w:b/>
+          <w:bCs/>
+          <w:sz w:val="36"/>
+          <w:szCs w:val="36"/>
+          <w:u w:val="single"/>
+        </w:rPr>
+        <w:t xml:space="preserve"> sistemáticamente</w:t>
+      </w:r>
+    </w:p>
+    <w:p>
+      <w:pPr>
+        <w:rPr>
+          <w:rFonts w:cstheme="minorHAnsi"/>
+          <w:b/>
+          <w:bCs/>
+          <w:sz w:val="28"/>
+          <w:szCs w:val="28"/>
+          <w:u w:val="single"/>
+        </w:rPr>
+      </w:pPr>
+      <w:r>
+        <w:rPr>
+          <w:rFonts w:cstheme="minorHAnsi"/>
+          <w:b/>
+          <w:bCs/>
+          <w:sz w:val="28"/>
+          <w:szCs w:val="28"/>
+          <w:u w:val="single"/>
+        </w:rPr>
+        <w:t>1️</w:t>
+      </w:r>
+      <w:r>
+        <w:rPr>
+          <w:rFonts w:cstheme="minorHAnsi"/>
+          <w:b/>
+          <w:bCs/>
+          <w:sz w:val="28"/>
+          <w:szCs w:val="28"/>
+          <w:u w:val="single"/>
+        </w:rPr>
+        <w:t xml:space="preserve">) </w:t>
+      </w:r>
+      <w:r>
+        <w:rPr>
+          <w:rFonts w:cstheme="minorHAnsi"/>
+          <w:b/>
+          <w:bCs/>
+          <w:sz w:val="28"/>
+          <w:szCs w:val="28"/>
+          <w:u w:val="single"/>
+        </w:rPr>
+        <w:t>Problema real (lo que le pasa a todo el mundo)</w:t>
+      </w:r>
+    </w:p>
+    <w:p>
+      <w:pPr>
+        <w:rPr>
+          <w:sz w:val="24"/>
+          <w:szCs w:val="24"/>
+        </w:rPr>
+      </w:pPr>
+      <w:r>
+        <w:rPr>
+          <w:sz w:val="24"/>
+          <w:szCs w:val="24"/>
+        </w:rPr>
+        <w:t>La mayoría hace:</w:t>
+      </w:r>
+    </w:p>
+    <w:p>
+      <w:pPr>
+        <w:numPr>
+          <w:ilvl w:val="0"/>
+          <w:numId w:val="78"/>
+        </w:numPr>
+        <w:rPr>
+          <w:sz w:val="24"/>
+          <w:szCs w:val="24"/>
+        </w:rPr>
+      </w:pPr>
+      <w:r>
+        <w:rPr>
+          <w:sz w:val="24"/>
+          <w:szCs w:val="24"/>
+        </w:rPr>
+        <w:t xml:space="preserve">escribe un </w:t>
+      </w:r>
+      <w:proofErr w:type="spellStart"/>
+      <w:r>
+        <w:rPr>
+          <w:sz w:val="24"/>
+          <w:szCs w:val="24"/>
+        </w:rPr>
+        <w:t>prompt</w:t>
+      </w:r>
+      <w:proofErr w:type="spellEnd"/>
+    </w:p>
+    <w:p>
+      <w:pPr>
+        <w:numPr>
+          <w:ilvl w:val="0"/>
+          <w:numId w:val="78"/>
+        </w:numPr>
+        <w:rPr>
+          <w:sz w:val="24"/>
+          <w:szCs w:val="24"/>
+        </w:rPr>
+      </w:pPr>
+      <w:r>
+        <w:rPr>
+          <w:sz w:val="24"/>
+          <w:szCs w:val="24"/>
+        </w:rPr>
+        <w:t>ejecuta</w:t>
+      </w:r>
+    </w:p>
+    <w:p>
+      <w:pPr>
+        <w:numPr>
+          <w:ilvl w:val="0"/>
+          <w:numId w:val="78"/>
+        </w:numPr>
+        <w:rPr>
+          <w:sz w:val="24"/>
+          <w:szCs w:val="24"/>
+        </w:rPr>
+      </w:pPr>
+      <w:r>
+        <w:rPr>
+          <w:sz w:val="24"/>
+          <w:szCs w:val="24"/>
+        </w:rPr>
+        <w:t>la respuesta sale mal</w:t>
+      </w:r>
+    </w:p>
+    <w:p>
+      <w:pPr>
+        <w:numPr>
+          <w:ilvl w:val="0"/>
+          <w:numId w:val="78"/>
+        </w:numPr>
+        <w:rPr>
+          <w:sz w:val="24"/>
+          <w:szCs w:val="24"/>
+        </w:rPr>
+      </w:pPr>
+      <w:r>
+        <w:rPr>
+          <w:sz w:val="24"/>
+          <w:szCs w:val="24"/>
+        </w:rPr>
+        <w:t>ajusta “a ojo”</w:t>
+      </w:r>
+    </w:p>
+    <w:p>
+      <w:pPr>
+        <w:numPr>
+          <w:ilvl w:val="0"/>
+          <w:numId w:val="78"/>
+        </w:numPr>
+        <w:rPr>
+          <w:sz w:val="24"/>
+          <w:szCs w:val="24"/>
+        </w:rPr>
+      </w:pPr>
+      <w:r>
+        <w:rPr>
+          <w:sz w:val="24"/>
+          <w:szCs w:val="24"/>
+        </w:rPr>
+        <w:t>repite</w:t>
+      </w:r>
+    </w:p>
+    <w:p>
+      <w:pPr>
+        <w:rPr>
+          <w:sz w:val="24"/>
+          <w:szCs w:val="24"/>
+        </w:rPr>
+      </w:pPr>
+      <w:r>
+        <w:rPr>
+          <w:rFonts w:ascii="Segoe UI Emoji" w:hAnsi="Segoe UI Emoji" w:cs="Segoe UI Emoji"/>
+          <w:sz w:val="24"/>
+          <w:szCs w:val="24"/>
+        </w:rPr>
+        <w:t>👉</w:t>
+      </w:r>
+      <w:r>
+        <w:rPr>
+          <w:sz w:val="24"/>
+          <w:szCs w:val="24"/>
+        </w:rPr>
+        <w:t xml:space="preserve"> Eso </w:t>
+      </w:r>
+      <w:r>
+        <w:rPr>
+          <w:b/>
+          <w:bCs/>
+          <w:sz w:val="24"/>
+          <w:szCs w:val="24"/>
+        </w:rPr>
+        <w:t>no escala</w:t>
+      </w:r>
+      <w:r>
+        <w:rPr>
+          <w:sz w:val="24"/>
+          <w:szCs w:val="24"/>
+        </w:rPr>
+        <w:t xml:space="preserve"> y depende del humor del día.</w:t>
+      </w:r>
+    </w:p>
+    <w:p>
+      <w:pPr>
+        <w:rPr>
+          <w:sz w:val="24"/>
+          <w:szCs w:val="24"/>
+        </w:rPr>
+      </w:pPr>
+    </w:p>
+    <w:p>
+      <w:pPr>
+        <w:rPr>
+          <w:sz w:val="24"/>
+          <w:szCs w:val="24"/>
+        </w:rPr>
+      </w:pPr>
+    </w:p>
+    <w:p>
+      <w:pPr>
+        <w:rPr>
+          <w:sz w:val="24"/>
+          <w:szCs w:val="24"/>
+        </w:rPr>
+      </w:pPr>
+    </w:p>
+    <w:p>
+      <w:pPr>
+        <w:rPr>
+          <w:sz w:val="24"/>
+          <w:szCs w:val="24"/>
+        </w:rPr>
+      </w:pPr>
+    </w:p>
+    <w:p>
+      <w:pPr>
+        <w:rPr>
+          <w:rFonts w:cstheme="minorHAnsi"/>
+          <w:b/>
+          <w:bCs/>
+          <w:sz w:val="28"/>
+          <w:szCs w:val="28"/>
+          <w:u w:val="single"/>
+        </w:rPr>
+      </w:pPr>
+      <w:r>
+        <w:rPr>
+          <w:rFonts w:cstheme="minorHAnsi"/>
+          <w:b/>
+          <w:bCs/>
+          <w:sz w:val="28"/>
+          <w:szCs w:val="28"/>
+          <w:u w:val="single"/>
+        </w:rPr>
+        <w:t>2️</w:t>
+      </w:r>
+      <w:r>
+        <w:rPr>
+          <w:rFonts w:cstheme="minorHAnsi"/>
+          <w:b/>
+          <w:bCs/>
+          <w:sz w:val="28"/>
+          <w:szCs w:val="28"/>
+          <w:u w:val="single"/>
+        </w:rPr>
+        <w:t xml:space="preserve">) </w:t>
+      </w:r>
+      <w:r>
+        <w:rPr>
+          <w:rFonts w:cstheme="minorHAnsi"/>
+          <w:b/>
+          <w:bCs/>
+          <w:sz w:val="28"/>
+          <w:szCs w:val="28"/>
+          <w:u w:val="single"/>
+        </w:rPr>
+        <w:t xml:space="preserve">Los 4 fallos típicos de un </w:t>
+      </w:r>
+      <w:proofErr w:type="spellStart"/>
+      <w:r>
+        <w:rPr>
+          <w:rFonts w:cstheme="minorHAnsi"/>
+          <w:b/>
+          <w:bCs/>
+          <w:sz w:val="28"/>
+          <w:szCs w:val="28"/>
+          <w:u w:val="single"/>
+        </w:rPr>
+        <w:t>prompt</w:t>
+      </w:r>
+      <w:proofErr w:type="spellEnd"/>
+      <w:r>
+        <w:rPr>
+          <w:rFonts w:cstheme="minorHAnsi"/>
+          <w:b/>
+          <w:bCs/>
+          <w:sz w:val="28"/>
+          <w:szCs w:val="28"/>
+          <w:u w:val="single"/>
+        </w:rPr>
+        <w:t xml:space="preserve"> (</w:t>
+      </w:r>
+      <w:proofErr w:type="spellStart"/>
+      <w:r>
+        <w:rPr>
+          <w:rFonts w:cstheme="minorHAnsi"/>
+          <w:b/>
+          <w:bCs/>
+          <w:sz w:val="28"/>
+          <w:szCs w:val="28"/>
+          <w:u w:val="single"/>
+        </w:rPr>
+        <w:t>check</w:t>
+      </w:r>
+      <w:proofErr w:type="spellEnd"/>
+      <w:r>
+        <w:rPr>
+          <w:rFonts w:cstheme="minorHAnsi"/>
+          <w:b/>
+          <w:bCs/>
+          <w:sz w:val="28"/>
+          <w:szCs w:val="28"/>
+          <w:u w:val="single"/>
+        </w:rPr>
+        <w:t xml:space="preserve"> rápido)</w:t>
+      </w:r>
+    </w:p>
+    <w:p>
+      <w:pPr>
+        <w:rPr>
+          <w:sz w:val="24"/>
+          <w:szCs w:val="24"/>
+        </w:rPr>
+      </w:pPr>
+      <w:r>
+        <w:rPr>
+          <w:sz w:val="24"/>
+          <w:szCs w:val="24"/>
+        </w:rPr>
+        <w:t xml:space="preserve">Antes de usar un </w:t>
+      </w:r>
+      <w:proofErr w:type="spellStart"/>
+      <w:r>
+        <w:rPr>
+          <w:sz w:val="24"/>
+          <w:szCs w:val="24"/>
+        </w:rPr>
+        <w:t>prompt</w:t>
+      </w:r>
+      <w:proofErr w:type="spellEnd"/>
+      <w:r>
+        <w:rPr>
+          <w:sz w:val="24"/>
+          <w:szCs w:val="24"/>
+        </w:rPr>
+        <w:t xml:space="preserve">, </w:t>
+      </w:r>
+      <w:proofErr w:type="spellStart"/>
+      <w:r>
+        <w:rPr>
+          <w:sz w:val="24"/>
+          <w:szCs w:val="24"/>
+        </w:rPr>
+        <w:t>preguntate</w:t>
+      </w:r>
+      <w:proofErr w:type="spellEnd"/>
+      <w:r>
+        <w:rPr>
+          <w:sz w:val="24"/>
+          <w:szCs w:val="24"/>
+        </w:rPr>
+        <w:t>:</w:t>
+      </w:r>
+    </w:p>
+    <w:p>
+      <w:pPr>
+        <w:numPr>
+          <w:ilvl w:val="0"/>
+          <w:numId w:val="79"/>
+        </w:numPr>
+        <w:rPr>
+          <w:sz w:val="24"/>
+          <w:szCs w:val="24"/>
+        </w:rPr>
+      </w:pPr>
+      <w:r>
+        <w:rPr>
+          <w:rFonts w:ascii="Segoe UI Emoji" w:hAnsi="Segoe UI Emoji" w:cs="Segoe UI Emoji"/>
+          <w:sz w:val="24"/>
+          <w:szCs w:val="24"/>
+        </w:rPr>
+        <w:t>❓</w:t>
+      </w:r>
+      <w:r>
+        <w:rPr>
+          <w:sz w:val="24"/>
+          <w:szCs w:val="24"/>
+        </w:rPr>
+        <w:t xml:space="preserve"> ¿Está claro </w:t>
+      </w:r>
+      <w:r>
+        <w:rPr>
+          <w:b/>
+          <w:bCs/>
+          <w:sz w:val="24"/>
+          <w:szCs w:val="24"/>
+        </w:rPr>
+        <w:t>qué problema resuelve</w:t>
+      </w:r>
+      <w:r>
+        <w:rPr>
+          <w:sz w:val="24"/>
+          <w:szCs w:val="24"/>
+        </w:rPr>
+        <w:t>?</w:t>
+      </w:r>
+    </w:p>
+    <w:p>
+      <w:pPr>
+        <w:numPr>
+          <w:ilvl w:val="0"/>
+          <w:numId w:val="79"/>
+        </w:numPr>
+        <w:rPr>
+          <w:sz w:val="24"/>
+          <w:szCs w:val="24"/>
+        </w:rPr>
+      </w:pPr>
+      <w:r>
+        <w:rPr>
+          <w:rFonts w:ascii="Segoe UI Emoji" w:hAnsi="Segoe UI Emoji" w:cs="Segoe UI Emoji"/>
+          <w:sz w:val="24"/>
+          <w:szCs w:val="24"/>
+        </w:rPr>
+        <w:t>🎯</w:t>
+      </w:r>
+      <w:r>
+        <w:rPr>
+          <w:sz w:val="24"/>
+          <w:szCs w:val="24"/>
+        </w:rPr>
+        <w:t xml:space="preserve"> ¿Está definido el </w:t>
+      </w:r>
+      <w:r>
+        <w:rPr>
+          <w:b/>
+          <w:bCs/>
+          <w:sz w:val="24"/>
+          <w:szCs w:val="24"/>
+        </w:rPr>
+        <w:t>eje conceptual</w:t>
+      </w:r>
+      <w:r>
+        <w:rPr>
+          <w:sz w:val="24"/>
+          <w:szCs w:val="24"/>
+        </w:rPr>
+        <w:t>?</w:t>
+      </w:r>
+    </w:p>
+    <w:p>
+      <w:pPr>
+        <w:numPr>
+          <w:ilvl w:val="0"/>
+          <w:numId w:val="79"/>
+        </w:numPr>
+        <w:rPr>
+          <w:sz w:val="24"/>
+          <w:szCs w:val="24"/>
+        </w:rPr>
+      </w:pPr>
+      <w:r>
+        <w:rPr>
+          <w:rFonts w:ascii="Segoe UI Emoji" w:hAnsi="Segoe UI Emoji" w:cs="Segoe UI Emoji"/>
+          <w:sz w:val="24"/>
+          <w:szCs w:val="24"/>
+        </w:rPr>
+        <w:t>🔒</w:t>
+      </w:r>
+      <w:r>
+        <w:rPr>
+          <w:sz w:val="24"/>
+          <w:szCs w:val="24"/>
+        </w:rPr>
+        <w:t xml:space="preserve"> ¿Tiene </w:t>
+      </w:r>
+      <w:r>
+        <w:rPr>
+          <w:b/>
+          <w:bCs/>
+          <w:sz w:val="24"/>
+          <w:szCs w:val="24"/>
+        </w:rPr>
+        <w:t>restricciones reales</w:t>
+      </w:r>
+      <w:r>
+        <w:rPr>
+          <w:sz w:val="24"/>
+          <w:szCs w:val="24"/>
+        </w:rPr>
+        <w:t>?</w:t>
+      </w:r>
+    </w:p>
+    <w:p>
+      <w:pPr>
+        <w:numPr>
+          <w:ilvl w:val="0"/>
+          <w:numId w:val="79"/>
+        </w:numPr>
+        <w:rPr>
+          <w:sz w:val="24"/>
+          <w:szCs w:val="24"/>
+        </w:rPr>
+      </w:pPr>
+      <w:r>
+        <w:rPr>
+          <w:rFonts w:ascii="Segoe UI Emoji" w:hAnsi="Segoe UI Emoji" w:cs="Segoe UI Emoji"/>
+          <w:sz w:val="24"/>
+          <w:szCs w:val="24"/>
+        </w:rPr>
+        <w:t>📐</w:t>
+      </w:r>
+      <w:r>
+        <w:rPr>
+          <w:sz w:val="24"/>
+          <w:szCs w:val="24"/>
+        </w:rPr>
+        <w:t xml:space="preserve"> ¿La salida esperada tiene </w:t>
+      </w:r>
+      <w:r>
+        <w:rPr>
+          <w:b/>
+          <w:bCs/>
+          <w:sz w:val="24"/>
+          <w:szCs w:val="24"/>
+        </w:rPr>
+        <w:t>forma</w:t>
+      </w:r>
+      <w:r>
+        <w:rPr>
+          <w:sz w:val="24"/>
+          <w:szCs w:val="24"/>
+        </w:rPr>
+        <w:t>?</w:t>
+      </w:r>
+    </w:p>
+    <w:p>
+      <w:pPr>
+        <w:rPr>
+          <w:sz w:val="24"/>
+          <w:szCs w:val="24"/>
+        </w:rPr>
+      </w:pPr>
+      <w:r>
+        <w:rPr>
+          <w:sz w:val="24"/>
+          <w:szCs w:val="24"/>
+        </w:rPr>
+        <w:t xml:space="preserve">Si alguno es “no” → el </w:t>
+      </w:r>
+      <w:proofErr w:type="spellStart"/>
+      <w:r>
+        <w:rPr>
+          <w:sz w:val="24"/>
+          <w:szCs w:val="24"/>
+        </w:rPr>
+        <w:t>prompt</w:t>
+      </w:r>
+      <w:proofErr w:type="spellEnd"/>
+      <w:r>
+        <w:rPr>
+          <w:sz w:val="24"/>
+          <w:szCs w:val="24"/>
+        </w:rPr>
+        <w:t xml:space="preserve"> va a fallar.</w:t>
+      </w:r>
+    </w:p>
+    <w:p>
+      <w:pPr>
+        <w:rPr>
+          <w:sz w:val="24"/>
+          <w:szCs w:val="24"/>
+        </w:rPr>
+      </w:pPr>
+      <w:r>
+        <w:rPr>
+          <w:sz w:val="24"/>
+          <w:szCs w:val="24"/>
+        </w:rPr>
+        <w:pict w14:anchorId="303B309D">
+          <v:rect id="_x0000_i1115" style="width:0;height:1.5pt" o:hralign="center" o:hrstd="t" o:hr="t" fillcolor="#a0a0a0" stroked="f"/>
+        </w:pict>
+      </w:r>
+    </w:p>
+    <w:p>
+      <w:pPr>
+        <w:rPr>
+          <w:rFonts w:cstheme="minorHAnsi"/>
+          <w:b/>
+          <w:bCs/>
+          <w:sz w:val="28"/>
+          <w:szCs w:val="28"/>
+          <w:u w:val="single"/>
+        </w:rPr>
+      </w:pPr>
+      <w:r>
+        <w:rPr>
+          <w:rFonts w:cstheme="minorHAnsi"/>
+          <w:b/>
+          <w:bCs/>
+          <w:sz w:val="28"/>
+          <w:szCs w:val="28"/>
+          <w:u w:val="single"/>
+        </w:rPr>
+        <w:t>3️</w:t>
+      </w:r>
+      <w:r>
+        <w:rPr>
+          <w:rFonts w:cstheme="minorHAnsi"/>
+          <w:b/>
+          <w:bCs/>
+          <w:sz w:val="28"/>
+          <w:szCs w:val="28"/>
+          <w:u w:val="single"/>
+        </w:rPr>
+        <w:t>)</w:t>
+      </w:r>
+      <w:r>
+        <w:rPr>
+          <w:rFonts w:cstheme="minorHAnsi"/>
+          <w:b/>
+          <w:bCs/>
+          <w:sz w:val="28"/>
+          <w:szCs w:val="28"/>
+          <w:u w:val="single"/>
+        </w:rPr>
+        <w:t xml:space="preserve"> Ejemplo concreto (rápido)</w:t>
+      </w:r>
+    </w:p>
+    <w:p>
+      <w:pPr>
+        <w:rPr>
+          <w:b/>
+          <w:bCs/>
+          <w:sz w:val="24"/>
+          <w:szCs w:val="24"/>
+        </w:rPr>
+      </w:pPr>
+      <w:proofErr w:type="spellStart"/>
+      <w:r>
+        <w:rPr>
+          <w:b/>
+          <w:bCs/>
+          <w:sz w:val="24"/>
+          <w:szCs w:val="24"/>
+        </w:rPr>
+        <w:t>Prompt</w:t>
+      </w:r>
+      <w:proofErr w:type="spellEnd"/>
+      <w:r>
+        <w:rPr>
+          <w:b/>
+          <w:bCs/>
+          <w:sz w:val="24"/>
+          <w:szCs w:val="24"/>
+        </w:rPr>
+        <w:t xml:space="preserve"> original (problemático)</w:t>
+      </w:r>
+    </w:p>
+    <w:p>
+      <w:pPr>
+        <w:rPr>
+          <w:sz w:val="24"/>
+          <w:szCs w:val="24"/>
+        </w:rPr>
+      </w:pPr>
+      <w:r>
+        <w:rPr>
+          <w:sz w:val="24"/>
+          <w:szCs w:val="24"/>
+        </w:rPr>
+        <w:t>“</w:t>
+      </w:r>
+      <w:proofErr w:type="spellStart"/>
+      <w:r>
+        <w:rPr>
+          <w:sz w:val="24"/>
+          <w:szCs w:val="24"/>
+        </w:rPr>
+        <w:t>Explicá</w:t>
+      </w:r>
+      <w:proofErr w:type="spellEnd"/>
+      <w:r>
+        <w:rPr>
+          <w:sz w:val="24"/>
+          <w:szCs w:val="24"/>
+        </w:rPr>
+        <w:t xml:space="preserve"> por qué RAG es mejor.”</w:t>
+      </w:r>
+    </w:p>
+    <w:p>
+      <w:pPr>
+        <w:rPr>
+          <w:sz w:val="24"/>
+          <w:szCs w:val="24"/>
+        </w:rPr>
+      </w:pPr>
+      <w:r>
+        <w:rPr>
+          <w:b/>
+          <w:bCs/>
+          <w:sz w:val="24"/>
+          <w:szCs w:val="24"/>
+        </w:rPr>
+        <w:t>Predicción:</w:t>
+      </w:r>
+    </w:p>
+    <w:p>
+      <w:pPr>
+        <w:numPr>
+          <w:ilvl w:val="0"/>
+          <w:numId w:val="80"/>
+        </w:numPr>
+        <w:rPr>
+          <w:sz w:val="24"/>
+          <w:szCs w:val="24"/>
+        </w:rPr>
+      </w:pPr>
+      <w:r>
+        <w:rPr>
+          <w:sz w:val="24"/>
+          <w:szCs w:val="24"/>
+        </w:rPr>
+        <w:t>abstracto</w:t>
+      </w:r>
+    </w:p>
+    <w:p>
+      <w:pPr>
+        <w:numPr>
+          <w:ilvl w:val="0"/>
+          <w:numId w:val="80"/>
+        </w:numPr>
+        <w:rPr>
+          <w:sz w:val="24"/>
+          <w:szCs w:val="24"/>
+        </w:rPr>
+      </w:pPr>
+      <w:r>
+        <w:rPr>
+          <w:sz w:val="24"/>
+          <w:szCs w:val="24"/>
+        </w:rPr>
+        <w:t>marketing</w:t>
+      </w:r>
+    </w:p>
+    <w:p>
+      <w:pPr>
+        <w:numPr>
+          <w:ilvl w:val="0"/>
+          <w:numId w:val="80"/>
+        </w:numPr>
+        <w:rPr>
+          <w:sz w:val="24"/>
+          <w:szCs w:val="24"/>
+        </w:rPr>
+      </w:pPr>
+      <w:r>
+        <w:rPr>
+          <w:sz w:val="24"/>
+          <w:szCs w:val="24"/>
+        </w:rPr>
+        <w:t>relleno</w:t>
+      </w:r>
+    </w:p>
+    <w:p>
+      <w:pPr>
+        <w:rPr>
+          <w:sz w:val="24"/>
+          <w:szCs w:val="24"/>
+        </w:rPr>
+      </w:pPr>
+      <w:r>
+        <w:rPr>
+          <w:rFonts w:ascii="Segoe UI Emoji" w:hAnsi="Segoe UI Emoji" w:cs="Segoe UI Emoji"/>
+          <w:sz w:val="24"/>
+          <w:szCs w:val="24"/>
+        </w:rPr>
+        <w:t>👉</w:t>
+      </w:r>
+      <w:r>
+        <w:rPr>
+          <w:sz w:val="24"/>
+          <w:szCs w:val="24"/>
+        </w:rPr>
+        <w:t xml:space="preserve"> Va a fallar.</w:t>
+      </w:r>
+    </w:p>
+    <w:p>
+      <w:pPr>
+        <w:rPr>
+          <w:sz w:val="24"/>
+          <w:szCs w:val="24"/>
+        </w:rPr>
+      </w:pPr>
+      <w:r>
+        <w:rPr>
+          <w:sz w:val="24"/>
+          <w:szCs w:val="24"/>
+        </w:rPr>
+        <w:pict w14:anchorId="69C4C1D0">
+          <v:rect id="_x0000_i1116" style="width:0;height:1.5pt" o:hralign="center" o:hrstd="t" o:hr="t" fillcolor="#a0a0a0" stroked="f"/>
+        </w:pict>
+      </w:r>
+    </w:p>
+    <w:p>
+      <w:pPr>
+        <w:rPr>
+          <w:b/>
+          <w:bCs/>
+          <w:sz w:val="24"/>
+          <w:szCs w:val="24"/>
+        </w:rPr>
+      </w:pPr>
+      <w:proofErr w:type="spellStart"/>
+      <w:r>
+        <w:rPr>
+          <w:b/>
+          <w:bCs/>
+          <w:sz w:val="24"/>
+          <w:szCs w:val="24"/>
+        </w:rPr>
+        <w:t>Prompt</w:t>
+      </w:r>
+      <w:proofErr w:type="spellEnd"/>
+      <w:r>
+        <w:rPr>
+          <w:b/>
+          <w:bCs/>
+          <w:sz w:val="24"/>
+          <w:szCs w:val="24"/>
+        </w:rPr>
+        <w:t xml:space="preserve"> corregido (antes de ejecutar)</w:t>
+      </w:r>
+    </w:p>
+    <w:p>
+      <w:pPr>
+        <w:rPr>
+          <w:sz w:val="24"/>
+          <w:szCs w:val="24"/>
+        </w:rPr>
+      </w:pPr>
+      <w:r>
+        <w:rPr>
+          <w:sz w:val="24"/>
+          <w:szCs w:val="24"/>
+        </w:rPr>
+        <w:t>“</w:t>
+      </w:r>
+      <w:proofErr w:type="spellStart"/>
+      <w:r>
+        <w:rPr>
+          <w:sz w:val="24"/>
+          <w:szCs w:val="24"/>
+        </w:rPr>
+        <w:t>Sos</w:t>
+      </w:r>
+      <w:proofErr w:type="spellEnd"/>
+      <w:r>
+        <w:rPr>
+          <w:sz w:val="24"/>
+          <w:szCs w:val="24"/>
+        </w:rPr>
+        <w:t xml:space="preserve"> un profesor de ML.</w:t>
+      </w:r>
+      <w:r>
+        <w:rPr>
+          <w:sz w:val="24"/>
+          <w:szCs w:val="24"/>
+        </w:rPr>
+        <w:br/>
+      </w:r>
+      <w:proofErr w:type="spellStart"/>
+      <w:r>
+        <w:rPr>
+          <w:sz w:val="24"/>
+          <w:szCs w:val="24"/>
+        </w:rPr>
+        <w:t>Explicá</w:t>
+      </w:r>
+      <w:proofErr w:type="spellEnd"/>
+      <w:r>
+        <w:rPr>
+          <w:sz w:val="24"/>
+          <w:szCs w:val="24"/>
+        </w:rPr>
+        <w:t xml:space="preserve"> por qué RAG mejora las respuestas de los </w:t>
+      </w:r>
+      <w:proofErr w:type="spellStart"/>
+      <w:r>
+        <w:rPr>
+          <w:sz w:val="24"/>
+          <w:szCs w:val="24"/>
+        </w:rPr>
+        <w:t>LLMs</w:t>
+      </w:r>
+      <w:proofErr w:type="spellEnd"/>
+      <w:r>
+        <w:rPr>
+          <w:sz w:val="24"/>
+          <w:szCs w:val="24"/>
+        </w:rPr>
+        <w:t>, enfocándote en la diferencia entre recuperar información y memorizarla.</w:t>
+      </w:r>
+      <w:r>
+        <w:rPr>
+          <w:sz w:val="24"/>
+          <w:szCs w:val="24"/>
+        </w:rPr>
+        <w:br/>
+      </w:r>
+      <w:proofErr w:type="spellStart"/>
+      <w:r>
+        <w:rPr>
+          <w:sz w:val="24"/>
+          <w:szCs w:val="24"/>
+        </w:rPr>
+        <w:t>Usá</w:t>
+      </w:r>
+      <w:proofErr w:type="spellEnd"/>
+      <w:r>
+        <w:rPr>
+          <w:sz w:val="24"/>
+          <w:szCs w:val="24"/>
+        </w:rPr>
+        <w:t xml:space="preserve"> una analogía simple.</w:t>
+      </w:r>
+      <w:r>
+        <w:rPr>
+          <w:sz w:val="24"/>
+          <w:szCs w:val="24"/>
+        </w:rPr>
+        <w:br/>
+        <w:t>No uses jerga técnica ni fórmulas.”</w:t>
+      </w:r>
+    </w:p>
+    <w:p>
+      <w:pPr>
+        <w:rPr>
+          <w:sz w:val="24"/>
+          <w:szCs w:val="24"/>
+        </w:rPr>
+      </w:pPr>
+      <w:r>
+        <w:rPr>
+          <w:b/>
+          <w:bCs/>
+          <w:sz w:val="24"/>
+          <w:szCs w:val="24"/>
+        </w:rPr>
+        <w:t>Predicción:</w:t>
+      </w:r>
+    </w:p>
+    <w:p>
+      <w:pPr>
+        <w:numPr>
+          <w:ilvl w:val="0"/>
+          <w:numId w:val="81"/>
+        </w:numPr>
+        <w:rPr>
+          <w:sz w:val="24"/>
+          <w:szCs w:val="24"/>
+        </w:rPr>
+      </w:pPr>
+      <w:r>
+        <w:rPr>
+          <w:sz w:val="24"/>
+          <w:szCs w:val="24"/>
+        </w:rPr>
+        <w:t>eje claro</w:t>
+      </w:r>
+    </w:p>
+    <w:p>
+      <w:pPr>
+        <w:numPr>
+          <w:ilvl w:val="0"/>
+          <w:numId w:val="81"/>
+        </w:numPr>
+        <w:rPr>
+          <w:sz w:val="24"/>
+          <w:szCs w:val="24"/>
+        </w:rPr>
+      </w:pPr>
+      <w:r>
+        <w:rPr>
+          <w:sz w:val="24"/>
+          <w:szCs w:val="24"/>
+        </w:rPr>
+        <w:t>restricciones</w:t>
+      </w:r>
+    </w:p>
+    <w:p>
+      <w:pPr>
+        <w:numPr>
+          <w:ilvl w:val="0"/>
+          <w:numId w:val="81"/>
+        </w:numPr>
+        <w:rPr>
+          <w:sz w:val="24"/>
+          <w:szCs w:val="24"/>
+        </w:rPr>
+      </w:pPr>
+      <w:r>
+        <w:rPr>
+          <w:sz w:val="24"/>
+          <w:szCs w:val="24"/>
+        </w:rPr>
+        <w:t>salida controlada</w:t>
+      </w:r>
+    </w:p>
+    <w:p>
+      <w:pPr>
+        <w:rPr>
+          <w:sz w:val="24"/>
+          <w:szCs w:val="24"/>
+        </w:rPr>
+      </w:pPr>
+      <w:r>
+        <w:rPr>
+          <w:rFonts w:ascii="Segoe UI Emoji" w:hAnsi="Segoe UI Emoji" w:cs="Segoe UI Emoji"/>
+          <w:sz w:val="24"/>
+          <w:szCs w:val="24"/>
+        </w:rPr>
+        <w:t>👉</w:t>
+      </w:r>
+      <w:r>
+        <w:rPr>
+          <w:sz w:val="24"/>
+          <w:szCs w:val="24"/>
+        </w:rPr>
+        <w:t xml:space="preserve"> Alta probabilidad de respuesta buena.</w:t>
+      </w:r>
+    </w:p>
+    <w:p>
+      <w:pPr>
+        <w:rPr>
+          <w:sz w:val="24"/>
+          <w:szCs w:val="24"/>
+        </w:rPr>
+      </w:pPr>
+      <w:r>
+        <w:rPr>
+          <w:sz w:val="24"/>
+          <w:szCs w:val="24"/>
+        </w:rPr>
+        <w:lastRenderedPageBreak/>
+        <w:pict w14:anchorId="3C4C2D0B">
+          <v:rect id="_x0000_i1117" style="width:0;height:1.5pt" o:hralign="center" o:hrstd="t" o:hr="t" fillcolor="#a0a0a0" stroked="f"/>
+        </w:pict>
+      </w:r>
+    </w:p>
+    <w:p>
+      <w:pPr>
+        <w:rPr>
+          <w:b/>
+          <w:bCs/>
+          <w:sz w:val="24"/>
+          <w:szCs w:val="24"/>
+        </w:rPr>
+      </w:pPr>
+    </w:p>
+    <w:p>
+      <w:pPr>
+        <w:rPr>
+          <w:rFonts w:cstheme="minorHAnsi"/>
+          <w:b/>
+          <w:bCs/>
+          <w:sz w:val="28"/>
+          <w:szCs w:val="28"/>
+          <w:u w:val="single"/>
+        </w:rPr>
+      </w:pPr>
+      <w:r>
+        <w:rPr>
+          <w:rFonts w:cstheme="minorHAnsi"/>
+          <w:b/>
+          <w:bCs/>
+          <w:sz w:val="28"/>
+          <w:szCs w:val="28"/>
+          <w:u w:val="single"/>
+        </w:rPr>
+        <w:t>4️</w:t>
+      </w:r>
+      <w:r>
+        <w:rPr>
+          <w:rFonts w:cstheme="minorHAnsi"/>
+          <w:b/>
+          <w:bCs/>
+          <w:sz w:val="28"/>
+          <w:szCs w:val="28"/>
+          <w:u w:val="single"/>
+        </w:rPr>
+        <w:t>)</w:t>
+      </w:r>
+      <w:r>
+        <w:rPr>
+          <w:rFonts w:cstheme="minorHAnsi"/>
+          <w:b/>
+          <w:bCs/>
+          <w:sz w:val="28"/>
+          <w:szCs w:val="28"/>
+          <w:u w:val="single"/>
+        </w:rPr>
+        <w:t xml:space="preserve"> Método del día </w:t>
+      </w:r>
+    </w:p>
+    <w:p>
+      <w:pPr>
+        <w:rPr>
+          <w:i/>
+          <w:iCs/>
+          <w:sz w:val="24"/>
+          <w:szCs w:val="24"/>
+        </w:rPr>
+      </w:pPr>
+      <w:r>
+        <w:rPr>
+          <w:i/>
+          <w:iCs/>
+          <w:sz w:val="24"/>
+          <w:szCs w:val="24"/>
+        </w:rPr>
+        <w:t xml:space="preserve">No preguntes “¿qué </w:t>
+      </w:r>
+      <w:proofErr w:type="spellStart"/>
+      <w:r>
+        <w:rPr>
+          <w:i/>
+          <w:iCs/>
+          <w:sz w:val="24"/>
+          <w:szCs w:val="24"/>
+        </w:rPr>
+        <w:t>prompt</w:t>
+      </w:r>
+      <w:proofErr w:type="spellEnd"/>
+      <w:r>
+        <w:rPr>
+          <w:i/>
+          <w:iCs/>
+          <w:sz w:val="24"/>
+          <w:szCs w:val="24"/>
+        </w:rPr>
+        <w:t xml:space="preserve"> pongo?”</w:t>
+      </w:r>
+      <w:r>
+        <w:rPr>
+          <w:i/>
+          <w:iCs/>
+          <w:sz w:val="24"/>
+          <w:szCs w:val="24"/>
+        </w:rPr>
+        <w:br/>
+      </w:r>
+      <w:proofErr w:type="spellStart"/>
+      <w:r>
+        <w:rPr>
+          <w:i/>
+          <w:iCs/>
+          <w:sz w:val="24"/>
+          <w:szCs w:val="24"/>
+        </w:rPr>
+        <w:t>Preguntá</w:t>
+      </w:r>
+      <w:proofErr w:type="spellEnd"/>
+      <w:r>
+        <w:rPr>
+          <w:i/>
+          <w:iCs/>
+          <w:sz w:val="24"/>
+          <w:szCs w:val="24"/>
+        </w:rPr>
+        <w:t xml:space="preserve"> “¿por qué este </w:t>
+      </w:r>
+      <w:proofErr w:type="spellStart"/>
+      <w:r>
+        <w:rPr>
+          <w:i/>
+          <w:iCs/>
+          <w:sz w:val="24"/>
+          <w:szCs w:val="24"/>
+        </w:rPr>
+        <w:t>prompt</w:t>
+      </w:r>
+      <w:proofErr w:type="spellEnd"/>
+      <w:r>
+        <w:rPr>
+          <w:i/>
+          <w:iCs/>
+          <w:sz w:val="24"/>
+          <w:szCs w:val="24"/>
+        </w:rPr>
+        <w:t xml:space="preserve"> fallaría?”</w:t>
+      </w:r>
+    </w:p>
+    <w:p>
+      <w:pPr>
+        <w:rPr>
+          <w:sz w:val="24"/>
+          <w:szCs w:val="24"/>
+        </w:rPr>
+      </w:pPr>
+      <w:r>
+        <w:rPr>
+          <w:sz w:val="24"/>
+          <w:szCs w:val="24"/>
+        </w:rPr>
+        <w:t xml:space="preserve">Si no </w:t>
+      </w:r>
+      <w:proofErr w:type="spellStart"/>
+      <w:r>
+        <w:rPr>
+          <w:sz w:val="24"/>
+          <w:szCs w:val="24"/>
+        </w:rPr>
+        <w:t>encontrás</w:t>
+      </w:r>
+      <w:proofErr w:type="spellEnd"/>
+      <w:r>
+        <w:rPr>
+          <w:sz w:val="24"/>
+          <w:szCs w:val="24"/>
+        </w:rPr>
+        <w:t xml:space="preserve"> un fallo claro → probablemente funcione.</w:t>
+      </w:r>
+    </w:p>
+    <w:p>
+      <w:pPr>
+        <w:rPr>
+          <w:b/>
+          <w:bCs/>
+          <w:sz w:val="24"/>
+          <w:szCs w:val="24"/>
+        </w:rPr>
+      </w:pPr>
+    </w:p>
+    <w:p>
+      <w:pPr>
+        <w:rPr>
+          <w:rFonts w:cstheme="minorHAnsi"/>
+          <w:b/>
+          <w:bCs/>
+          <w:sz w:val="28"/>
+          <w:szCs w:val="28"/>
+          <w:u w:val="single"/>
+        </w:rPr>
+      </w:pPr>
+      <w:r>
+        <w:rPr>
+          <w:rFonts w:cstheme="minorHAnsi"/>
+          <w:b/>
+          <w:bCs/>
+          <w:sz w:val="28"/>
+          <w:szCs w:val="28"/>
+          <w:u w:val="single"/>
+        </w:rPr>
+        <w:t xml:space="preserve">5) </w:t>
+      </w:r>
+      <w:r>
+        <w:rPr>
+          <w:rFonts w:cstheme="minorHAnsi"/>
+          <w:b/>
+          <w:bCs/>
+          <w:sz w:val="28"/>
+          <w:szCs w:val="28"/>
+          <w:u w:val="single"/>
+        </w:rPr>
+        <w:t>Regla de oro del día</w:t>
+      </w:r>
+    </w:p>
+    <w:p>
+      <w:pPr>
+        <w:rPr>
+          <w:sz w:val="24"/>
+          <w:szCs w:val="24"/>
+        </w:rPr>
+      </w:pPr>
+      <w:r>
+        <w:rPr>
+          <w:b/>
+          <w:bCs/>
+          <w:sz w:val="24"/>
+          <w:szCs w:val="24"/>
+        </w:rPr>
+        <w:t xml:space="preserve">Un </w:t>
+      </w:r>
+      <w:proofErr w:type="spellStart"/>
+      <w:r>
+        <w:rPr>
+          <w:b/>
+          <w:bCs/>
+          <w:sz w:val="24"/>
+          <w:szCs w:val="24"/>
+        </w:rPr>
+        <w:t>prompt</w:t>
+      </w:r>
+      <w:proofErr w:type="spellEnd"/>
+      <w:r>
+        <w:rPr>
+          <w:b/>
+          <w:bCs/>
+          <w:sz w:val="24"/>
+          <w:szCs w:val="24"/>
+        </w:rPr>
+        <w:t xml:space="preserve"> bueno se diseña como una función: entradas claras, salida esperada, restricciones.</w:t>
+      </w:r>
+    </w:p>
+    <w:p>
+      <w:pPr>
+        <w:rPr>
+          <w:sz w:val="24"/>
+          <w:szCs w:val="24"/>
+        </w:rPr>
+      </w:pPr>
+    </w:p>
+    <w:p>
+      <w:pPr>
+        <w:rPr>
+          <w:sz w:val="24"/>
+          <w:szCs w:val="24"/>
+        </w:rPr>
+      </w:pPr>
     </w:p>
     <w:p>
       <w:pPr>
@@ -19732,6 +21016,155 @@
     </w:lvl>
   </w:abstractNum>
   <w:abstractNum w:abstractNumId="10" w15:restartNumberingAfterBreak="0">
+    <w:nsid w:val="0FC35D71"/>
+    <w:multiLevelType w:val="multilevel"/>
+    <w:tmpl w:val="10366ED0"/>
+    <w:lvl w:ilvl="0">
+      <w:start w:val="1"/>
+      <w:numFmt w:val="bullet"/>
+      <w:lvlText w:val=""/>
+      <w:lvlJc w:val="left"/>
+      <w:pPr>
+        <w:tabs>
+          <w:tab w:val="num" w:pos="720"/>
+        </w:tabs>
+        <w:ind w:left="720" w:hanging="360"/>
+      </w:pPr>
+      <w:rPr>
+        <w:rFonts w:ascii="Symbol" w:hAnsi="Symbol" w:hint="default"/>
+        <w:sz w:val="20"/>
+      </w:rPr>
+    </w:lvl>
+    <w:lvl w:ilvl="1" w:tentative="1">
+      <w:start w:val="1"/>
+      <w:numFmt w:val="bullet"/>
+      <w:lvlText w:val="o"/>
+      <w:lvlJc w:val="left"/>
+      <w:pPr>
+        <w:tabs>
+          <w:tab w:val="num" w:pos="1440"/>
+        </w:tabs>
+        <w:ind w:left="1440" w:hanging="360"/>
+      </w:pPr>
+      <w:rPr>
+        <w:rFonts w:ascii="Courier New" w:hAnsi="Courier New" w:hint="default"/>
+        <w:sz w:val="20"/>
+      </w:rPr>
+    </w:lvl>
+    <w:lvl w:ilvl="2" w:tentative="1">
+      <w:start w:val="1"/>
+      <w:numFmt w:val="bullet"/>
+      <w:lvlText w:val=""/>
+      <w:lvlJc w:val="left"/>
+      <w:pPr>
+        <w:tabs>
+          <w:tab w:val="num" w:pos="2160"/>
+        </w:tabs>
+        <w:ind w:left="2160" w:hanging="360"/>
+      </w:pPr>
+      <w:rPr>
+        <w:rFonts w:ascii="Wingdings" w:hAnsi="Wingdings" w:hint="default"/>
+        <w:sz w:val="20"/>
+      </w:rPr>
+    </w:lvl>
+    <w:lvl w:ilvl="3" w:tentative="1">
+      <w:start w:val="1"/>
+      <w:numFmt w:val="bullet"/>
+      <w:lvlText w:val=""/>
+      <w:lvlJc w:val="left"/>
+      <w:pPr>
+        <w:tabs>
+          <w:tab w:val="num" w:pos="2880"/>
+        </w:tabs>
+        <w:ind w:left="2880" w:hanging="360"/>
+      </w:pPr>
+      <w:rPr>
+        <w:rFonts w:ascii="Wingdings" w:hAnsi="Wingdings" w:hint="default"/>
+        <w:sz w:val="20"/>
+      </w:rPr>
+    </w:lvl>
+    <w:lvl w:ilvl="4" w:tentative="1">
+      <w:start w:val="1"/>
+      <w:numFmt w:val="bullet"/>
+      <w:lvlText w:val=""/>
+      <w:lvlJc w:val="left"/>
+      <w:pPr>
+        <w:tabs>
+          <w:tab w:val="num" w:pos="3600"/>
+        </w:tabs>
+        <w:ind w:left="3600" w:hanging="360"/>
+      </w:pPr>
+      <w:rPr>
+        <w:rFonts w:ascii="Wingdings" w:hAnsi="Wingdings" w:hint="default"/>
+        <w:sz w:val="20"/>
+      </w:rPr>
+    </w:lvl>
+    <w:lvl w:ilvl="5" w:tentative="1">
+      <w:start w:val="1"/>
+      <w:numFmt w:val="bullet"/>
+      <w:lvlText w:val=""/>
+      <w:lvlJc w:val="left"/>
+      <w:pPr>
+        <w:tabs>
+          <w:tab w:val="num" w:pos="4320"/>
+        </w:tabs>
+        <w:ind w:left="4320" w:hanging="360"/>
+      </w:pPr>
+      <w:rPr>
+        <w:rFonts w:ascii="Wingdings" w:hAnsi="Wingdings" w:hint="default"/>
+        <w:sz w:val="20"/>
+      </w:rPr>
+    </w:lvl>
+    <w:lvl w:ilvl="6" w:tentative="1">
+      <w:start w:val="1"/>
+      <w:numFmt w:val="bullet"/>
+      <w:lvlText w:val=""/>
+      <w:lvlJc w:val="left"/>
+      <w:pPr>
+        <w:tabs>
+          <w:tab w:val="num" w:pos="5040"/>
+        </w:tabs>
+        <w:ind w:left="5040" w:hanging="360"/>
+      </w:pPr>
+      <w:rPr>
+        <w:rFonts w:ascii="Wingdings" w:hAnsi="Wingdings" w:hint="default"/>
+        <w:sz w:val="20"/>
+      </w:rPr>
+    </w:lvl>
+    <w:lvl w:ilvl="7" w:tentative="1">
+      <w:start w:val="1"/>
+      <w:numFmt w:val="bullet"/>
+      <w:lvlText w:val=""/>
+      <w:lvlJc w:val="left"/>
+      <w:pPr>
+        <w:tabs>
+          <w:tab w:val="num" w:pos="5760"/>
+        </w:tabs>
+        <w:ind w:left="5760" w:hanging="360"/>
+      </w:pPr>
+      <w:rPr>
+        <w:rFonts w:ascii="Wingdings" w:hAnsi="Wingdings" w:hint="default"/>
+        <w:sz w:val="20"/>
+      </w:rPr>
+    </w:lvl>
+    <w:lvl w:ilvl="8" w:tentative="1">
+      <w:start w:val="1"/>
+      <w:numFmt w:val="bullet"/>
+      <w:lvlText w:val=""/>
+      <w:lvlJc w:val="left"/>
+      <w:pPr>
+        <w:tabs>
+          <w:tab w:val="num" w:pos="6480"/>
+        </w:tabs>
+        <w:ind w:left="6480" w:hanging="360"/>
+      </w:pPr>
+      <w:rPr>
+        <w:rFonts w:ascii="Wingdings" w:hAnsi="Wingdings" w:hint="default"/>
+        <w:sz w:val="20"/>
+      </w:rPr>
+    </w:lvl>
+  </w:abstractNum>
+  <w:abstractNum w:abstractNumId="11" w15:restartNumberingAfterBreak="0">
     <w:nsid w:val="10426B02"/>
     <w:multiLevelType w:val="multilevel"/>
     <w:tmpl w:val="123CE9E8"/>
@@ -19880,7 +21313,7 @@
       </w:rPr>
     </w:lvl>
   </w:abstractNum>
-  <w:abstractNum w:abstractNumId="11" w15:restartNumberingAfterBreak="0">
+  <w:abstractNum w:abstractNumId="12" w15:restartNumberingAfterBreak="0">
     <w:nsid w:val="11187921"/>
     <w:multiLevelType w:val="multilevel"/>
     <w:tmpl w:val="4E9AF6B2"/>
@@ -20029,7 +21462,7 @@
       </w:rPr>
     </w:lvl>
   </w:abstractNum>
-  <w:abstractNum w:abstractNumId="12" w15:restartNumberingAfterBreak="0">
+  <w:abstractNum w:abstractNumId="13" w15:restartNumberingAfterBreak="0">
     <w:nsid w:val="138B6BBF"/>
     <w:multiLevelType w:val="multilevel"/>
     <w:tmpl w:val="BEBE0110"/>
@@ -20178,7 +21611,7 @@
       </w:rPr>
     </w:lvl>
   </w:abstractNum>
-  <w:abstractNum w:abstractNumId="13" w15:restartNumberingAfterBreak="0">
+  <w:abstractNum w:abstractNumId="14" w15:restartNumberingAfterBreak="0">
     <w:nsid w:val="167C5194"/>
     <w:multiLevelType w:val="multilevel"/>
     <w:tmpl w:val="DF50ACB0"/>
@@ -20327,7 +21760,7 @@
       </w:rPr>
     </w:lvl>
   </w:abstractNum>
-  <w:abstractNum w:abstractNumId="14" w15:restartNumberingAfterBreak="0">
+  <w:abstractNum w:abstractNumId="15" w15:restartNumberingAfterBreak="0">
     <w:nsid w:val="17C76DA4"/>
     <w:multiLevelType w:val="multilevel"/>
     <w:tmpl w:val="FBF44B3A"/>
@@ -20476,7 +21909,7 @@
       </w:rPr>
     </w:lvl>
   </w:abstractNum>
-  <w:abstractNum w:abstractNumId="15" w15:restartNumberingAfterBreak="0">
+  <w:abstractNum w:abstractNumId="16" w15:restartNumberingAfterBreak="0">
     <w:nsid w:val="18B3339A"/>
     <w:multiLevelType w:val="multilevel"/>
     <w:tmpl w:val="C4E62240"/>
@@ -20625,7 +22058,7 @@
       </w:rPr>
     </w:lvl>
   </w:abstractNum>
-  <w:abstractNum w:abstractNumId="16" w15:restartNumberingAfterBreak="0">
+  <w:abstractNum w:abstractNumId="17" w15:restartNumberingAfterBreak="0">
     <w:nsid w:val="1D2D785C"/>
     <w:multiLevelType w:val="multilevel"/>
     <w:tmpl w:val="83829ACE"/>
@@ -20774,7 +22207,7 @@
       </w:rPr>
     </w:lvl>
   </w:abstractNum>
-  <w:abstractNum w:abstractNumId="17" w15:restartNumberingAfterBreak="0">
+  <w:abstractNum w:abstractNumId="18" w15:restartNumberingAfterBreak="0">
     <w:nsid w:val="1D6320E2"/>
     <w:multiLevelType w:val="multilevel"/>
     <w:tmpl w:val="88F6DC20"/>
@@ -20923,7 +22356,7 @@
       </w:rPr>
     </w:lvl>
   </w:abstractNum>
-  <w:abstractNum w:abstractNumId="18" w15:restartNumberingAfterBreak="0">
+  <w:abstractNum w:abstractNumId="19" w15:restartNumberingAfterBreak="0">
     <w:nsid w:val="1EB36678"/>
     <w:multiLevelType w:val="multilevel"/>
     <w:tmpl w:val="BB02C3D0"/>
@@ -21072,7 +22505,7 @@
       </w:rPr>
     </w:lvl>
   </w:abstractNum>
-  <w:abstractNum w:abstractNumId="19" w15:restartNumberingAfterBreak="0">
+  <w:abstractNum w:abstractNumId="20" w15:restartNumberingAfterBreak="0">
     <w:nsid w:val="2137686C"/>
     <w:multiLevelType w:val="multilevel"/>
     <w:tmpl w:val="7C66CD96"/>
@@ -21221,7 +22654,7 @@
       </w:rPr>
     </w:lvl>
   </w:abstractNum>
-  <w:abstractNum w:abstractNumId="20" w15:restartNumberingAfterBreak="0">
+  <w:abstractNum w:abstractNumId="21" w15:restartNumberingAfterBreak="0">
     <w:nsid w:val="217707F6"/>
     <w:multiLevelType w:val="multilevel"/>
     <w:tmpl w:val="4B823E94"/>
@@ -21370,7 +22803,7 @@
       </w:rPr>
     </w:lvl>
   </w:abstractNum>
-  <w:abstractNum w:abstractNumId="21" w15:restartNumberingAfterBreak="0">
+  <w:abstractNum w:abstractNumId="22" w15:restartNumberingAfterBreak="0">
     <w:nsid w:val="24C842B8"/>
     <w:multiLevelType w:val="multilevel"/>
     <w:tmpl w:val="B1CA172A"/>
@@ -21519,7 +22952,7 @@
       </w:rPr>
     </w:lvl>
   </w:abstractNum>
-  <w:abstractNum w:abstractNumId="22" w15:restartNumberingAfterBreak="0">
+  <w:abstractNum w:abstractNumId="23" w15:restartNumberingAfterBreak="0">
     <w:nsid w:val="2542113C"/>
     <w:multiLevelType w:val="multilevel"/>
     <w:tmpl w:val="A2424DC2"/>
@@ -21668,7 +23101,7 @@
       </w:rPr>
     </w:lvl>
   </w:abstractNum>
-  <w:abstractNum w:abstractNumId="23" w15:restartNumberingAfterBreak="0">
+  <w:abstractNum w:abstractNumId="24" w15:restartNumberingAfterBreak="0">
     <w:nsid w:val="265E23D2"/>
     <w:multiLevelType w:val="multilevel"/>
     <w:tmpl w:val="DA74273C"/>
@@ -21817,7 +23250,7 @@
       </w:rPr>
     </w:lvl>
   </w:abstractNum>
-  <w:abstractNum w:abstractNumId="24" w15:restartNumberingAfterBreak="0">
+  <w:abstractNum w:abstractNumId="25" w15:restartNumberingAfterBreak="0">
     <w:nsid w:val="28057F2E"/>
     <w:multiLevelType w:val="multilevel"/>
     <w:tmpl w:val="BE80ADE8"/>
@@ -21966,7 +23399,7 @@
       </w:rPr>
     </w:lvl>
   </w:abstractNum>
-  <w:abstractNum w:abstractNumId="25" w15:restartNumberingAfterBreak="0">
+  <w:abstractNum w:abstractNumId="26" w15:restartNumberingAfterBreak="0">
     <w:nsid w:val="298D5242"/>
     <w:multiLevelType w:val="multilevel"/>
     <w:tmpl w:val="DDB61620"/>
@@ -22115,7 +23548,7 @@
       </w:rPr>
     </w:lvl>
   </w:abstractNum>
-  <w:abstractNum w:abstractNumId="26" w15:restartNumberingAfterBreak="0">
+  <w:abstractNum w:abstractNumId="27" w15:restartNumberingAfterBreak="0">
     <w:nsid w:val="2A7341A8"/>
     <w:multiLevelType w:val="multilevel"/>
     <w:tmpl w:val="1D50F6CA"/>
@@ -22228,7 +23661,156 @@
       </w:pPr>
     </w:lvl>
   </w:abstractNum>
-  <w:abstractNum w:abstractNumId="27" w15:restartNumberingAfterBreak="0">
+  <w:abstractNum w:abstractNumId="28" w15:restartNumberingAfterBreak="0">
+    <w:nsid w:val="2A7E5F8C"/>
+    <w:multiLevelType w:val="multilevel"/>
+    <w:tmpl w:val="7C7E8552"/>
+    <w:lvl w:ilvl="0">
+      <w:start w:val="1"/>
+      <w:numFmt w:val="bullet"/>
+      <w:lvlText w:val=""/>
+      <w:lvlJc w:val="left"/>
+      <w:pPr>
+        <w:tabs>
+          <w:tab w:val="num" w:pos="720"/>
+        </w:tabs>
+        <w:ind w:left="720" w:hanging="360"/>
+      </w:pPr>
+      <w:rPr>
+        <w:rFonts w:ascii="Symbol" w:hAnsi="Symbol" w:hint="default"/>
+        <w:sz w:val="20"/>
+      </w:rPr>
+    </w:lvl>
+    <w:lvl w:ilvl="1" w:tentative="1">
+      <w:start w:val="1"/>
+      <w:numFmt w:val="bullet"/>
+      <w:lvlText w:val="o"/>
+      <w:lvlJc w:val="left"/>
+      <w:pPr>
+        <w:tabs>
+          <w:tab w:val="num" w:pos="1440"/>
+        </w:tabs>
+        <w:ind w:left="1440" w:hanging="360"/>
+      </w:pPr>
+      <w:rPr>
+        <w:rFonts w:ascii="Courier New" w:hAnsi="Courier New" w:hint="default"/>
+        <w:sz w:val="20"/>
+      </w:rPr>
+    </w:lvl>
+    <w:lvl w:ilvl="2" w:tentative="1">
+      <w:start w:val="1"/>
+      <w:numFmt w:val="bullet"/>
+      <w:lvlText w:val=""/>
+      <w:lvlJc w:val="left"/>
+      <w:pPr>
+        <w:tabs>
+          <w:tab w:val="num" w:pos="2160"/>
+        </w:tabs>
+        <w:ind w:left="2160" w:hanging="360"/>
+      </w:pPr>
+      <w:rPr>
+        <w:rFonts w:ascii="Wingdings" w:hAnsi="Wingdings" w:hint="default"/>
+        <w:sz w:val="20"/>
+      </w:rPr>
+    </w:lvl>
+    <w:lvl w:ilvl="3" w:tentative="1">
+      <w:start w:val="1"/>
+      <w:numFmt w:val="bullet"/>
+      <w:lvlText w:val=""/>
+      <w:lvlJc w:val="left"/>
+      <w:pPr>
+        <w:tabs>
+          <w:tab w:val="num" w:pos="2880"/>
+        </w:tabs>
+        <w:ind w:left="2880" w:hanging="360"/>
+      </w:pPr>
+      <w:rPr>
+        <w:rFonts w:ascii="Wingdings" w:hAnsi="Wingdings" w:hint="default"/>
+        <w:sz w:val="20"/>
+      </w:rPr>
+    </w:lvl>
+    <w:lvl w:ilvl="4" w:tentative="1">
+      <w:start w:val="1"/>
+      <w:numFmt w:val="bullet"/>
+      <w:lvlText w:val=""/>
+      <w:lvlJc w:val="left"/>
+      <w:pPr>
+        <w:tabs>
+          <w:tab w:val="num" w:pos="3600"/>
+        </w:tabs>
+        <w:ind w:left="3600" w:hanging="360"/>
+      </w:pPr>
+      <w:rPr>
+        <w:rFonts w:ascii="Wingdings" w:hAnsi="Wingdings" w:hint="default"/>
+        <w:sz w:val="20"/>
+      </w:rPr>
+    </w:lvl>
+    <w:lvl w:ilvl="5" w:tentative="1">
+      <w:start w:val="1"/>
+      <w:numFmt w:val="bullet"/>
+      <w:lvlText w:val=""/>
+      <w:lvlJc w:val="left"/>
+      <w:pPr>
+        <w:tabs>
+          <w:tab w:val="num" w:pos="4320"/>
+        </w:tabs>
+        <w:ind w:left="4320" w:hanging="360"/>
+      </w:pPr>
+      <w:rPr>
+        <w:rFonts w:ascii="Wingdings" w:hAnsi="Wingdings" w:hint="default"/>
+        <w:sz w:val="20"/>
+      </w:rPr>
+    </w:lvl>
+    <w:lvl w:ilvl="6" w:tentative="1">
+      <w:start w:val="1"/>
+      <w:numFmt w:val="bullet"/>
+      <w:lvlText w:val=""/>
+      <w:lvlJc w:val="left"/>
+      <w:pPr>
+        <w:tabs>
+          <w:tab w:val="num" w:pos="5040"/>
+        </w:tabs>
+        <w:ind w:left="5040" w:hanging="360"/>
+      </w:pPr>
+      <w:rPr>
+        <w:rFonts w:ascii="Wingdings" w:hAnsi="Wingdings" w:hint="default"/>
+        <w:sz w:val="20"/>
+      </w:rPr>
+    </w:lvl>
+    <w:lvl w:ilvl="7" w:tentative="1">
+      <w:start w:val="1"/>
+      <w:numFmt w:val="bullet"/>
+      <w:lvlText w:val=""/>
+      <w:lvlJc w:val="left"/>
+      <w:pPr>
+        <w:tabs>
+          <w:tab w:val="num" w:pos="5760"/>
+        </w:tabs>
+        <w:ind w:left="5760" w:hanging="360"/>
+      </w:pPr>
+      <w:rPr>
+        <w:rFonts w:ascii="Wingdings" w:hAnsi="Wingdings" w:hint="default"/>
+        <w:sz w:val="20"/>
+      </w:rPr>
+    </w:lvl>
+    <w:lvl w:ilvl="8" w:tentative="1">
+      <w:start w:val="1"/>
+      <w:numFmt w:val="bullet"/>
+      <w:lvlText w:val=""/>
+      <w:lvlJc w:val="left"/>
+      <w:pPr>
+        <w:tabs>
+          <w:tab w:val="num" w:pos="6480"/>
+        </w:tabs>
+        <w:ind w:left="6480" w:hanging="360"/>
+      </w:pPr>
+      <w:rPr>
+        <w:rFonts w:ascii="Wingdings" w:hAnsi="Wingdings" w:hint="default"/>
+        <w:sz w:val="20"/>
+      </w:rPr>
+    </w:lvl>
+  </w:abstractNum>
+  <w:abstractNum w:abstractNumId="29" w15:restartNumberingAfterBreak="0">
     <w:nsid w:val="2BC71C94"/>
     <w:multiLevelType w:val="multilevel"/>
     <w:tmpl w:val="0CD0CDC4"/>
@@ -22341,7 +23923,7 @@
       </w:pPr>
     </w:lvl>
   </w:abstractNum>
-  <w:abstractNum w:abstractNumId="28" w15:restartNumberingAfterBreak="0">
+  <w:abstractNum w:abstractNumId="30" w15:restartNumberingAfterBreak="0">
     <w:nsid w:val="2D4F64BA"/>
     <w:multiLevelType w:val="multilevel"/>
     <w:tmpl w:val="F9FCEDD0"/>
@@ -22490,7 +24072,7 @@
       </w:rPr>
     </w:lvl>
   </w:abstractNum>
-  <w:abstractNum w:abstractNumId="29" w15:restartNumberingAfterBreak="0">
+  <w:abstractNum w:abstractNumId="31" w15:restartNumberingAfterBreak="0">
     <w:nsid w:val="2E7B68D2"/>
     <w:multiLevelType w:val="multilevel"/>
     <w:tmpl w:val="312E31B8"/>
@@ -22639,7 +24221,7 @@
       </w:rPr>
     </w:lvl>
   </w:abstractNum>
-  <w:abstractNum w:abstractNumId="30" w15:restartNumberingAfterBreak="0">
+  <w:abstractNum w:abstractNumId="32" w15:restartNumberingAfterBreak="0">
     <w:nsid w:val="2F477ED3"/>
     <w:multiLevelType w:val="multilevel"/>
     <w:tmpl w:val="4B926E2E"/>
@@ -22788,7 +24370,7 @@
       </w:rPr>
     </w:lvl>
   </w:abstractNum>
-  <w:abstractNum w:abstractNumId="31" w15:restartNumberingAfterBreak="0">
+  <w:abstractNum w:abstractNumId="33" w15:restartNumberingAfterBreak="0">
     <w:nsid w:val="32552313"/>
     <w:multiLevelType w:val="multilevel"/>
     <w:tmpl w:val="7BD2B8A6"/>
@@ -22937,7 +24519,7 @@
       </w:rPr>
     </w:lvl>
   </w:abstractNum>
-  <w:abstractNum w:abstractNumId="32" w15:restartNumberingAfterBreak="0">
+  <w:abstractNum w:abstractNumId="34" w15:restartNumberingAfterBreak="0">
     <w:nsid w:val="366578BD"/>
     <w:multiLevelType w:val="multilevel"/>
     <w:tmpl w:val="74BE2DAC"/>
@@ -23086,7 +24668,7 @@
       </w:rPr>
     </w:lvl>
   </w:abstractNum>
-  <w:abstractNum w:abstractNumId="33" w15:restartNumberingAfterBreak="0">
+  <w:abstractNum w:abstractNumId="35" w15:restartNumberingAfterBreak="0">
     <w:nsid w:val="37683FBC"/>
     <w:multiLevelType w:val="multilevel"/>
     <w:tmpl w:val="8A2E738C"/>
@@ -23235,7 +24817,7 @@
       </w:rPr>
     </w:lvl>
   </w:abstractNum>
-  <w:abstractNum w:abstractNumId="34" w15:restartNumberingAfterBreak="0">
+  <w:abstractNum w:abstractNumId="36" w15:restartNumberingAfterBreak="0">
     <w:nsid w:val="3CFB2700"/>
     <w:multiLevelType w:val="multilevel"/>
     <w:tmpl w:val="AE72B9AA"/>
@@ -23384,7 +24966,7 @@
       </w:rPr>
     </w:lvl>
   </w:abstractNum>
-  <w:abstractNum w:abstractNumId="35" w15:restartNumberingAfterBreak="0">
+  <w:abstractNum w:abstractNumId="37" w15:restartNumberingAfterBreak="0">
     <w:nsid w:val="440D7BF5"/>
     <w:multiLevelType w:val="multilevel"/>
     <w:tmpl w:val="7368F55A"/>
@@ -23533,7 +25115,7 @@
       </w:rPr>
     </w:lvl>
   </w:abstractNum>
-  <w:abstractNum w:abstractNumId="36" w15:restartNumberingAfterBreak="0">
+  <w:abstractNum w:abstractNumId="38" w15:restartNumberingAfterBreak="0">
     <w:nsid w:val="450F0971"/>
     <w:multiLevelType w:val="multilevel"/>
     <w:tmpl w:val="D95E8346"/>
@@ -23646,7 +25228,7 @@
       </w:pPr>
     </w:lvl>
   </w:abstractNum>
-  <w:abstractNum w:abstractNumId="37" w15:restartNumberingAfterBreak="0">
+  <w:abstractNum w:abstractNumId="39" w15:restartNumberingAfterBreak="0">
     <w:nsid w:val="47293482"/>
     <w:multiLevelType w:val="multilevel"/>
     <w:tmpl w:val="282EBE86"/>
@@ -23795,7 +25377,7 @@
       </w:rPr>
     </w:lvl>
   </w:abstractNum>
-  <w:abstractNum w:abstractNumId="38" w15:restartNumberingAfterBreak="0">
+  <w:abstractNum w:abstractNumId="40" w15:restartNumberingAfterBreak="0">
     <w:nsid w:val="486E6382"/>
     <w:multiLevelType w:val="multilevel"/>
     <w:tmpl w:val="82F0D3DE"/>
@@ -23944,7 +25526,120 @@
       </w:rPr>
     </w:lvl>
   </w:abstractNum>
-  <w:abstractNum w:abstractNumId="39" w15:restartNumberingAfterBreak="0">
+  <w:abstractNum w:abstractNumId="41" w15:restartNumberingAfterBreak="0">
+    <w:nsid w:val="4AAB57A3"/>
+    <w:multiLevelType w:val="multilevel"/>
+    <w:tmpl w:val="BD6E96D0"/>
+    <w:lvl w:ilvl="0">
+      <w:start w:val="1"/>
+      <w:numFmt w:val="decimal"/>
+      <w:lvlText w:val="%1."/>
+      <w:lvlJc w:val="left"/>
+      <w:pPr>
+        <w:tabs>
+          <w:tab w:val="num" w:pos="720"/>
+        </w:tabs>
+        <w:ind w:left="720" w:hanging="360"/>
+      </w:pPr>
+    </w:lvl>
+    <w:lvl w:ilvl="1" w:tentative="1">
+      <w:start w:val="1"/>
+      <w:numFmt w:val="decimal"/>
+      <w:lvlText w:val="%2."/>
+      <w:lvlJc w:val="left"/>
+      <w:pPr>
+        <w:tabs>
+          <w:tab w:val="num" w:pos="1440"/>
+        </w:tabs>
+        <w:ind w:left="1440" w:hanging="360"/>
+      </w:pPr>
+    </w:lvl>
+    <w:lvl w:ilvl="2" w:tentative="1">
+      <w:start w:val="1"/>
+      <w:numFmt w:val="decimal"/>
+      <w:lvlText w:val="%3."/>
+      <w:lvlJc w:val="left"/>
+      <w:pPr>
+        <w:tabs>
+          <w:tab w:val="num" w:pos="2160"/>
+        </w:tabs>
+        <w:ind w:left="2160" w:hanging="360"/>
+      </w:pPr>
+    </w:lvl>
+    <w:lvl w:ilvl="3" w:tentative="1">
+      <w:start w:val="1"/>
+      <w:numFmt w:val="decimal"/>
+      <w:lvlText w:val="%4."/>
+      <w:lvlJc w:val="left"/>
+      <w:pPr>
+        <w:tabs>
+          <w:tab w:val="num" w:pos="2880"/>
+        </w:tabs>
+        <w:ind w:left="2880" w:hanging="360"/>
+      </w:pPr>
+    </w:lvl>
+    <w:lvl w:ilvl="4" w:tentative="1">
+      <w:start w:val="1"/>
+      <w:numFmt w:val="decimal"/>
+      <w:lvlText w:val="%5."/>
+      <w:lvlJc w:val="left"/>
+      <w:pPr>
+        <w:tabs>
+          <w:tab w:val="num" w:pos="3600"/>
+        </w:tabs>
+        <w:ind w:left="3600" w:hanging="360"/>
+      </w:pPr>
+    </w:lvl>
+    <w:lvl w:ilvl="5" w:tentative="1">
+      <w:start w:val="1"/>
+      <w:numFmt w:val="decimal"/>
+      <w:lvlText w:val="%6."/>
+      <w:lvlJc w:val="left"/>
+      <w:pPr>
+        <w:tabs>
+          <w:tab w:val="num" w:pos="4320"/>
+        </w:tabs>
+        <w:ind w:left="4320" w:hanging="360"/>
+      </w:pPr>
+    </w:lvl>
+    <w:lvl w:ilvl="6" w:tentative="1">
+      <w:start w:val="1"/>
+      <w:numFmt w:val="decimal"/>
+      <w:lvlText w:val="%7."/>
+      <w:lvlJc w:val="left"/>
+      <w:pPr>
+        <w:tabs>
+          <w:tab w:val="num" w:pos="5040"/>
+        </w:tabs>
+        <w:ind w:left="5040" w:hanging="360"/>
+      </w:pPr>
+    </w:lvl>
+    <w:lvl w:ilvl="7" w:tentative="1">
+      <w:start w:val="1"/>
+      <w:numFmt w:val="decimal"/>
+      <w:lvlText w:val="%8."/>
+      <w:lvlJc w:val="left"/>
+      <w:pPr>
+        <w:tabs>
+          <w:tab w:val="num" w:pos="5760"/>
+        </w:tabs>
+        <w:ind w:left="5760" w:hanging="360"/>
+      </w:pPr>
+    </w:lvl>
+    <w:lvl w:ilvl="8" w:tentative="1">
+      <w:start w:val="1"/>
+      <w:numFmt w:val="decimal"/>
+      <w:lvlText w:val="%9."/>
+      <w:lvlJc w:val="left"/>
+      <w:pPr>
+        <w:tabs>
+          <w:tab w:val="num" w:pos="6480"/>
+        </w:tabs>
+        <w:ind w:left="6480" w:hanging="360"/>
+      </w:pPr>
+    </w:lvl>
+  </w:abstractNum>
+  <w:abstractNum w:abstractNumId="42" w15:restartNumberingAfterBreak="0">
     <w:nsid w:val="4BC7444A"/>
     <w:multiLevelType w:val="multilevel"/>
     <w:tmpl w:val="31B8B070"/>
@@ -24057,7 +25752,7 @@
       </w:pPr>
     </w:lvl>
   </w:abstractNum>
-  <w:abstractNum w:abstractNumId="40" w15:restartNumberingAfterBreak="0">
+  <w:abstractNum w:abstractNumId="43" w15:restartNumberingAfterBreak="0">
     <w:nsid w:val="4D587FF7"/>
     <w:multiLevelType w:val="multilevel"/>
     <w:tmpl w:val="048CBED2"/>
@@ -24206,7 +25901,7 @@
       </w:rPr>
     </w:lvl>
   </w:abstractNum>
-  <w:abstractNum w:abstractNumId="41" w15:restartNumberingAfterBreak="0">
+  <w:abstractNum w:abstractNumId="44" w15:restartNumberingAfterBreak="0">
     <w:nsid w:val="4F122FAD"/>
     <w:multiLevelType w:val="multilevel"/>
     <w:tmpl w:val="5C3C0782"/>
@@ -24355,7 +26050,7 @@
       </w:rPr>
     </w:lvl>
   </w:abstractNum>
-  <w:abstractNum w:abstractNumId="42" w15:restartNumberingAfterBreak="0">
+  <w:abstractNum w:abstractNumId="45" w15:restartNumberingAfterBreak="0">
     <w:nsid w:val="4F74506C"/>
     <w:multiLevelType w:val="multilevel"/>
     <w:tmpl w:val="F926BD64"/>
@@ -24504,7 +26199,7 @@
       </w:rPr>
     </w:lvl>
   </w:abstractNum>
-  <w:abstractNum w:abstractNumId="43" w15:restartNumberingAfterBreak="0">
+  <w:abstractNum w:abstractNumId="46" w15:restartNumberingAfterBreak="0">
     <w:nsid w:val="4FF76D4D"/>
     <w:multiLevelType w:val="multilevel"/>
     <w:tmpl w:val="EF564CCC"/>
@@ -24653,7 +26348,7 @@
       </w:rPr>
     </w:lvl>
   </w:abstractNum>
-  <w:abstractNum w:abstractNumId="44" w15:restartNumberingAfterBreak="0">
+  <w:abstractNum w:abstractNumId="47" w15:restartNumberingAfterBreak="0">
     <w:nsid w:val="55195B36"/>
     <w:multiLevelType w:val="multilevel"/>
     <w:tmpl w:val="E1A2BFAA"/>
@@ -24802,7 +26497,7 @@
       </w:rPr>
     </w:lvl>
   </w:abstractNum>
-  <w:abstractNum w:abstractNumId="45" w15:restartNumberingAfterBreak="0">
+  <w:abstractNum w:abstractNumId="48" w15:restartNumberingAfterBreak="0">
     <w:nsid w:val="5790046C"/>
     <w:multiLevelType w:val="multilevel"/>
     <w:tmpl w:val="93E40112"/>
@@ -24951,7 +26646,7 @@
       </w:rPr>
     </w:lvl>
   </w:abstractNum>
-  <w:abstractNum w:abstractNumId="46" w15:restartNumberingAfterBreak="0">
+  <w:abstractNum w:abstractNumId="49" w15:restartNumberingAfterBreak="0">
     <w:nsid w:val="58B153C9"/>
     <w:multiLevelType w:val="multilevel"/>
     <w:tmpl w:val="252C7668"/>
@@ -25100,7 +26795,7 @@
       </w:rPr>
     </w:lvl>
   </w:abstractNum>
-  <w:abstractNum w:abstractNumId="47" w15:restartNumberingAfterBreak="0">
+  <w:abstractNum w:abstractNumId="50" w15:restartNumberingAfterBreak="0">
     <w:nsid w:val="59920B80"/>
     <w:multiLevelType w:val="multilevel"/>
     <w:tmpl w:val="CAEEC91C"/>
@@ -25249,7 +26944,7 @@
       </w:rPr>
     </w:lvl>
   </w:abstractNum>
-  <w:abstractNum w:abstractNumId="48" w15:restartNumberingAfterBreak="0">
+  <w:abstractNum w:abstractNumId="51" w15:restartNumberingAfterBreak="0">
     <w:nsid w:val="5CEE5633"/>
     <w:multiLevelType w:val="multilevel"/>
     <w:tmpl w:val="31A87A12"/>
@@ -25398,7 +27093,7 @@
       </w:rPr>
     </w:lvl>
   </w:abstractNum>
-  <w:abstractNum w:abstractNumId="49" w15:restartNumberingAfterBreak="0">
+  <w:abstractNum w:abstractNumId="52" w15:restartNumberingAfterBreak="0">
     <w:nsid w:val="60515595"/>
     <w:multiLevelType w:val="multilevel"/>
     <w:tmpl w:val="DCF40022"/>
@@ -25547,7 +27242,7 @@
       </w:rPr>
     </w:lvl>
   </w:abstractNum>
-  <w:abstractNum w:abstractNumId="50" w15:restartNumberingAfterBreak="0">
+  <w:abstractNum w:abstractNumId="53" w15:restartNumberingAfterBreak="0">
     <w:nsid w:val="6054548D"/>
     <w:multiLevelType w:val="multilevel"/>
     <w:tmpl w:val="E44A80FC"/>
@@ -25696,7 +27391,7 @@
       </w:rPr>
     </w:lvl>
   </w:abstractNum>
-  <w:abstractNum w:abstractNumId="51" w15:restartNumberingAfterBreak="0">
+  <w:abstractNum w:abstractNumId="54" w15:restartNumberingAfterBreak="0">
     <w:nsid w:val="624F29C0"/>
     <w:multiLevelType w:val="multilevel"/>
     <w:tmpl w:val="DB3E99E0"/>
@@ -25845,7 +27540,7 @@
       </w:rPr>
     </w:lvl>
   </w:abstractNum>
-  <w:abstractNum w:abstractNumId="52" w15:restartNumberingAfterBreak="0">
+  <w:abstractNum w:abstractNumId="55" w15:restartNumberingAfterBreak="0">
     <w:nsid w:val="64A96BF0"/>
     <w:multiLevelType w:val="multilevel"/>
     <w:tmpl w:val="616A9796"/>
@@ -25994,7 +27689,7 @@
       </w:rPr>
     </w:lvl>
   </w:abstractNum>
-  <w:abstractNum w:abstractNumId="53" w15:restartNumberingAfterBreak="0">
+  <w:abstractNum w:abstractNumId="56" w15:restartNumberingAfterBreak="0">
     <w:nsid w:val="65262688"/>
     <w:multiLevelType w:val="multilevel"/>
     <w:tmpl w:val="BC36EB62"/>
@@ -26143,7 +27838,7 @@
       </w:rPr>
     </w:lvl>
   </w:abstractNum>
-  <w:abstractNum w:abstractNumId="54" w15:restartNumberingAfterBreak="0">
+  <w:abstractNum w:abstractNumId="57" w15:restartNumberingAfterBreak="0">
     <w:nsid w:val="65EC5CC2"/>
     <w:multiLevelType w:val="multilevel"/>
     <w:tmpl w:val="893C257A"/>
@@ -26292,7 +27987,7 @@
       </w:rPr>
     </w:lvl>
   </w:abstractNum>
-  <w:abstractNum w:abstractNumId="55" w15:restartNumberingAfterBreak="0">
+  <w:abstractNum w:abstractNumId="58" w15:restartNumberingAfterBreak="0">
     <w:nsid w:val="667A1272"/>
     <w:multiLevelType w:val="multilevel"/>
     <w:tmpl w:val="8E54D8B0"/>
@@ -26441,7 +28136,120 @@
       </w:rPr>
     </w:lvl>
   </w:abstractNum>
-  <w:abstractNum w:abstractNumId="56" w15:restartNumberingAfterBreak="0">
+  <w:abstractNum w:abstractNumId="59" w15:restartNumberingAfterBreak="0">
+    <w:nsid w:val="66E40EE2"/>
+    <w:multiLevelType w:val="multilevel"/>
+    <w:tmpl w:val="45E02A0E"/>
+    <w:lvl w:ilvl="0">
+      <w:start w:val="1"/>
+      <w:numFmt w:val="decimal"/>
+      <w:lvlText w:val="%1."/>
+      <w:lvlJc w:val="left"/>
+      <w:pPr>
+        <w:tabs>
+          <w:tab w:val="num" w:pos="720"/>
+        </w:tabs>
+        <w:ind w:left="720" w:hanging="360"/>
+      </w:pPr>
+    </w:lvl>
+    <w:lvl w:ilvl="1" w:tentative="1">
+      <w:start w:val="1"/>
+      <w:numFmt w:val="decimal"/>
+      <w:lvlText w:val="%2."/>
+      <w:lvlJc w:val="left"/>
+      <w:pPr>
+        <w:tabs>
+          <w:tab w:val="num" w:pos="1440"/>
+        </w:tabs>
+        <w:ind w:left="1440" w:hanging="360"/>
+      </w:pPr>
+    </w:lvl>
+    <w:lvl w:ilvl="2" w:tentative="1">
+      <w:start w:val="1"/>
+      <w:numFmt w:val="decimal"/>
+      <w:lvlText w:val="%3."/>
+      <w:lvlJc w:val="left"/>
+      <w:pPr>
+        <w:tabs>
+          <w:tab w:val="num" w:pos="2160"/>
+        </w:tabs>
+        <w:ind w:left="2160" w:hanging="360"/>
+      </w:pPr>
+    </w:lvl>
+    <w:lvl w:ilvl="3" w:tentative="1">
+      <w:start w:val="1"/>
+      <w:numFmt w:val="decimal"/>
+      <w:lvlText w:val="%4."/>
+      <w:lvlJc w:val="left"/>
+      <w:pPr>
+        <w:tabs>
+          <w:tab w:val="num" w:pos="2880"/>
+        </w:tabs>
+        <w:ind w:left="2880" w:hanging="360"/>
+      </w:pPr>
+    </w:lvl>
+    <w:lvl w:ilvl="4" w:tentative="1">
+      <w:start w:val="1"/>
+      <w:numFmt w:val="decimal"/>
+      <w:lvlText w:val="%5."/>
+      <w:lvlJc w:val="left"/>
+      <w:pPr>
+        <w:tabs>
+          <w:tab w:val="num" w:pos="3600"/>
+        </w:tabs>
+        <w:ind w:left="3600" w:hanging="360"/>
+      </w:pPr>
+    </w:lvl>
+    <w:lvl w:ilvl="5" w:tentative="1">
+      <w:start w:val="1"/>
+      <w:numFmt w:val="decimal"/>
+      <w:lvlText w:val="%6."/>
+      <w:lvlJc w:val="left"/>
+      <w:pPr>
+        <w:tabs>
+          <w:tab w:val="num" w:pos="4320"/>
+        </w:tabs>
+        <w:ind w:left="4320" w:hanging="360"/>
+      </w:pPr>
+    </w:lvl>
+    <w:lvl w:ilvl="6" w:tentative="1">
+      <w:start w:val="1"/>
+      <w:numFmt w:val="decimal"/>
+      <w:lvlText w:val="%7."/>
+      <w:lvlJc w:val="left"/>
+      <w:pPr>
+        <w:tabs>
+          <w:tab w:val="num" w:pos="5040"/>
+        </w:tabs>
+        <w:ind w:left="5040" w:hanging="360"/>
+      </w:pPr>
+    </w:lvl>
+    <w:lvl w:ilvl="7" w:tentative="1">
+      <w:start w:val="1"/>
+      <w:numFmt w:val="decimal"/>
+      <w:lvlText w:val="%8."/>
+      <w:lvlJc w:val="left"/>
+      <w:pPr>
+        <w:tabs>
+          <w:tab w:val="num" w:pos="5760"/>
+        </w:tabs>
+        <w:ind w:left="5760" w:hanging="360"/>
+      </w:pPr>
+    </w:lvl>
+    <w:lvl w:ilvl="8" w:tentative="1">
+      <w:start w:val="1"/>
+      <w:numFmt w:val="decimal"/>
+      <w:lvlText w:val="%9."/>
+      <w:lvlJc w:val="left"/>
+      <w:pPr>
+        <w:tabs>
+          <w:tab w:val="num" w:pos="6480"/>
+        </w:tabs>
+        <w:ind w:left="6480" w:hanging="360"/>
+      </w:pPr>
+    </w:lvl>
+  </w:abstractNum>
+  <w:abstractNum w:abstractNumId="60" w15:restartNumberingAfterBreak="0">
     <w:nsid w:val="671E3CDC"/>
     <w:multiLevelType w:val="multilevel"/>
     <w:tmpl w:val="028046DA"/>
@@ -26590,7 +28398,7 @@
       </w:rPr>
     </w:lvl>
   </w:abstractNum>
-  <w:abstractNum w:abstractNumId="57" w15:restartNumberingAfterBreak="0">
+  <w:abstractNum w:abstractNumId="61" w15:restartNumberingAfterBreak="0">
     <w:nsid w:val="6820659B"/>
     <w:multiLevelType w:val="multilevel"/>
     <w:tmpl w:val="5C442948"/>
@@ -26739,7 +28547,7 @@
       </w:rPr>
     </w:lvl>
   </w:abstractNum>
-  <w:abstractNum w:abstractNumId="58" w15:restartNumberingAfterBreak="0">
+  <w:abstractNum w:abstractNumId="62" w15:restartNumberingAfterBreak="0">
     <w:nsid w:val="6B6B3C47"/>
     <w:multiLevelType w:val="multilevel"/>
     <w:tmpl w:val="40A689D0"/>
@@ -26888,7 +28696,7 @@
       </w:rPr>
     </w:lvl>
   </w:abstractNum>
-  <w:abstractNum w:abstractNumId="59" w15:restartNumberingAfterBreak="0">
+  <w:abstractNum w:abstractNumId="63" w15:restartNumberingAfterBreak="0">
     <w:nsid w:val="6B8467BF"/>
     <w:multiLevelType w:val="multilevel"/>
     <w:tmpl w:val="8BFE2B86"/>
@@ -27037,7 +28845,7 @@
       </w:rPr>
     </w:lvl>
   </w:abstractNum>
-  <w:abstractNum w:abstractNumId="60" w15:restartNumberingAfterBreak="0">
+  <w:abstractNum w:abstractNumId="64" w15:restartNumberingAfterBreak="0">
     <w:nsid w:val="6BF5601B"/>
     <w:multiLevelType w:val="multilevel"/>
     <w:tmpl w:val="61EAC5BC"/>
@@ -27186,7 +28994,7 @@
       </w:rPr>
     </w:lvl>
   </w:abstractNum>
-  <w:abstractNum w:abstractNumId="61" w15:restartNumberingAfterBreak="0">
+  <w:abstractNum w:abstractNumId="65" w15:restartNumberingAfterBreak="0">
     <w:nsid w:val="6C2E01F6"/>
     <w:multiLevelType w:val="multilevel"/>
     <w:tmpl w:val="D44C1F9C"/>
@@ -27335,7 +29143,7 @@
       </w:rPr>
     </w:lvl>
   </w:abstractNum>
-  <w:abstractNum w:abstractNumId="62" w15:restartNumberingAfterBreak="0">
+  <w:abstractNum w:abstractNumId="66" w15:restartNumberingAfterBreak="0">
     <w:nsid w:val="6D790680"/>
     <w:multiLevelType w:val="multilevel"/>
     <w:tmpl w:val="003C3B4E"/>
@@ -27484,7 +29292,7 @@
       </w:rPr>
     </w:lvl>
   </w:abstractNum>
-  <w:abstractNum w:abstractNumId="63" w15:restartNumberingAfterBreak="0">
+  <w:abstractNum w:abstractNumId="67" w15:restartNumberingAfterBreak="0">
     <w:nsid w:val="7013591C"/>
     <w:multiLevelType w:val="multilevel"/>
     <w:tmpl w:val="BC1650B8"/>
@@ -27633,7 +29441,7 @@
       </w:rPr>
     </w:lvl>
   </w:abstractNum>
-  <w:abstractNum w:abstractNumId="64" w15:restartNumberingAfterBreak="0">
+  <w:abstractNum w:abstractNumId="68" w15:restartNumberingAfterBreak="0">
     <w:nsid w:val="70860B6B"/>
     <w:multiLevelType w:val="multilevel"/>
     <w:tmpl w:val="6194F3F0"/>
@@ -27750,7 +29558,7 @@
       </w:pPr>
     </w:lvl>
   </w:abstractNum>
-  <w:abstractNum w:abstractNumId="65" w15:restartNumberingAfterBreak="0">
+  <w:abstractNum w:abstractNumId="69" w15:restartNumberingAfterBreak="0">
     <w:nsid w:val="72090254"/>
     <w:multiLevelType w:val="multilevel"/>
     <w:tmpl w:val="042678B8"/>
@@ -27899,7 +29707,7 @@
       </w:rPr>
     </w:lvl>
   </w:abstractNum>
-  <w:abstractNum w:abstractNumId="66" w15:restartNumberingAfterBreak="0">
+  <w:abstractNum w:abstractNumId="70" w15:restartNumberingAfterBreak="0">
     <w:nsid w:val="723227B4"/>
     <w:multiLevelType w:val="multilevel"/>
     <w:tmpl w:val="C5FE236A"/>
@@ -28048,7 +29856,7 @@
       </w:rPr>
     </w:lvl>
   </w:abstractNum>
-  <w:abstractNum w:abstractNumId="67" w15:restartNumberingAfterBreak="0">
+  <w:abstractNum w:abstractNumId="71" w15:restartNumberingAfterBreak="0">
     <w:nsid w:val="7408298D"/>
     <w:multiLevelType w:val="multilevel"/>
     <w:tmpl w:val="5BC61B9C"/>
@@ -28197,7 +30005,7 @@
       </w:rPr>
     </w:lvl>
   </w:abstractNum>
-  <w:abstractNum w:abstractNumId="68" w15:restartNumberingAfterBreak="0">
+  <w:abstractNum w:abstractNumId="72" w15:restartNumberingAfterBreak="0">
     <w:nsid w:val="75092643"/>
     <w:multiLevelType w:val="multilevel"/>
     <w:tmpl w:val="1D1AAFBC"/>
@@ -28346,7 +30154,7 @@
       </w:rPr>
     </w:lvl>
   </w:abstractNum>
-  <w:abstractNum w:abstractNumId="69" w15:restartNumberingAfterBreak="0">
+  <w:abstractNum w:abstractNumId="73" w15:restartNumberingAfterBreak="0">
     <w:nsid w:val="75840870"/>
     <w:multiLevelType w:val="multilevel"/>
     <w:tmpl w:val="D93437E6"/>
@@ -28459,7 +30267,7 @@
       </w:pPr>
     </w:lvl>
   </w:abstractNum>
-  <w:abstractNum w:abstractNumId="70" w15:restartNumberingAfterBreak="0">
+  <w:abstractNum w:abstractNumId="74" w15:restartNumberingAfterBreak="0">
     <w:nsid w:val="77F8377D"/>
     <w:multiLevelType w:val="multilevel"/>
     <w:tmpl w:val="E4426A14"/>
@@ -28608,7 +30416,7 @@
       </w:rPr>
     </w:lvl>
   </w:abstractNum>
-  <w:abstractNum w:abstractNumId="71" w15:restartNumberingAfterBreak="0">
+  <w:abstractNum w:abstractNumId="75" w15:restartNumberingAfterBreak="0">
     <w:nsid w:val="77FE2288"/>
     <w:multiLevelType w:val="multilevel"/>
     <w:tmpl w:val="FF1C6178"/>
@@ -28757,7 +30565,7 @@
       </w:rPr>
     </w:lvl>
   </w:abstractNum>
-  <w:abstractNum w:abstractNumId="72" w15:restartNumberingAfterBreak="0">
+  <w:abstractNum w:abstractNumId="76" w15:restartNumberingAfterBreak="0">
     <w:nsid w:val="78ED7E58"/>
     <w:multiLevelType w:val="multilevel"/>
     <w:tmpl w:val="A28679B2"/>
@@ -28906,7 +30714,7 @@
       </w:rPr>
     </w:lvl>
   </w:abstractNum>
-  <w:abstractNum w:abstractNumId="73" w15:restartNumberingAfterBreak="0">
+  <w:abstractNum w:abstractNumId="77" w15:restartNumberingAfterBreak="0">
     <w:nsid w:val="795C0163"/>
     <w:multiLevelType w:val="multilevel"/>
     <w:tmpl w:val="E77058C4"/>
@@ -29055,7 +30863,7 @@
       </w:rPr>
     </w:lvl>
   </w:abstractNum>
-  <w:abstractNum w:abstractNumId="74" w15:restartNumberingAfterBreak="0">
+  <w:abstractNum w:abstractNumId="78" w15:restartNumberingAfterBreak="0">
     <w:nsid w:val="7D212188"/>
     <w:multiLevelType w:val="multilevel"/>
     <w:tmpl w:val="379CEEA4"/>
@@ -29204,7 +31012,7 @@
       </w:rPr>
     </w:lvl>
   </w:abstractNum>
-  <w:abstractNum w:abstractNumId="75" w15:restartNumberingAfterBreak="0">
+  <w:abstractNum w:abstractNumId="79" w15:restartNumberingAfterBreak="0">
     <w:nsid w:val="7D630BD8"/>
     <w:multiLevelType w:val="multilevel"/>
     <w:tmpl w:val="29AAB4E8"/>
@@ -29353,7 +31161,7 @@
       </w:rPr>
     </w:lvl>
   </w:abstractNum>
-  <w:abstractNum w:abstractNumId="76" w15:restartNumberingAfterBreak="0">
+  <w:abstractNum w:abstractNumId="80" w15:restartNumberingAfterBreak="0">
     <w:nsid w:val="7DBD0CD7"/>
     <w:multiLevelType w:val="multilevel"/>
     <w:tmpl w:val="A0EC3056"/>
@@ -29503,181 +31311,181 @@
     </w:lvl>
   </w:abstractNum>
   <w:num w:numId="1" w16cid:durableId="539703690">
-    <w:abstractNumId w:val="74"/>
+    <w:abstractNumId w:val="78"/>
   </w:num>
   <w:num w:numId="2" w16cid:durableId="529539000">
-    <w:abstractNumId w:val="66"/>
+    <w:abstractNumId w:val="70"/>
   </w:num>
   <w:num w:numId="3" w16cid:durableId="1507868098">
-    <w:abstractNumId w:val="65"/>
+    <w:abstractNumId w:val="69"/>
   </w:num>
   <w:num w:numId="4" w16cid:durableId="1090276143">
-    <w:abstractNumId w:val="37"/>
+    <w:abstractNumId w:val="39"/>
   </w:num>
   <w:num w:numId="5" w16cid:durableId="1100642952">
     <w:abstractNumId w:val="0"/>
   </w:num>
   <w:num w:numId="6" w16cid:durableId="609314199">
-    <w:abstractNumId w:val="24"/>
+    <w:abstractNumId w:val="25"/>
   </w:num>
   <w:num w:numId="7" w16cid:durableId="1326663548">
-    <w:abstractNumId w:val="57"/>
+    <w:abstractNumId w:val="61"/>
   </w:num>
   <w:num w:numId="8" w16cid:durableId="799693069">
-    <w:abstractNumId w:val="55"/>
+    <w:abstractNumId w:val="58"/>
   </w:num>
   <w:num w:numId="9" w16cid:durableId="107093652">
-    <w:abstractNumId w:val="59"/>
+    <w:abstractNumId w:val="63"/>
   </w:num>
   <w:num w:numId="10" w16cid:durableId="1675720591">
     <w:abstractNumId w:val="2"/>
   </w:num>
   <w:num w:numId="11" w16cid:durableId="2140419691">
-    <w:abstractNumId w:val="58"/>
+    <w:abstractNumId w:val="62"/>
   </w:num>
   <w:num w:numId="12" w16cid:durableId="1892954593">
-    <w:abstractNumId w:val="31"/>
+    <w:abstractNumId w:val="33"/>
   </w:num>
   <w:num w:numId="13" w16cid:durableId="1234658075">
-    <w:abstractNumId w:val="46"/>
+    <w:abstractNumId w:val="49"/>
   </w:num>
   <w:num w:numId="14" w16cid:durableId="1593784728">
-    <w:abstractNumId w:val="45"/>
+    <w:abstractNumId w:val="48"/>
   </w:num>
   <w:num w:numId="15" w16cid:durableId="443309351">
-    <w:abstractNumId w:val="70"/>
+    <w:abstractNumId w:val="74"/>
   </w:num>
   <w:num w:numId="16" w16cid:durableId="1965304958">
-    <w:abstractNumId w:val="64"/>
+    <w:abstractNumId w:val="68"/>
   </w:num>
   <w:num w:numId="17" w16cid:durableId="688605314">
-    <w:abstractNumId w:val="56"/>
+    <w:abstractNumId w:val="60"/>
   </w:num>
   <w:num w:numId="18" w16cid:durableId="1022316225">
-    <w:abstractNumId w:val="62"/>
+    <w:abstractNumId w:val="66"/>
   </w:num>
   <w:num w:numId="19" w16cid:durableId="141240616">
     <w:abstractNumId w:val="5"/>
   </w:num>
   <w:num w:numId="20" w16cid:durableId="765424595">
-    <w:abstractNumId w:val="61"/>
+    <w:abstractNumId w:val="65"/>
   </w:num>
   <w:num w:numId="21" w16cid:durableId="2049254314">
-    <w:abstractNumId w:val="29"/>
+    <w:abstractNumId w:val="31"/>
   </w:num>
   <w:num w:numId="22" w16cid:durableId="1397165907">
-    <w:abstractNumId w:val="17"/>
+    <w:abstractNumId w:val="18"/>
   </w:num>
   <w:num w:numId="23" w16cid:durableId="1298873727">
-    <w:abstractNumId w:val="25"/>
+    <w:abstractNumId w:val="26"/>
   </w:num>
   <w:num w:numId="24" w16cid:durableId="970286715">
-    <w:abstractNumId w:val="32"/>
+    <w:abstractNumId w:val="34"/>
   </w:num>
   <w:num w:numId="25" w16cid:durableId="1234780031">
-    <w:abstractNumId w:val="60"/>
+    <w:abstractNumId w:val="64"/>
   </w:num>
   <w:num w:numId="26" w16cid:durableId="933439244">
-    <w:abstractNumId w:val="14"/>
+    <w:abstractNumId w:val="15"/>
   </w:num>
   <w:num w:numId="27" w16cid:durableId="713162761">
-    <w:abstractNumId w:val="42"/>
+    <w:abstractNumId w:val="45"/>
   </w:num>
   <w:num w:numId="28" w16cid:durableId="389034150">
-    <w:abstractNumId w:val="54"/>
+    <w:abstractNumId w:val="57"/>
   </w:num>
   <w:num w:numId="29" w16cid:durableId="2101292932">
     <w:abstractNumId w:val="9"/>
   </w:num>
   <w:num w:numId="30" w16cid:durableId="1451246123">
-    <w:abstractNumId w:val="38"/>
+    <w:abstractNumId w:val="40"/>
   </w:num>
   <w:num w:numId="31" w16cid:durableId="1957172257">
-    <w:abstractNumId w:val="52"/>
+    <w:abstractNumId w:val="55"/>
   </w:num>
   <w:num w:numId="32" w16cid:durableId="2074425949">
-    <w:abstractNumId w:val="73"/>
+    <w:abstractNumId w:val="77"/>
   </w:num>
   <w:num w:numId="33" w16cid:durableId="1278953254">
-    <w:abstractNumId w:val="48"/>
+    <w:abstractNumId w:val="51"/>
   </w:num>
   <w:num w:numId="34" w16cid:durableId="762071258">
-    <w:abstractNumId w:val="72"/>
+    <w:abstractNumId w:val="76"/>
   </w:num>
   <w:num w:numId="35" w16cid:durableId="636911571">
-    <w:abstractNumId w:val="21"/>
+    <w:abstractNumId w:val="22"/>
   </w:num>
   <w:num w:numId="36" w16cid:durableId="201671262">
     <w:abstractNumId w:val="6"/>
   </w:num>
   <w:num w:numId="37" w16cid:durableId="1602764755">
+    <w:abstractNumId w:val="75"/>
+  </w:num>
+  <w:num w:numId="38" w16cid:durableId="605776452">
+    <w:abstractNumId w:val="29"/>
+  </w:num>
+  <w:num w:numId="39" w16cid:durableId="1719237159">
+    <w:abstractNumId w:val="50"/>
+  </w:num>
+  <w:num w:numId="40" w16cid:durableId="171066299">
     <w:abstractNumId w:val="71"/>
   </w:num>
-  <w:num w:numId="38" w16cid:durableId="605776452">
-    <w:abstractNumId w:val="27"/>
-  </w:num>
-  <w:num w:numId="39" w16cid:durableId="1719237159">
-    <w:abstractNumId w:val="47"/>
-  </w:num>
-  <w:num w:numId="40" w16cid:durableId="171066299">
+  <w:num w:numId="41" w16cid:durableId="495804966">
     <w:abstractNumId w:val="67"/>
   </w:num>
-  <w:num w:numId="41" w16cid:durableId="495804966">
-    <w:abstractNumId w:val="63"/>
+  <w:num w:numId="42" w16cid:durableId="570310927">
+    <w:abstractNumId w:val="17"/>
   </w:num>
-  <w:num w:numId="42" w16cid:durableId="570310927">
+  <w:num w:numId="43" w16cid:durableId="199709320">
+    <w:abstractNumId w:val="53"/>
+  </w:num>
+  <w:num w:numId="44" w16cid:durableId="1934436484">
     <w:abstractNumId w:val="16"/>
   </w:num>
-  <w:num w:numId="43" w16cid:durableId="199709320">
-    <w:abstractNumId w:val="50"/>
-  </w:num>
-  <w:num w:numId="44" w16cid:durableId="1934436484">
-    <w:abstractNumId w:val="15"/>
-  </w:num>
   <w:num w:numId="45" w16cid:durableId="188303176">
-    <w:abstractNumId w:val="43"/>
+    <w:abstractNumId w:val="46"/>
   </w:num>
   <w:num w:numId="46" w16cid:durableId="1484617688">
-    <w:abstractNumId w:val="53"/>
+    <w:abstractNumId w:val="56"/>
   </w:num>
   <w:num w:numId="47" w16cid:durableId="294217124">
     <w:abstractNumId w:val="3"/>
   </w:num>
   <w:num w:numId="48" w16cid:durableId="1627081710">
+    <w:abstractNumId w:val="12"/>
+  </w:num>
+  <w:num w:numId="49" w16cid:durableId="1017853866">
+    <w:abstractNumId w:val="35"/>
+  </w:num>
+  <w:num w:numId="50" w16cid:durableId="156069245">
+    <w:abstractNumId w:val="37"/>
+  </w:num>
+  <w:num w:numId="51" w16cid:durableId="573659940">
+    <w:abstractNumId w:val="36"/>
+  </w:num>
+  <w:num w:numId="52" w16cid:durableId="1856647388">
+    <w:abstractNumId w:val="19"/>
+  </w:num>
+  <w:num w:numId="53" w16cid:durableId="255136490">
+    <w:abstractNumId w:val="72"/>
+  </w:num>
+  <w:num w:numId="54" w16cid:durableId="1615557971">
+    <w:abstractNumId w:val="52"/>
+  </w:num>
+  <w:num w:numId="55" w16cid:durableId="709766610">
+    <w:abstractNumId w:val="54"/>
+  </w:num>
+  <w:num w:numId="56" w16cid:durableId="1428962776">
+    <w:abstractNumId w:val="80"/>
+  </w:num>
+  <w:num w:numId="57" w16cid:durableId="958336198">
     <w:abstractNumId w:val="11"/>
   </w:num>
-  <w:num w:numId="49" w16cid:durableId="1017853866">
-    <w:abstractNumId w:val="33"/>
-  </w:num>
-  <w:num w:numId="50" w16cid:durableId="156069245">
-    <w:abstractNumId w:val="35"/>
-  </w:num>
-  <w:num w:numId="51" w16cid:durableId="573659940">
-    <w:abstractNumId w:val="34"/>
-  </w:num>
-  <w:num w:numId="52" w16cid:durableId="1856647388">
-    <w:abstractNumId w:val="18"/>
-  </w:num>
-  <w:num w:numId="53" w16cid:durableId="255136490">
-    <w:abstractNumId w:val="68"/>
-  </w:num>
-  <w:num w:numId="54" w16cid:durableId="1615557971">
-    <w:abstractNumId w:val="49"/>
-  </w:num>
-  <w:num w:numId="55" w16cid:durableId="709766610">
-    <w:abstractNumId w:val="51"/>
-  </w:num>
-  <w:num w:numId="56" w16cid:durableId="1428962776">
-    <w:abstractNumId w:val="76"/>
-  </w:num>
-  <w:num w:numId="57" w16cid:durableId="958336198">
-    <w:abstractNumId w:val="10"/>
-  </w:num>
   <w:num w:numId="58" w16cid:durableId="1874073811">
-    <w:abstractNumId w:val="28"/>
+    <w:abstractNumId w:val="30"/>
   </w:num>
   <w:num w:numId="59" w16cid:durableId="523059013">
-    <w:abstractNumId w:val="12"/>
+    <w:abstractNumId w:val="13"/>
   </w:num>
   <w:num w:numId="60" w16cid:durableId="1022441953">
     <w:abstractNumId w:val="7"/>
@@ -29686,52 +31494,64 @@
     <w:abstractNumId w:val="4"/>
   </w:num>
   <w:num w:numId="62" w16cid:durableId="1493061547">
-    <w:abstractNumId w:val="22"/>
+    <w:abstractNumId w:val="23"/>
   </w:num>
   <w:num w:numId="63" w16cid:durableId="660741515">
-    <w:abstractNumId w:val="36"/>
+    <w:abstractNumId w:val="38"/>
   </w:num>
   <w:num w:numId="64" w16cid:durableId="1178347824">
-    <w:abstractNumId w:val="13"/>
+    <w:abstractNumId w:val="14"/>
   </w:num>
   <w:num w:numId="65" w16cid:durableId="1274434239">
-    <w:abstractNumId w:val="23"/>
+    <w:abstractNumId w:val="24"/>
   </w:num>
   <w:num w:numId="66" w16cid:durableId="597644950">
-    <w:abstractNumId w:val="44"/>
+    <w:abstractNumId w:val="47"/>
   </w:num>
   <w:num w:numId="67" w16cid:durableId="2075859187">
-    <w:abstractNumId w:val="19"/>
+    <w:abstractNumId w:val="20"/>
   </w:num>
   <w:num w:numId="68" w16cid:durableId="1215697748">
     <w:abstractNumId w:val="8"/>
   </w:num>
   <w:num w:numId="69" w16cid:durableId="748766918">
-    <w:abstractNumId w:val="75"/>
+    <w:abstractNumId w:val="79"/>
   </w:num>
   <w:num w:numId="70" w16cid:durableId="1712269791">
-    <w:abstractNumId w:val="40"/>
+    <w:abstractNumId w:val="43"/>
   </w:num>
   <w:num w:numId="71" w16cid:durableId="295186376">
-    <w:abstractNumId w:val="39"/>
+    <w:abstractNumId w:val="42"/>
   </w:num>
   <w:num w:numId="72" w16cid:durableId="97676398">
     <w:abstractNumId w:val="1"/>
   </w:num>
   <w:num w:numId="73" w16cid:durableId="1976326592">
-    <w:abstractNumId w:val="30"/>
+    <w:abstractNumId w:val="32"/>
   </w:num>
   <w:num w:numId="74" w16cid:durableId="1812358449">
-    <w:abstractNumId w:val="69"/>
+    <w:abstractNumId w:val="73"/>
   </w:num>
   <w:num w:numId="75" w16cid:durableId="1260410652">
-    <w:abstractNumId w:val="20"/>
+    <w:abstractNumId w:val="21"/>
   </w:num>
   <w:num w:numId="76" w16cid:durableId="72053456">
+    <w:abstractNumId w:val="44"/>
+  </w:num>
+  <w:num w:numId="77" w16cid:durableId="1186748253">
+    <w:abstractNumId w:val="27"/>
+  </w:num>
+  <w:num w:numId="78" w16cid:durableId="1937057367">
+    <w:abstractNumId w:val="59"/>
+  </w:num>
+  <w:num w:numId="79" w16cid:durableId="1884518688">
     <w:abstractNumId w:val="41"/>
   </w:num>
-  <w:num w:numId="77" w16cid:durableId="1186748253">
-    <w:abstractNumId w:val="26"/>
+  <w:num w:numId="80" w16cid:durableId="88893468">
+    <w:abstractNumId w:val="10"/>
+  </w:num>
+  <w:num w:numId="81" w16cid:durableId="1342584359">
+    <w:abstractNumId w:val="28"/>
   </w:num>
   <w:numIdMacAtCleanup w:val="71"/>
 </w:numbering>

</xml_diff>